<commit_message>
docs(artigo): titulos e secoes rigorosamente alinhados ao programa
</commit_message>
<xml_diff>
--- a/ARTIGO_SUGESTAO_PIONEIRAS_E_ALEM.docx
+++ b/ARTIGO_SUGESTAO_PIONEIRAS_E_ALEM.docx
@@ -113,6 +113,14 @@
     </w:p>
     <w:p>
       <w:pPr>
+        <w:pStyle w:val="Heading1"/>
+      </w:pPr>
+      <w:r>
+        <w:t>Resumo (Abstract)</w:t>
+      </w:r>
+    </w:p>
+    <w:p>
+      <w:pPr>
         <w:pStyle w:val="Heading2"/>
       </w:pPr>
       <w:r>
@@ -141,22 +149,6 @@
     </w:p>
     <w:p>
       <w:pPr>
-        <w:jc w:val="both"/>
-        <w:spacing w:after="140" w:line="276" w:lineRule="auto"/>
-      </w:pPr>
-      <w:r>
-        <w:rPr>
-          <w:b/>
-        </w:rPr>
-        <w:t xml:space="preserve">Palavras-Chave:</w:t>
-      </w:r>
-      <w:r>
-        <w:rPr/>
-        <w:t xml:space="preserve"> Gamificação; Ensino de Computação; Pensamento Computacional; Jogo Digital Educativo; Representatividade Feminina; Ciência, Tecnologia e Gênero; ODS 5.</w:t>
-      </w:r>
-    </w:p>
-    <w:p>
-      <w:pPr>
         <w:pStyle w:val="Heading2"/>
       </w:pPr>
       <w:r>
@@ -181,22 +173,6 @@
       <w:r>
         <w:rPr/>
         <w:t xml:space="preserve">, an interactive serious game developed using the Godot 4 engine and distributed via WebAssembly. The game guides students through a historical journey structured across six Eras and an Epilogue, mapping Computational Thinking pillars to the foundational contributions of seven iconic women scientists: Ada Lovelace, the ENIAC Girls, Grace Hopper, Katherine Johnson, Sister Mary Kenneth Keller, Margaret Hamilton, and Brazilian pioneer Edith Ranzini. Aligned with UN Sustainable Development Goal 5 (Gender Equality) and the Brazilian National Common Curricular Base (BNCC), the project combines constructionist pedagogy with Science, Technology, and Gender (STG) studies. The artifact features an integrated cloud-based real-time formative telemetry system. A practical intervention conducted with 8th and 9th grade students in a Brazilian public school revealed high engagement, collaborative problem-solving, resilience in error debugging, and a measurable increase in self-efficacy and career identification, particularly among female students.</w:t>
-      </w:r>
-    </w:p>
-    <w:p>
-      <w:pPr>
-        <w:jc w:val="both"/>
-        <w:spacing w:after="140" w:line="276" w:lineRule="auto"/>
-      </w:pPr>
-      <w:r>
-        <w:rPr>
-          <w:b/>
-        </w:rPr>
-        <w:t xml:space="preserve">Keywords:</w:t>
-      </w:r>
-      <w:r>
-        <w:rPr/>
-        <w:t xml:space="preserve"> Gamification; Computer Science Education; Computational Thinking; Educational Digital Game; Female Representation; Science, Technology and Gender; SDG 5.</w:t>
       </w:r>
     </w:p>
     <w:p>
@@ -212,87 +188,53 @@
         <w:pStyle w:val="Heading1"/>
       </w:pPr>
       <w:r>
-        <w:t>1. Introdução</w:t>
-      </w:r>
-    </w:p>
-    <w:p>
-      <w:pPr>
-        <w:jc w:val="both"/>
-        <w:spacing w:after="140" w:line="276" w:lineRule="auto"/>
-      </w:pPr>
-      <w:r>
-        <w:rPr/>
-        <w:t xml:space="preserve">A inserção da Ciência da Computação na Educação Básica consolida-se contemporaneamente como uma exigência estrutural para a formação cidadã crítica e o desenvolvimento do raciocínio lógico no século XXI. A homologação das Normas sobre Computação na Educação Básica como complemento à Base Nacional Comum Curricular (BNCC) estabeleceu a necessidade de desenvolver competências de Pensamento Computacional, Mundo Digital e Cultura Digital desde as etapas iniciais da escolarização (Brasil, 2022). Todavia, a prática pedagógica tradicional frequentemente enfrenta dois obstáculos de grande envergadura: em primeiro lugar, o ensino de algoritmos e lógica costuma ser conduzido de maneira excessivamente abstrata e descontextualizada, gerando desmotivação e sensação de inatingibilidade entre os educandos; em segundo lugar, o ecossistema tecnológico e científico carrega uma histórica e marcante disparidade de gênero (Barros, 2022).</w:t>
-      </w:r>
-    </w:p>
-    <w:p>
-      <w:pPr>
-        <w:jc w:val="both"/>
-        <w:spacing w:after="140" w:line="276" w:lineRule="auto"/>
-      </w:pPr>
-      <w:r>
-        <w:rPr/>
-        <w:t xml:space="preserve">Historicamente, a gênese da computação moderna contou com o protagonismo direto de mulheres que fundaram bases conceituais, metodológicas e práticas indispensáveis: desde o desenvolvimento do primeiro algoritmo por Ada Lovelace em 1843, passando pela programação física do primeiro computador eletrônico digital pelas programadoras do ENIAC em 1945, a criação do compilador e a consolidação de linguagens de alto nível por Grace Hopper em 1947, os cálculos de mecânica orbital de Katherine Johnson em 1962, a democratização do ensino com a linguagem BASIC pela Irmã Mary Kenneth Keller em 1965, até a fundação da Engenharia de Software por Margaret Hamilton no Projeto Apollo 11 em 1969. No contexto latino-americano, destaca-se pioneiramente a atuação da Profa. Dra. Edith Ranzini no desenvolvimento do primeiro minicomputador brasileiro, o </w:t>
-      </w:r>
-      <w:r>
-        <w:rPr>
-          <w:i/>
-        </w:rPr>
-        <w:t xml:space="preserve">Patinho Feio</w:t>
-      </w:r>
-      <w:r>
-        <w:rPr/>
-        <w:t xml:space="preserve">, em 1972 (Lima, 2013).</w:t>
-      </w:r>
-    </w:p>
-    <w:p>
-      <w:pPr>
-        <w:jc w:val="both"/>
-        <w:spacing w:after="140" w:line="276" w:lineRule="auto"/>
-      </w:pPr>
-      <w:r>
-        <w:rPr/>
-        <w:t xml:space="preserve">A despeito dessa riqueza factual, operou-se ao longo da segunda metade do século XX um processo sistemático de masculinização da área tecnológica e apagamento memorial da atuação feminina (Schiebinger, 1999). Com a emergência dos computadores domésticos comercializados primordialmente como artefatos masculinos a partir dos anos 1980, as taxas de ingresso e permanência de mulheres nos cursos de Ciências Exatas e Tecnologia sofreram retração acentuada — fenômeno sociológico conhecido como segregação horizontal ou territorial (Carneiro, 2018). Essa ausência de modelos representativos de identificação (</w:t>
-      </w:r>
-      <w:r>
-        <w:rPr>
-          <w:i/>
-        </w:rPr>
-        <w:t xml:space="preserve">role models</w:t>
-      </w:r>
-      <w:r>
-        <w:rPr/>
-        <w:t xml:space="preserve">) nos currículos escolares retroalimenta estereótipos que afastam precocemente meninas de carreiras de base tecnológica.</w:t>
-      </w:r>
-    </w:p>
-    <w:p>
-      <w:pPr>
-        <w:jc w:val="both"/>
-        <w:spacing w:after="140" w:line="276" w:lineRule="auto"/>
-      </w:pPr>
-      <w:r>
-        <w:rPr/>
-        <w:t xml:space="preserve">Com o propósito de superar concomitantemente a abstração dos conceitos de computação e combater a invisibilização histórica feminina, desenvolveu-se o jogo digital educativo </w:t>
-      </w:r>
-      <w:r>
-        <w:rPr>
-          <w:b/>
-        </w:rPr>
-        <w:t xml:space="preserve">Pioneiras &amp; Além</w:t>
-      </w:r>
-      <w:r>
-        <w:rPr/>
-        <w:t xml:space="preserve">. A aplicação web articula a resolução de problemas algorítmicos ao resgate histórico das cientistas precursoras, estruturando uma transposição didática amparada no construcionismo e alinhada ao Objetivo de Desenvolvimento Sustentável 5 da Organização das Nações Unidas (ODS 5: Igualdade de Gênero).</w:t>
-      </w:r>
-    </w:p>
-    <w:p>
-      <w:pPr>
-        <w:jc w:val="both"/>
-        <w:spacing w:after="140" w:line="276" w:lineRule="auto"/>
-      </w:pPr>
-      <w:r>
-        <w:rPr/>
-        <w:t xml:space="preserve">O presente artigo apresenta o percurso completo da pesquisa: a fundamentação teórica que ampara a proposta, o estado da arte e contraste com trabalhos correlatos, as escolhas de engenharia e materiais de desenvolvimento do jogo, os procedimentos metodológicos da intervenção prática em escola pública e a discussão aprofundada dos resultados quanti-qualitativos obtidos por meio de observação participativa e telemetria automatizada.</w:t>
+        <w:t>Palavras-chave (Keywords)</w:t>
+      </w:r>
+    </w:p>
+    <w:p>
+      <w:pPr>
+        <w:ind w:left="540" w:hanging="260"/>
+        <w:spacing w:after="80"/>
+      </w:pPr>
+      <w:r>
+        <w:rPr>
+          <w:color w:val="2B6CB0"/>
+          <w:b/>
+        </w:rPr>
+        <w:t>• </w:t>
+      </w:r>
+      <w:r>
+        <w:rPr>
+          <w:b/>
+        </w:rPr>
+        <w:t xml:space="preserve">Palavras-chave:</w:t>
+      </w:r>
+      <w:r>
+        <w:rPr/>
+        <w:t xml:space="preserve"> Gamificação; Ensino de Computação; Pensamento Computacional; Jogo Digital Educativo; Representatividade Feminina; Ciência, Tecnologia e Gênero; ODS 5.</w:t>
+      </w:r>
+    </w:p>
+    <w:p>
+      <w:pPr>
+        <w:ind w:left="540" w:hanging="260"/>
+        <w:spacing w:after="80"/>
+      </w:pPr>
+      <w:r>
+        <w:rPr>
+          <w:color w:val="2B6CB0"/>
+          <w:b/>
+        </w:rPr>
+        <w:t>• </w:t>
+      </w:r>
+      <w:r>
+        <w:rPr>
+          <w:b/>
+        </w:rPr>
+        <w:t xml:space="preserve">Keywords:</w:t>
+      </w:r>
+      <w:r>
+        <w:rPr/>
+        <w:t xml:space="preserve"> Gamification; Computer Science Education; Computational Thinking; Educational Digital Game; Female Representation; Science, Technology and Gender; SDG 5.</w:t>
       </w:r>
     </w:p>
     <w:p>
@@ -308,271 +250,47 @@
         <w:pStyle w:val="Heading1"/>
       </w:pPr>
       <w:r>
-        <w:t>2. Fundamentação Teórica</w:t>
-      </w:r>
-    </w:p>
-    <w:p>
-      <w:pPr>
-        <w:pStyle w:val="Heading2"/>
-      </w:pPr>
-      <w:r>
-        <w:t>2.1 Pensamento Computacional e Aprendizagem Baseada em Jogos (GBL)</w:t>
-      </w:r>
-    </w:p>
-    <w:p>
-      <w:pPr>
-        <w:jc w:val="both"/>
-        <w:spacing w:after="140" w:line="276" w:lineRule="auto"/>
-      </w:pPr>
-      <w:r>
-        <w:rPr/>
-        <w:t xml:space="preserve">O Pensamento Computacional (PC), conceituado por Wing (2006), compreende os processos mentais envolvidos na formulação de problemas e na expressão de suas soluções de modo que um agente processador de informações (seja ele humano ou computacional) possa executá-las com eficácia. Seus pilares estruturantes englobam:</w:t>
-      </w:r>
-    </w:p>
-    <w:p>
-      <w:pPr>
-        <w:ind w:left="540" w:hanging="260"/>
-        <w:spacing w:after="80"/>
-      </w:pPr>
-      <w:r>
-        <w:rPr>
-          <w:color w:val="2B6CB0"/>
-          <w:b/>
-        </w:rPr>
-        <w:t>1. </w:t>
-      </w:r>
-      <w:r>
-        <w:rPr>
-          <w:b/>
-        </w:rPr>
-        <w:t xml:space="preserve">Decomposição:</w:t>
-      </w:r>
-      <w:r>
-        <w:rPr/>
-        <w:t xml:space="preserve"> fragmentação de um desafio complexo em partes menores e gerenciáveis;</w:t>
-      </w:r>
-    </w:p>
-    <w:p>
-      <w:pPr>
-        <w:ind w:left="540" w:hanging="260"/>
-        <w:spacing w:after="80"/>
-      </w:pPr>
-      <w:r>
-        <w:rPr>
-          <w:color w:val="2B6CB0"/>
-          <w:b/>
-        </w:rPr>
-        <w:t>2. </w:t>
-      </w:r>
-      <w:r>
-        <w:rPr>
-          <w:b/>
-        </w:rPr>
-        <w:t xml:space="preserve">Reconhecimento de Padrões:</w:t>
-      </w:r>
-      <w:r>
-        <w:rPr/>
-        <w:t xml:space="preserve"> identificação de similaridades, regularidades e tendências;</w:t>
-      </w:r>
-    </w:p>
-    <w:p>
-      <w:pPr>
-        <w:ind w:left="540" w:hanging="260"/>
-        <w:spacing w:after="80"/>
-      </w:pPr>
-      <w:r>
-        <w:rPr>
-          <w:color w:val="2B6CB0"/>
-          <w:b/>
-        </w:rPr>
-        <w:t>3. </w:t>
-      </w:r>
-      <w:r>
-        <w:rPr>
-          <w:b/>
-        </w:rPr>
-        <w:t xml:space="preserve">Abstração:</w:t>
-      </w:r>
-      <w:r>
-        <w:rPr/>
-        <w:t xml:space="preserve"> filtragem dos detalhes secundários para focar estritamente nas variáveis essenciais;</w:t>
-      </w:r>
-    </w:p>
-    <w:p>
-      <w:pPr>
-        <w:ind w:left="540" w:hanging="260"/>
-        <w:spacing w:after="80"/>
-      </w:pPr>
-      <w:r>
-        <w:rPr>
-          <w:color w:val="2B6CB0"/>
-          <w:b/>
-        </w:rPr>
-        <w:t>4. </w:t>
-      </w:r>
-      <w:r>
-        <w:rPr>
-          <w:b/>
-        </w:rPr>
-        <w:t xml:space="preserve">Pensamento Algorítmico:</w:t>
-      </w:r>
-      <w:r>
-        <w:rPr/>
-        <w:t xml:space="preserve"> estruturação ordenada de instruções passo a passo para atingir um resultado previsível.</w:t>
-      </w:r>
-    </w:p>
-    <w:p>
-      <w:pPr>
-        <w:jc w:val="both"/>
-        <w:spacing w:after="140" w:line="276" w:lineRule="auto"/>
-      </w:pPr>
-      <w:r>
-        <w:rPr/>
-        <w:t xml:space="preserve">Gresse von Wangenheim et al. (2019) salientam que a apropriação do PC na Educação Básica não deve restringir-se à memorização precoce de sintaxes de linguagens profissionais de programação. Ao contrário, o raciocínio computacional floresce com maior robustez quando mediado por atividades interativas, lúdicas e ricas em significado.</w:t>
-      </w:r>
-    </w:p>
-    <w:p>
-      <w:pPr>
-        <w:jc w:val="both"/>
-        <w:spacing w:after="140" w:line="276" w:lineRule="auto"/>
-      </w:pPr>
-      <w:r>
-        <w:rPr/>
-        <w:t xml:space="preserve">Nesse prisma, a Aprendizagem Baseada em Jogos (</w:t>
-      </w:r>
-      <w:r>
-        <w:rPr>
-          <w:i/>
-        </w:rPr>
-        <w:t xml:space="preserve">Game-Based Learning</w:t>
-      </w:r>
-      <w:r>
-        <w:rPr/>
-        <w:t xml:space="preserve"> — GBL) desponta como paradigma pedagógico fecundo ao integrar mecânicas lúdicas a metas instrucionais intencionais (Barradas &amp; Lencastre, 2017). Diferentemente da simples gamificação por pontuação externa, os </w:t>
-      </w:r>
-      <w:r>
-        <w:rPr>
-          <w:i/>
-        </w:rPr>
-        <w:t xml:space="preserve">serious games</w:t>
-      </w:r>
-      <w:r>
-        <w:rPr/>
-        <w:t xml:space="preserve"> promovem a aprendizagem experiencial. Essa perspectiva vincula-se diretamente ao construcionismo de Seymour Papert (1980) e à espiral da aprendizagem criativa de Mitchel Resnick (2013): o conhecimento é construído de maneira mais significativa quando o aprendiz engaja-se ativamente na confecção e manipulação de um artefato palpável dentro de um "micromundo" dinâmico.</w:t>
-      </w:r>
-    </w:p>
-    <w:p>
-      <w:pPr>
-        <w:jc w:val="both"/>
-        <w:spacing w:after="140" w:line="276" w:lineRule="auto"/>
-      </w:pPr>
-      <w:r>
-        <w:rPr/>
-        <w:t xml:space="preserve">No contexto de jogos educativos digitais, a mecânica deve funcionar como espelho conceitual do conteúdo curricular (Gomes &amp; Melo, s.d.). Mais do que isso, o ambiente de jogo ressignifica o erro: o </w:t>
-      </w:r>
-      <w:r>
-        <w:rPr>
-          <w:i/>
-        </w:rPr>
-        <w:t xml:space="preserve">bug</w:t>
-      </w:r>
-      <w:r>
-        <w:rPr/>
-        <w:t xml:space="preserve"> ou a falha deixam de ser motivo de punição ou frustração e passam a atuar como convite à análise lógica, experimentação de hipóteses e depuração iterativa (</w:t>
-      </w:r>
-      <w:r>
-        <w:rPr>
-          <w:i/>
-        </w:rPr>
-        <w:t xml:space="preserve">debugging</w:t>
-      </w:r>
-      <w:r>
-        <w:rPr/>
-        <w:t xml:space="preserve">).</w:t>
-      </w:r>
-    </w:p>
-    <w:p>
-      <w:pPr>
-        <w:pStyle w:val="Heading2"/>
-      </w:pPr>
-      <w:r>
-        <w:t>2.2 Estudos de Ciência, Tecnologia e Gênero (CTG) e o Efeito *Role Model*</w:t>
-      </w:r>
-    </w:p>
-    <w:p>
-      <w:pPr>
-        <w:jc w:val="both"/>
-        <w:spacing w:after="140" w:line="276" w:lineRule="auto"/>
-      </w:pPr>
-      <w:r>
-        <w:rPr/>
-        <w:t xml:space="preserve">A dimensão sociocultural desta investigação fundamenta-se nos Estudos de Ciência, Tecnologia e Gênero (CTG), desenvolvidos amplamente por autoras como Schiebinger (1999), Garcia e Sedeño (2006) e Barros (2022). O campo CTG desmistifica a neutralidade axiológica da ciência, evidenciando como relações de poder e construções socioculturais historicamente privilegiaram a presença masculina nos centros de prestígio técnico-científico.</w:t>
-      </w:r>
-    </w:p>
-    <w:p>
-      <w:pPr>
-        <w:jc w:val="both"/>
-        <w:spacing w:after="140" w:line="276" w:lineRule="auto"/>
-      </w:pPr>
-      <w:r>
-        <w:rPr/>
-        <w:t xml:space="preserve">A literatura categoriza a sub-representação feminina em duas formas de segregação complementares:</w:t>
-      </w:r>
-    </w:p>
-    <w:p>
-      <w:pPr>
-        <w:ind w:left="540" w:hanging="260"/>
-        <w:spacing w:after="80"/>
-      </w:pPr>
-      <w:r>
-        <w:rPr>
-          <w:color w:val="2B6CB0"/>
-          <w:b/>
-        </w:rPr>
-        <w:t>• </w:t>
-      </w:r>
-      <w:r>
-        <w:rPr>
-          <w:b/>
-        </w:rPr>
-        <w:t xml:space="preserve">Segregação Vertical ("Teto de Vidro"):</w:t>
-      </w:r>
-      <w:r>
-        <w:rPr/>
-        <w:t xml:space="preserve"> barreiras sutis e culturais que impedem ou retardam a ascensão de mulheres aos postos de liderança, docência titular e coordenação de projetos estratégicos;</w:t>
-      </w:r>
-    </w:p>
-    <w:p>
-      <w:pPr>
-        <w:ind w:left="540" w:hanging="260"/>
-        <w:spacing w:after="80"/>
-      </w:pPr>
-      <w:r>
-        <w:rPr>
-          <w:color w:val="2B6CB0"/>
-          <w:b/>
-        </w:rPr>
-        <w:t>• </w:t>
-      </w:r>
-      <w:r>
-        <w:rPr>
-          <w:b/>
-        </w:rPr>
-        <w:t xml:space="preserve">Segregação Horizontal ("Campos Murados"):</w:t>
-      </w:r>
-      <w:r>
-        <w:rPr/>
-        <w:t xml:space="preserve"> canalização sociocultural que direciona mulheres para profissões voltadas ao cuidado e ciências humanas, enquanto homens são incentivados desde a infância à exploração de ferramentas, mecânica e raciocínio exato (Carneiro, 2018).</w:t>
-      </w:r>
-    </w:p>
-    <w:p>
-      <w:pPr>
-        <w:jc w:val="both"/>
-        <w:spacing w:after="140" w:line="276" w:lineRule="auto"/>
-      </w:pPr>
-      <w:r>
-        <w:rPr/>
-        <w:t xml:space="preserve">A psicologia social e a pedagogia crítica demonstram que a presença explícita de modelos femininos de referência (</w:t>
+        <w:t>Introdução</w:t>
+      </w:r>
+    </w:p>
+    <w:p>
+      <w:pPr>
+        <w:jc w:val="both"/>
+        <w:spacing w:after="140" w:line="276" w:lineRule="auto"/>
+      </w:pPr>
+      <w:r>
+        <w:rPr/>
+        <w:t xml:space="preserve">A inserção da Ciência da Computação na Educação Básica consolida-se contemporaneamente como uma exigência estrutural para a formação cidadã crítica e o desenvolvimento do raciocínio lógico no século XXI. A homologação das Normas sobre Computação na Educação Básica como complemento à Base Nacional Comum Curricular (BNCC) estabeleceu a necessidade de desenvolver competências de Pensamento Computacional, Mundo Digital e Cultura Digital desde as etapas iniciais da escolarização (Brasil, 2022). Todavia, a prática pedagógica tradicional frequentemente enfrenta dois obstáculos de grande envergadura: em primeiro lugar, o ensino de algoritmos e lógica costuma ser conduzido de maneira excessivamente abstrata e descontextualizada, gerando desmotivação e sensação de inatingibilidade entre os educandos; em segundo lugar, o ecossistema tecnológico e científico carrega uma histórica e marcante disparidade de gênero (Barros, 2022).</w:t>
+      </w:r>
+    </w:p>
+    <w:p>
+      <w:pPr>
+        <w:jc w:val="both"/>
+        <w:spacing w:after="140" w:line="276" w:lineRule="auto"/>
+      </w:pPr>
+      <w:r>
+        <w:rPr/>
+        <w:t xml:space="preserve">Historicamente, a gênese da computação moderna contou com o protagonismo direto de mulheres que fundaram bases conceituais, metodológicas e práticas indispensáveis: desde o desenvolvimento do primeiro algoritmo por Ada Lovelace em 1843, passando pela programação física do primeiro computador eletrônico digital pelas programadoras do ENIAC em 1945, a criação do compilador e a consolidação de linguagens de alto nível por Grace Hopper em 1947, os cálculos de mecânica orbital de Katherine Johnson em 1962, a democratização do ensino com a linguagem BASIC pela Irmã Mary Kenneth Keller em 1965, até a fundação da Engenharia de Software por Margaret Hamilton no Projeto Apollo 11 em 1969. No contexto latino-americano, destaca-se pioneiramente a atuação da Profa. Dra. Edith Ranzini no desenvolvimento do primeiro minicomputador brasileiro, o </w:t>
+      </w:r>
+      <w:r>
+        <w:rPr>
+          <w:i/>
+        </w:rPr>
+        <w:t xml:space="preserve">Patinho Feio</w:t>
+      </w:r>
+      <w:r>
+        <w:rPr/>
+        <w:t xml:space="preserve">, em 1972 (Lima, 2013).</w:t>
+      </w:r>
+    </w:p>
+    <w:p>
+      <w:pPr>
+        <w:jc w:val="both"/>
+        <w:spacing w:after="140" w:line="276" w:lineRule="auto"/>
+      </w:pPr>
+      <w:r>
+        <w:rPr/>
+        <w:t xml:space="preserve">A despeito dessa riqueza factual, operou-se ao longo da segunda metade do século XX um processo sistemático de masculinização da área tecnológica e apagamento memorial da atuação feminina (Schiebinger, 1999). Com a emergência dos computadores domésticos comercializados primordialmente como artefatos masculinos a partir dos anos 1980, as taxas de ingresso e permanência de mulheres nos cursos de Ciências Exatas e Tecnologia sofreram retração acentuada — fenômeno sociológico conhecido como segregação horizontal ou territorial (Carneiro, 2018). Essa ausência de modelos representativos de identificação (</w:t>
       </w:r>
       <w:r>
         <w:rPr>
@@ -582,70 +300,37 @@
       </w:r>
       <w:r>
         <w:rPr/>
-        <w:t xml:space="preserve">) exerce influência determinante sobre a percepção de autoeficácia de estudantes do gênero feminino (Bandura, 1997; Lima, 2013). Ao testemunharem que mulheres foram as criadoras de conceitos estruturantes da tecnologia que utilizam em seus smartphones e computadores, as estudantes desconstroem o sentimento de inadequação e ampliam seu horizonte de aspiração acadêmica e profissional. A articulação entre GBL e CTG estabelece, portanto, um ambiente propício para a convergência entre aprendizagem técnica e emancipação social (Figura 1).</w:t>
-      </w:r>
-    </w:p>
-    <w:p>
-      <w:pPr>
-        <w:pBdr>
-          <w:left w:val="single" w:sz="24" w:space="12" w:color="3182CE"/>
-        </w:pBdr>
-        <w:shd w:val="clear" w:color="auto" w:fill="EBF8FF"/>
-        <w:ind w:left="280" w:right="280"/>
-        <w:spacing w:before="140" w:after="160"/>
-      </w:pPr>
-      <w:r>
-        <w:rPr>
-          <w:b/>
-          <w:i/>
-          <w:color w:val="2C5282"/>
-        </w:rPr>
-        <w:t xml:space="preserve">Síntese Teórica Articulada:</w:t>
-      </w:r>
-    </w:p>
-    <w:p>
-      <w:pPr>
-        <w:pBdr>
-          <w:left w:val="single" w:sz="24" w:space="12" w:color="3182CE"/>
-        </w:pBdr>
-        <w:shd w:val="clear" w:color="auto" w:fill="EBF8FF"/>
-        <w:ind w:left="280" w:right="280"/>
-        <w:spacing w:before="140" w:after="160"/>
-      </w:pPr>
-      <w:r>
-        <w:rPr>
-          <w:i/>
-          <w:color w:val="2C5282"/>
-        </w:rPr>
-        <w:t xml:space="preserve">A conjugação entre o </w:t>
-      </w:r>
-      <w:r>
-        <w:rPr>
-          <w:i/>
-          <w:color w:val="2C5282"/>
-        </w:rPr>
-        <w:t xml:space="preserve">Construcionismo Tecnológico</w:t>
-      </w:r>
-      <w:r>
-        <w:rPr>
-          <w:i/>
-          <w:color w:val="2C5282"/>
-        </w:rPr>
-        <w:t xml:space="preserve"> (o estudante como construtor ativo de soluções algorítmicas) e a </w:t>
-      </w:r>
-      <w:r>
-        <w:rPr>
-          <w:i/>
-          <w:color w:val="2C5282"/>
-        </w:rPr>
-        <w:t xml:space="preserve">Abordagem Histórico-Crítica de Gênero</w:t>
-      </w:r>
-      <w:r>
-        <w:rPr>
-          <w:i/>
-          <w:color w:val="2C5282"/>
-        </w:rPr>
-        <w:t xml:space="preserve"> (resgate das pioneiras como sujeitos históricos da ciência) constitui a espinha dorsal pedagógica do jogo educativo.</w:t>
+        <w:t xml:space="preserve">) nos currículos escolares retroalimenta estereótipos que afastam precocemente meninas de carreiras de base tecnológica.</w:t>
+      </w:r>
+    </w:p>
+    <w:p>
+      <w:pPr>
+        <w:jc w:val="both"/>
+        <w:spacing w:after="140" w:line="276" w:lineRule="auto"/>
+      </w:pPr>
+      <w:r>
+        <w:rPr/>
+        <w:t xml:space="preserve">Com o propósito de superar concomitantemente a abstração dos conceitos de computação e combater a invisibilização histórica feminina, desenvolveu-se o jogo digital educativo </w:t>
+      </w:r>
+      <w:r>
+        <w:rPr>
+          <w:b/>
+        </w:rPr>
+        <w:t xml:space="preserve">Pioneiras &amp; Além</w:t>
+      </w:r>
+      <w:r>
+        <w:rPr/>
+        <w:t xml:space="preserve">. A aplicação web articula a resolução de problemas algorítmicos ao resgate histórico das cientistas precursoras, estruturando uma transposição didática amparada no construcionismo e alinhada ao Objetivo de Desenvolvimento Sustentável 5 da Organização das Nações Unidas (ODS 5: Igualdade de Gênero).</w:t>
+      </w:r>
+    </w:p>
+    <w:p>
+      <w:pPr>
+        <w:jc w:val="both"/>
+        <w:spacing w:after="140" w:line="276" w:lineRule="auto"/>
+      </w:pPr>
+      <w:r>
+        <w:rPr/>
+        <w:t xml:space="preserve">O presente artigo apresenta o percurso completo da pesquisa: a fundamentação teórica e análise de trabalhos correlatos, as escolhas de engenharia e materiais de desenvolvimento do jogo, os procedimentos metodológicos da intervenção prática em escola pública, a apresentação dos resultados quanti-qualitativos obtidos por telemetria e observação participativa, e a discussão aprofundada dos impactos educacionais e sociais observados.</w:t>
       </w:r>
     </w:p>
     <w:p>
@@ -661,17 +346,7 @@
         <w:pStyle w:val="Heading1"/>
       </w:pPr>
       <w:r>
-        <w:t>3. Trabalhos Relacionados</w:t>
-      </w:r>
-    </w:p>
-    <w:p>
-      <w:pPr>
-        <w:jc w:val="both"/>
-        <w:spacing w:after="140" w:line="276" w:lineRule="auto"/>
-      </w:pPr>
-      <w:r>
-        <w:rPr/>
-        <w:t xml:space="preserve">A análise do estado da arte revela diversas abordagens direcionadas ao ensino introdutório de computação e à atração de estudantes para a área de Tecnologia da Informação. Esses trabalhos podem ser agrupados em três categorias principais:</w:t>
+        <w:t>Fundamentação Teórica / Trabalhos Relacionados</w:t>
       </w:r>
     </w:p>
     <w:p>
@@ -679,131 +354,264 @@
         <w:pStyle w:val="Heading2"/>
       </w:pPr>
       <w:r>
-        <w:t>3.1 Jogos Digitais Comerciais e Educacionais de Programação</w:t>
-      </w:r>
-    </w:p>
-    <w:p>
-      <w:pPr>
-        <w:jc w:val="both"/>
-        <w:spacing w:after="140" w:line="276" w:lineRule="auto"/>
-      </w:pPr>
-      <w:r>
-        <w:rPr/>
-        <w:t xml:space="preserve">Títulos como </w:t>
-      </w:r>
-      <w:r>
-        <w:rPr>
-          <w:i/>
-        </w:rPr>
+        <w:t>Fundamentação Teórica: Pensamento Computacional e Aprendizagem Baseada em Jogos (GBL)</w:t>
+      </w:r>
+    </w:p>
+    <w:p>
+      <w:pPr>
+        <w:jc w:val="both"/>
+        <w:spacing w:after="140" w:line="276" w:lineRule="auto"/>
+      </w:pPr>
+      <w:r>
+        <w:rPr/>
+        <w:t xml:space="preserve">O Pensamento Computacional (PC), conceituado por Wing (2006), compreende os processos mentais envolvidos na formulação de problemas e na expressão de suas soluções de modo que um agente processador de informações (seja ele humano ou computacional) possa executá-las com eficácia. Seus quatro pilares estruturantes englobam a decomposição, o reconhecimento de padrões, a abstração e o pensamento algorítmico. Gresse von Wangenheim et al. (2019) salientam que a apropriação do PC na Educação Básica não deve restringir-se à memorização precoce de sintaxes de linguagens profissionais de programação, florescendo com maior robustez quando mediado por atividades interativas, lúdicas e ricas em significado.</w:t>
+      </w:r>
+    </w:p>
+    <w:p>
+      <w:pPr>
+        <w:jc w:val="both"/>
+        <w:spacing w:after="140" w:line="276" w:lineRule="auto"/>
+      </w:pPr>
+      <w:r>
+        <w:rPr/>
+        <w:t xml:space="preserve">Nesse prisma, a Aprendizagem Baseada em Jogos (</w:t>
+      </w:r>
+      <w:r>
+        <w:rPr>
+          <w:i/>
+        </w:rPr>
+        <w:t xml:space="preserve">Game-Based Learning</w:t>
+      </w:r>
+      <w:r>
+        <w:rPr/>
+        <w:t xml:space="preserve"> — GBL) desponta como paradigma pedagógico fecundo ao integrar mecânicas lúdicas a metas instrucionais intencionais (Barradas &amp; Lencastre, 2017). Essa perspectiva vincula-se diretamente ao construcionismo de Seymour Papert (1980) e à aprendizagem criativa de Mitchel Resnick (2013): o conhecimento é construído de maneira mais significativa quando o aprendiz engaja-se ativamente na confecção e manipulação de um artefato palpável dentro de um "micromundo" dinâmico. No jogo educativo, a mecânica funciona como espelho conceitual do conteúdo curricular (Gomes &amp; Melo, 2018), ressignificando o erro: o </w:t>
+      </w:r>
+      <w:r>
+        <w:rPr>
+          <w:i/>
+        </w:rPr>
+        <w:t xml:space="preserve">bug</w:t>
+      </w:r>
+      <w:r>
+        <w:rPr/>
+        <w:t xml:space="preserve"> ou a falha deixam de ser motivo de frustração e passam a atuar como convite à análise lógica e depuração iterativa (</w:t>
+      </w:r>
+      <w:r>
+        <w:rPr>
+          <w:i/>
+        </w:rPr>
+        <w:t xml:space="preserve">debugging</w:t>
+      </w:r>
+      <w:r>
+        <w:rPr/>
+        <w:t xml:space="preserve">).</w:t>
+      </w:r>
+    </w:p>
+    <w:p>
+      <w:pPr>
+        <w:pStyle w:val="Heading2"/>
+      </w:pPr>
+      <w:r>
+        <w:t>Fundamentação Teórica: Estudos de Ciência, Tecnologia e Gênero (CTG) e o Efeito *Role Model*</w:t>
+      </w:r>
+    </w:p>
+    <w:p>
+      <w:pPr>
+        <w:jc w:val="both"/>
+        <w:spacing w:after="140" w:line="276" w:lineRule="auto"/>
+      </w:pPr>
+      <w:r>
+        <w:rPr/>
+        <w:t xml:space="preserve">A dimensão sociocultural desta investigação apoia-se nos Estudos de Ciência, Tecnologia e Gênero (CTG), consolidados por Schiebinger (1999), Garcia e Sedeño (2006) e Barros (2022). O campo CTG desmistifica a neutralidade axiológica da ciência, evidenciando como relações de poder historicamente privilegiaram a presença masculina nos centros de decisão técnica. A literatura categoriza a sub-representação feminina em duas formas de segregação complementares: a vertical ("teto de vidro", barreiras que impedem a ascensão a postos de liderança) e a horizontal ("campos murados", direcionamento sociocultural que afasta mulheres de áreas tecnológicas) (Carneiro, 2018).</w:t>
+      </w:r>
+    </w:p>
+    <w:p>
+      <w:pPr>
+        <w:jc w:val="both"/>
+        <w:spacing w:after="140" w:line="276" w:lineRule="auto"/>
+      </w:pPr>
+      <w:r>
+        <w:rPr/>
+        <w:t xml:space="preserve">A psicologia social e a pedagogia crítica demonstram que a presença explícita de modelos femininos de referência (</w:t>
+      </w:r>
+      <w:r>
+        <w:rPr>
+          <w:i/>
+        </w:rPr>
+        <w:t xml:space="preserve">role models</w:t>
+      </w:r>
+      <w:r>
+        <w:rPr/>
+        <w:t xml:space="preserve">) exerce influência determinante sobre a percepção de autoeficácia de estudantes do gênero feminino (Bandura, 1997; Lima, 2013). Ao testemunharem que mulheres foram as criadoras de conceitos estruturantes da tecnologia que utilizam em seus cotidianos, as estudantes desconstroem o sentimento de inadequação e ampliam seu horizonte vocacional.</w:t>
+      </w:r>
+    </w:p>
+    <w:p>
+      <w:pPr>
+        <w:pStyle w:val="Heading2"/>
+      </w:pPr>
+      <w:r>
+        <w:t>Trabalhos Relacionados e Análise Comparativa</w:t>
+      </w:r>
+    </w:p>
+    <w:p>
+      <w:pPr>
+        <w:jc w:val="both"/>
+        <w:spacing w:after="140" w:line="276" w:lineRule="auto"/>
+      </w:pPr>
+      <w:r>
+        <w:rPr/>
+        <w:t xml:space="preserve">A análise da literatura científica revela iniciativas educacionais que podem ser categorizadas em três vertentes principais:</w:t>
+      </w:r>
+    </w:p>
+    <w:p>
+      <w:pPr>
+        <w:ind w:left="540" w:hanging="260"/>
+        <w:spacing w:after="80"/>
+      </w:pPr>
+      <w:r>
+        <w:rPr>
+          <w:color w:val="2B6CB0"/>
+          <w:b/>
+        </w:rPr>
+        <w:t>1. </w:t>
+      </w:r>
+      <w:r>
+        <w:rPr/>
+        <w:t xml:space="preserve">*</w:t>
+      </w:r>
+      <w:r>
+        <w:rPr>
+          <w:i/>
+        </w:rPr>
+        <w:t xml:space="preserve">Jogos Digitais Comerciais de Lógica (</w:t>
+      </w:r>
+      <w:r>
+        <w:rPr/>
         <w:t xml:space="preserve">LightBot</w:t>
       </w:r>
       <w:r>
-        <w:rPr/>
+        <w:rPr>
+          <w:i/>
+        </w:rPr>
         <w:t xml:space="preserve">, </w:t>
       </w:r>
       <w:r>
-        <w:rPr>
-          <w:i/>
-        </w:rPr>
+        <w:rPr/>
         <w:t xml:space="preserve">CodeCombat</w:t>
       </w:r>
       <w:r>
-        <w:rPr/>
-        <w:t xml:space="preserve"> e </w:t>
-      </w:r>
-      <w:r>
-        <w:rPr>
-          <w:i/>
-        </w:rPr>
+        <w:rPr>
+          <w:i/>
+        </w:rPr>
+        <w:t xml:space="preserve">, </w:t>
+      </w:r>
+      <w:r>
+        <w:rPr/>
         <w:t xml:space="preserve">Human Resource Machine</w:t>
       </w:r>
       <w:r>
-        <w:rPr/>
-        <w:t xml:space="preserve"> obtiveram expressiva adoção internacional no ensino de lógica de programação. Tais ferramentas utilizam quebra-cabeças mecânicos para exercitar conceitos de laços de repetição, condicionais e pilha de execução. Entretanto, esses artefatos concentram-se estritamente na mecânica algorítmica desprovida de qualquer contexto humano ou histórico. Neles, a tecnologia é retratada como um domínio abstrato, impessoal e desprovido de implicações socioculturais, perdendo a oportunidade de abordar questões de diversidade, empatia e contexto social.</w:t>
-      </w:r>
-    </w:p>
-    <w:p>
-      <w:pPr>
-        <w:pStyle w:val="Heading2"/>
-      </w:pPr>
-      <w:r>
-        <w:t>3.2 Jogos Educativos Físicos e Desplugados Brasileiros</w:t>
-      </w:r>
-    </w:p>
-    <w:p>
-      <w:pPr>
-        <w:jc w:val="both"/>
-        <w:spacing w:after="140" w:line="276" w:lineRule="auto"/>
-      </w:pPr>
-      <w:r>
-        <w:rPr/>
-        <w:t xml:space="preserve">No cenário nacional, destacam-se iniciativas voltadas ao ensino lúdico na Educação Básica, como o jogo de tabuleiro </w:t>
-      </w:r>
-      <w:r>
-        <w:rPr>
-          <w:i/>
-        </w:rPr>
+        <w:rPr>
+          <w:i/>
+        </w:rPr>
+        <w:t xml:space="preserve">):</w:t>
+      </w:r>
+      <w:r>
+        <w:rPr/>
+        <w:t xml:space="preserve">* exercitam quebra-cabeças e lógica de programação de forma eficiente, porém com foco estritamente abstrato e impessoal, desprovidos de contextualização humana, histórica e social;</w:t>
+      </w:r>
+    </w:p>
+    <w:p>
+      <w:pPr>
+        <w:ind w:left="540" w:hanging="260"/>
+        <w:spacing w:after="80"/>
+      </w:pPr>
+      <w:r>
+        <w:rPr>
+          <w:color w:val="2B6CB0"/>
+          <w:b/>
+        </w:rPr>
+        <w:t>2. </w:t>
+      </w:r>
+      <w:r>
+        <w:rPr/>
+        <w:t xml:space="preserve">*</w:t>
+      </w:r>
+      <w:r>
+        <w:rPr>
+          <w:i/>
+        </w:rPr>
+        <w:t xml:space="preserve">Jogos Educativos Físicos e Desplugados (</w:t>
+      </w:r>
+      <w:r>
+        <w:rPr/>
         <w:t xml:space="preserve">SplashCode</w:t>
       </w:r>
       <w:r>
-        <w:rPr/>
-        <w:t xml:space="preserve"> (Gresse von Wangenheim et al., 2019), desenvolvido para introduzir algoritmos e ordenação a crianças por meio de dinâmicas desplugadas. Projetos como os de Barbosa et al. (2020) exploram protótipos de jogos de cartas com elementos de </w:t>
-      </w:r>
-      <w:r>
-        <w:rPr>
-          <w:i/>
-        </w:rPr>
-        <w:t xml:space="preserve">storytelling</w:t>
-      </w:r>
-      <w:r>
-        <w:rPr/>
-        <w:t xml:space="preserve"> para ensinar estruturas de dados no Ensino Médio. Embora altamente eficazes em oficinas presenciais, essas soluções físicas enfrentam gargalos de replicação e escalabilidade em redes públicas, dependem de custos de impressão e distribuição de materiais e não dispõem de mecanismos automatizados para coleta e registro contínuo de telemetria de aprendizagem.</w:t>
-      </w:r>
-    </w:p>
-    <w:p>
-      <w:pPr>
-        <w:pStyle w:val="Heading2"/>
-      </w:pPr>
-      <w:r>
-        <w:t>3.3 Iniciativas Institucionais de Fomento à Participação Feminina</w:t>
-      </w:r>
-    </w:p>
-    <w:p>
-      <w:pPr>
-        <w:jc w:val="both"/>
-        <w:spacing w:after="140" w:line="276" w:lineRule="auto"/>
-      </w:pPr>
-      <w:r>
-        <w:rPr/>
-        <w:t xml:space="preserve">No Brasil, o principal referencial de incentivo à equidade de gênero na computação é o Programa </w:t>
-      </w:r>
-      <w:r>
-        <w:rPr>
-          <w:i/>
-        </w:rPr>
+        <w:rPr>
+          <w:i/>
+        </w:rPr>
+        <w:t xml:space="preserve">, </w:t>
+      </w:r>
+      <w:r>
+        <w:rPr/>
+        <w:t xml:space="preserve">Storytelling de Dados</w:t>
+      </w:r>
+      <w:r>
+        <w:rPr>
+          <w:i/>
+        </w:rPr>
+        <w:t xml:space="preserve">):</w:t>
+      </w:r>
+      <w:r>
+        <w:rPr/>
+        <w:t xml:space="preserve">* jogos de tabuleiro e cartas nacionais (Gresse von Wangenheim et al., 2019; Barbosa et al., 2020) que introduzem algoritmos com sucesso em oficinas presenciais, mas enfrentam barreiras de distribuição física em larga escala e não dispõem de coleta automatizada de telemetria de aprendizagem;</w:t>
+      </w:r>
+    </w:p>
+    <w:p>
+      <w:pPr>
+        <w:ind w:left="540" w:hanging="260"/>
+        <w:spacing w:after="80"/>
+      </w:pPr>
+      <w:r>
+        <w:rPr>
+          <w:color w:val="2B6CB0"/>
+          <w:b/>
+        </w:rPr>
+        <w:t>3. </w:t>
+      </w:r>
+      <w:r>
+        <w:rPr/>
+        <w:t xml:space="preserve">*</w:t>
+      </w:r>
+      <w:r>
+        <w:rPr>
+          <w:i/>
+        </w:rPr>
+        <w:t xml:space="preserve">Iniciativas Institucionais de Gênero (Programa </w:t>
+      </w:r>
+      <w:r>
+        <w:rPr/>
         <w:t xml:space="preserve">Meninas Digitais</w:t>
       </w:r>
       <w:r>
-        <w:rPr/>
-        <w:t xml:space="preserve">, chancelado pela Sociedade Brasileira de Computação (SBC). O programa fomenta projetos em todo o território nacional através de palestras, minicursos práticos de robótica e rodas de conversa. Não obstante o inestimável impacto social das iniciativas, constata-se na literatura uma escassez de recursos didáticos digitais interativos dedicados — isto é, jogos estruturados onde a história das pioneiras não seja um mero anexo textual ou painel biográfico estático, mas sim o próprio motor da mecânica jogável.</w:t>
-      </w:r>
-    </w:p>
-    <w:p>
-      <w:pPr>
-        <w:pStyle w:val="Heading2"/>
-      </w:pPr>
-      <w:r>
-        <w:t>3.4 Diferencial e Lacunas Preenchidas pelo *Pioneiras &amp; Além*</w:t>
-      </w:r>
-    </w:p>
-    <w:p>
-      <w:pPr>
-        <w:jc w:val="both"/>
-        <w:spacing w:after="140" w:line="276" w:lineRule="auto"/>
-      </w:pPr>
-      <w:r>
-        <w:rPr/>
-        <w:t xml:space="preserve">A Tabela 1 sintetiza a comparação do </w:t>
+        <w:rPr>
+          <w:i/>
+        </w:rPr>
+        <w:t xml:space="preserve"> — SBC):</w:t>
+      </w:r>
+      <w:r>
+        <w:rPr/>
+        <w:t xml:space="preserve">* redes e projetos de fomento que realizam oficinas práticas e palestras essenciais em todo o país, mas que carecem de jogos digitais narrativos próprios onde as biografias das cientistas sejam a própria mecânica interativa central.</w:t>
+      </w:r>
+    </w:p>
+    <w:p>
+      <w:pPr>
+        <w:jc w:val="both"/>
+        <w:spacing w:after="140" w:line="276" w:lineRule="auto"/>
+      </w:pPr>
+      <w:r>
+        <w:rPr/>
+        <w:t xml:space="preserve">A Tabela 1 sintetiza o posicionamento do </w:t>
       </w:r>
       <w:r>
         <w:rPr>
@@ -813,7 +621,7 @@
       </w:r>
       <w:r>
         <w:rPr/>
-        <w:t xml:space="preserve"> em relação às abordagens correlatas da literatura:</w:t>
+        <w:t xml:space="preserve"> em relação ao estado da arte:</w:t>
       </w:r>
     </w:p>
     <w:tbl>
@@ -887,7 +695,7 @@
                 <w:b/>
                 <w:color w:val="FFFFFF"/>
               </w:rPr>
-              <w:t xml:space="preserve">, etc.)</w:t>
+              <w:t xml:space="preserve">)</w:t>
             </w:r>
           </w:p>
         </w:tc>
@@ -1033,7 +841,7 @@
               <w:rPr>
                 <w:color w:val="2D3748"/>
               </w:rPr>
-              <w:t xml:space="preserve">Alto (sintaxe e lógica pura)</w:t>
+              <w:t xml:space="preserve">Alto (lógica pura)</w:t>
             </w:r>
           </w:p>
         </w:tc>
@@ -1055,7 +863,7 @@
               <w:rPr>
                 <w:color w:val="2D3748"/>
               </w:rPr>
-              <w:t xml:space="preserve">Médio (conceitos desplugados)</w:t>
+              <w:t xml:space="preserve">Médio (desplugado)</w:t>
             </w:r>
           </w:p>
         </w:tc>
@@ -1077,7 +885,7 @@
               <w:rPr>
                 <w:color w:val="2D3748"/>
               </w:rPr>
-              <w:t xml:space="preserve">Médio/Variável (práticas pontuais)</w:t>
+              <w:t xml:space="preserve">Médio (práticas pontuais)</w:t>
             </w:r>
           </w:p>
         </w:tc>
@@ -1147,7 +955,7 @@
               <w:rPr>
                 <w:color w:val="2D3748"/>
               </w:rPr>
-              <w:t xml:space="preserve">Inexistente (ambiente fictício)</w:t>
+              <w:t xml:space="preserve">Inexistente</w:t>
             </w:r>
           </w:p>
         </w:tc>
@@ -1191,7 +999,7 @@
               <w:rPr>
                 <w:color w:val="2D3748"/>
               </w:rPr>
-              <w:t xml:space="preserve">Alto (exposições e palestras)</w:t>
+              <w:t xml:space="preserve">Alto (palestras/exposições)</w:t>
             </w:r>
           </w:p>
         </w:tc>
@@ -1283,7 +1091,7 @@
               <w:rPr>
                 <w:color w:val="2D3748"/>
               </w:rPr>
-              <w:t xml:space="preserve">Alta (cartas e tabuleiros)</w:t>
+              <w:t xml:space="preserve">Alta (cartas físicas)</w:t>
             </w:r>
           </w:p>
         </w:tc>
@@ -1581,7 +1389,7 @@
                 <w:b/>
                 <w:color w:val="2D3748"/>
               </w:rPr>
-              <w:t xml:space="preserve">Telemetria de Aprendizagem em Tempo Real</w:t>
+              <w:t xml:space="preserve">Telemetria Formativa em Tempo Real</w:t>
             </w:r>
           </w:p>
         </w:tc>
@@ -1647,7 +1455,7 @@
               <w:rPr>
                 <w:color w:val="2D3748"/>
               </w:rPr>
-              <w:t xml:space="preserve">Manual/Questionários</w:t>
+              <w:t xml:space="preserve">Questionários Manuais</w:t>
             </w:r>
           </w:p>
         </w:tc>
@@ -1698,7 +1506,7 @@
       </w:r>
       <w:r>
         <w:rPr/>
-        <w:t xml:space="preserve"> reside, portanto, na integração indissociável entre narrativa biográfica empática, metáforas pedagógicas concretas, tecnologia web acessível e instrumento científico de coleta automatizada de dados avaliativos.</w:t>
+        <w:t xml:space="preserve"> consiste na integração indissociável entre narrativa biográfica empática, metáforas pedagógicas concretas, tecnologia web leve e instrumento de telemetria científica integrada.</w:t>
       </w:r>
     </w:p>
     <w:p>
@@ -1714,7 +1522,7 @@
         <w:pStyle w:val="Heading1"/>
       </w:pPr>
       <w:r>
-        <w:t>4. Materiais e Métodos ou Desenvolvimento</w:t>
+        <w:t>Materiais e Métodos ou Desenvolvimento</w:t>
       </w:r>
     </w:p>
     <w:p>
@@ -1722,7 +1530,7 @@
         <w:pStyle w:val="Heading2"/>
       </w:pPr>
       <w:r>
-        <w:t>4.1 Abordagem Metodológica</w:t>
+        <w:t>Abordagem Metodológica</w:t>
       </w:r>
     </w:p>
     <w:p>
@@ -1742,99 +1550,7 @@
       </w:r>
       <w:r>
         <w:rPr/>
-        <w:t xml:space="preserve"> (Thiollent, 2011). O ciclo metodológico contemplou quatro etapas iterativas:</w:t>
-      </w:r>
-    </w:p>
-    <w:p>
-      <w:pPr>
-        <w:ind w:left="540" w:hanging="260"/>
-        <w:spacing w:after="80"/>
-      </w:pPr>
-      <w:r>
-        <w:rPr>
-          <w:color w:val="2B6CB0"/>
-          <w:b/>
-        </w:rPr>
-        <w:t>1. </w:t>
-      </w:r>
-      <w:r>
-        <w:rPr>
-          <w:b/>
-        </w:rPr>
-        <w:t xml:space="preserve">Diagnóstico Inicial:</w:t>
-      </w:r>
-      <w:r>
-        <w:rPr/>
-        <w:t xml:space="preserve"> mapeamento de carências de infraestrutura na escola pública parceira e aplicação de sondagem diagnóstica sobre conhecimentos prévios e percepção de gênero;</w:t>
-      </w:r>
-    </w:p>
-    <w:p>
-      <w:pPr>
-        <w:ind w:left="540" w:hanging="260"/>
-        <w:spacing w:after="80"/>
-      </w:pPr>
-      <w:r>
-        <w:rPr>
-          <w:color w:val="2B6CB0"/>
-          <w:b/>
-        </w:rPr>
-        <w:t>2. </w:t>
-      </w:r>
-      <w:r>
-        <w:rPr>
-          <w:b/>
-        </w:rPr>
-        <w:t xml:space="preserve">Concepção e Desenvolvimento:</w:t>
-      </w:r>
-      <w:r>
-        <w:rPr/>
-        <w:t xml:space="preserve"> engenharia do jogo na engine Godot 4, desenho instrucional das fases e implementação do pipeline de telemetria;</w:t>
-      </w:r>
-    </w:p>
-    <w:p>
-      <w:pPr>
-        <w:ind w:left="540" w:hanging="260"/>
-        <w:spacing w:after="80"/>
-      </w:pPr>
-      <w:r>
-        <w:rPr>
-          <w:color w:val="2B6CB0"/>
-          <w:b/>
-        </w:rPr>
-        <w:t>3. </w:t>
-      </w:r>
-      <w:r>
-        <w:rPr>
-          <w:b/>
-        </w:rPr>
-        <w:t xml:space="preserve">Intervenção Pedagógica Prática:</w:t>
-      </w:r>
-      <w:r>
-        <w:rPr/>
-        <w:t xml:space="preserve"> aplicação de oficinas didáticas orientadas em laboratório de informática com estudantes do 8º e 9º anos do Ensino Fundamental;</w:t>
-      </w:r>
-    </w:p>
-    <w:p>
-      <w:pPr>
-        <w:ind w:left="540" w:hanging="260"/>
-        <w:spacing w:after="80"/>
-      </w:pPr>
-      <w:r>
-        <w:rPr>
-          <w:color w:val="2B6CB0"/>
-          <w:b/>
-        </w:rPr>
-        <w:t>4. </w:t>
-      </w:r>
-      <w:r>
-        <w:rPr>
-          <w:b/>
-        </w:rPr>
-        <w:t xml:space="preserve">Avaliação Formativa e Tabulação:</w:t>
-      </w:r>
-      <w:r>
-        <w:rPr/>
-        <w:t xml:space="preserve"> consolidação e análise cruzada dos dados comportamentais (telemetria em tempo real) com os dados perceptivos (questionários pós-teste e observação etnográfica).</w:t>
+        <w:t xml:space="preserve"> (Thiollent, 2011). O ciclo metodológico contemplou quatro etapas iterativas: (1) Diagnóstico Inicial de carências e sondagem prévia; (2) Concepção e Engenharia de Software do jogo educativo na engine Godot 4; (3) Intervenção Pedagógica Prática em laboratório escolar com 42 estudantes do 8º e 9º anos do Ensino Fundamental de uma escola pública estadual do Paraná; e (4) Avaliação Formativa e Tabulação estatística cruzada dos dados comportamentais (telemetria) e perceptivos (questionários pós-teste e observação etnográfica).</w:t>
       </w:r>
     </w:p>
     <w:p>
@@ -1842,27 +1558,17 @@
         <w:pStyle w:val="Heading2"/>
       </w:pPr>
       <w:r>
-        <w:t>4.2 Arquitetura Tecnológica e Acessibilidade Web</w:t>
-      </w:r>
-    </w:p>
-    <w:p>
-      <w:pPr>
-        <w:jc w:val="both"/>
-        <w:spacing w:after="140" w:line="276" w:lineRule="auto"/>
-      </w:pPr>
-      <w:r>
-        <w:rPr/>
-        <w:t xml:space="preserve">As escolas públicas brasileiras frequentemente dispõem de laboratórios com máquinas heterogêneas, sistemas operacionais legados e restrições administrativas para instalação de softwares executáveis. Para garantir democratização do acesso, o </w:t>
-      </w:r>
-      <w:r>
-        <w:rPr>
-          <w:i/>
-        </w:rPr>
-        <w:t xml:space="preserve">Pioneiras &amp; Além</w:t>
-      </w:r>
-      <w:r>
-        <w:rPr/>
-        <w:t xml:space="preserve"> foi projetado sob as seguintes premissas de engenharia de software:</w:t>
+        <w:t>Arquitetura Tecnológica e Acessibilidade Web</w:t>
+      </w:r>
+    </w:p>
+    <w:p>
+      <w:pPr>
+        <w:jc w:val="both"/>
+        <w:spacing w:after="140" w:line="276" w:lineRule="auto"/>
+      </w:pPr>
+      <w:r>
+        <w:rPr/>
+        <w:t xml:space="preserve">Para assegurar democratização do acesso em laboratórios escolares públicos heterogêneos e sem necessidade de permissões administrativas de instalação, o jogo foi concebido sob a seguinte arquitetura técnica:</w:t>
       </w:r>
     </w:p>
     <w:p>
@@ -1928,7 +1634,7 @@
       </w:r>
       <w:r>
         <w:rPr/>
-        <w:t xml:space="preserve">, permitindo que a aplicação seja executada diretamente em qualquer navegador moderno (Chrome, Edge, Firefox, Safari) sem dependências locais;</w:t>
+        <w:t xml:space="preserve">, permitindo que a aplicação seja executada diretamente em qualquer navegador moderno (Chrome, Edge, Firefox, Safari);</w:t>
       </w:r>
     </w:p>
     <w:p>
@@ -1962,7 +1668,7 @@
       </w:r>
       <w:r>
         <w:rPr/>
-        <w:t xml:space="preserve">), assegurando baixo tempo de carregamento e alta disponibilidade;</w:t>
+        <w:t xml:space="preserve">), com alta disponibilidade e baixo tempo de carregamento;</w:t>
       </w:r>
     </w:p>
     <w:p>
@@ -2014,17 +1720,17 @@
         <w:pStyle w:val="Heading2"/>
       </w:pPr>
       <w:r>
-        <w:t>4.3 Design Mecânico e Proposta Pedagógica (As Fases do Jogo)</w:t>
-      </w:r>
-    </w:p>
-    <w:p>
-      <w:pPr>
-        <w:jc w:val="both"/>
-        <w:spacing w:after="140" w:line="276" w:lineRule="auto"/>
-      </w:pPr>
-      <w:r>
-        <w:rPr/>
-        <w:t xml:space="preserve">O jogo divide-se em uma introdução diagnóstica, seis Eras cronológicas e um Epílogo nacional. Em cada Era, o educando interage inicialmente com um diálogo em primeira pessoa no qual a cientista expõe o dilema histórico e técnico enfrentado. Em seguida, o jogador assume a postura ativa de resolver um desafio mecânico regido por uma </w:t>
+        <w:t>Design Mecânico e Proposta Pedagógica (As Fases do Jogo)</w:t>
+      </w:r>
+    </w:p>
+    <w:p>
+      <w:pPr>
+        <w:jc w:val="both"/>
+        <w:spacing w:after="140" w:line="276" w:lineRule="auto"/>
+      </w:pPr>
+      <w:r>
+        <w:rPr/>
+        <w:t xml:space="preserve">O jogo estrutura-se em uma introdução diagnóstica, seis Eras históricas e um Epílogo especial brasileiro. Em cada Era, o estudante interage com um diálogo em primeira pessoa no qual a cientista expõe o problema histórico enfrentado. Em seguida, assume a postura ativa de solucionar o desafio mecânico regido por uma </w:t>
       </w:r>
       <w:r>
         <w:rPr>
@@ -2034,17 +1740,17 @@
       </w:r>
       <w:r>
         <w:rPr/>
-        <w:t xml:space="preserve">, recebendo feedback dedutivo imediato. Ao triunfar, tem acesso ao </w:t>
-      </w:r>
-      <w:r>
-        <w:rPr>
-          <w:i/>
-        </w:rPr>
-        <w:t xml:space="preserve">Cartão de Conquista e Síntese Teórica</w:t>
-      </w:r>
-      <w:r>
-        <w:rPr/>
-        <w:t xml:space="preserve">, que relaciona o desafio superado ao conceito de computação formal e às metas do ODS 5:</w:t>
+        <w:t xml:space="preserve">, recebendo feedback dedutivo imediato. Ao concluir, abre-se o </w:t>
+      </w:r>
+      <w:r>
+        <w:rPr>
+          <w:i/>
+        </w:rPr>
+        <w:t xml:space="preserve">Cartão de Síntese Teórica</w:t>
+      </w:r>
+      <w:r>
+        <w:rPr/>
+        <w:t xml:space="preserve">, relacionando a vivência prática ao conceito formal de computação e ao ODS 5:</w:t>
       </w:r>
     </w:p>
     <w:p>
@@ -2082,7 +1788,7 @@
         <w:rPr>
           <w:i/>
         </w:rPr>
-        <w:t xml:space="preserve">Conceito Computacional:</w:t>
+        <w:t xml:space="preserve">Conceito:</w:t>
       </w:r>
       <w:r>
         <w:rPr/>
@@ -2109,7 +1815,7 @@
       </w:r>
       <w:r>
         <w:rPr/>
-        <w:t xml:space="preserve"> A receita do bolo da Máquina Analítica. O jogador aprende que não se pode misturar a massa sem ingredientes na bancada (tentativa de processar sem entrada) nem servir o prato sem antes testar se está assado (saída sem decisão condicional).</w:t>
+        <w:t xml:space="preserve"> A receita do bolo da Máquina Analítica. O jogador aprende que não se pode misturar a massa sem ingredientes na bancada (processar sem entrada) nem servir o prato sem antes testar se está assado (saída sem decisão condicional).</w:t>
       </w:r>
     </w:p>
     <w:p>
@@ -2132,7 +1838,7 @@
       </w:r>
       <w:r>
         <w:rPr/>
-        <w:t xml:space="preserve"> Ordenação sequencial de quatro cartões perfurados conceituais em slots designados.</w:t>
+        <w:t xml:space="preserve"> Ordenação sequencial de quatro cartões perfurados conceituais em slots sequenciais.</w:t>
       </w:r>
     </w:p>
     <w:p>
@@ -2170,7 +1876,7 @@
         <w:rPr>
           <w:i/>
         </w:rPr>
-        <w:t xml:space="preserve">Conceito Computacional:</w:t>
+        <w:t xml:space="preserve">Conceito:</w:t>
       </w:r>
       <w:r>
         <w:rPr/>
@@ -2278,7 +1984,7 @@
         <w:rPr>
           <w:i/>
         </w:rPr>
-        <w:t xml:space="preserve">Conceito Computacional:</w:t>
+        <w:t xml:space="preserve">Conceito:</w:t>
       </w:r>
       <w:r>
         <w:rPr/>
@@ -2315,7 +2021,7 @@
       </w:r>
       <w:r>
         <w:rPr/>
-        <w:t xml:space="preserve"> A caça à mariposa física nos relés eletromecânicos do Harvard Mark II e o compilador como um tradutor poliglota entre o pensamento humano e os interruptores da máquina.</w:t>
+        <w:t xml:space="preserve"> A caça à mariposa física nos relés eletromecânicos do Harvard Mark II e o compilador como um tradutor poliglota entre a linguagem humana e os transistores.</w:t>
       </w:r>
     </w:p>
     <w:p>
@@ -2338,7 +2044,7 @@
       </w:r>
       <w:r>
         <w:rPr/>
-        <w:t xml:space="preserve"> Localização do relé travado por um inseto real e correspondência direta entre instruções em linguagem natural e microoperações binárias de baixo nível.</w:t>
+        <w:t xml:space="preserve"> Localização do relé travado por uma falha física e correspondência direta entre instruções em inglês e microoperações binárias de máquina.</w:t>
       </w:r>
     </w:p>
     <w:p>
@@ -2376,7 +2082,7 @@
         <w:rPr>
           <w:i/>
         </w:rPr>
-        <w:t xml:space="preserve">Conceito Computacional:</w:t>
+        <w:t xml:space="preserve">Conceito:</w:t>
       </w:r>
       <w:r>
         <w:rPr/>
@@ -2474,7 +2180,7 @@
         <w:rPr>
           <w:i/>
         </w:rPr>
-        <w:t xml:space="preserve">Conceito Computacional:</w:t>
+        <w:t xml:space="preserve">Conceito:</w:t>
       </w:r>
       <w:r>
         <w:rPr/>
@@ -2617,7 +2323,7 @@
         <w:rPr>
           <w:i/>
         </w:rPr>
-        <w:t xml:space="preserve">Conceito Computacional:</w:t>
+        <w:t xml:space="preserve">Conceito:</w:t>
       </w:r>
       <w:r>
         <w:rPr/>
@@ -2705,7 +2411,7 @@
         <w:rPr>
           <w:i/>
         </w:rPr>
-        <w:t xml:space="preserve">Conceito Computacional:</w:t>
+        <w:t xml:space="preserve">Conceito:</w:t>
       </w:r>
       <w:r>
         <w:rPr/>
@@ -2763,96 +2469,17 @@
         <w:pStyle w:val="Heading2"/>
       </w:pPr>
       <w:r>
-        <w:t>4.4 Sistema de Telemetria Formativa Integrada</w:t>
-      </w:r>
-    </w:p>
-    <w:p>
-      <w:pPr>
-        <w:jc w:val="both"/>
-        <w:spacing w:after="140" w:line="276" w:lineRule="auto"/>
-      </w:pPr>
-      <w:r>
-        <w:rPr/>
-        <w:t xml:space="preserve">Para subsidiar a pesquisa empírica com rigor métrico, o jogo incorpora uma camada de instrumentação de telemetria transparente aos educandos. A arquitetura opera em fluxo automatizado:</w:t>
-      </w:r>
-    </w:p>
-    <w:p>
-      <w:pPr>
-        <w:ind w:left="540" w:hanging="260"/>
-        <w:spacing w:after="80"/>
-      </w:pPr>
-      <w:r>
-        <w:rPr>
-          <w:color w:val="2B6CB0"/>
-          <w:b/>
-        </w:rPr>
-        <w:t>1. </w:t>
-      </w:r>
-      <w:r>
-        <w:rPr>
-          <w:b/>
-        </w:rPr>
-        <w:t xml:space="preserve">Consentimento e Perfil Inicial:</w:t>
-      </w:r>
-      <w:r>
-        <w:rPr/>
-        <w:t xml:space="preserve"> registro de identificação básica (nome voluntário, município/escola) e três questões diagnósticas pré-jogo (conhecimento de pioneiras, contato prévio com programação e percepção de representatividade);</w:t>
-      </w:r>
-    </w:p>
-    <w:p>
-      <w:pPr>
-        <w:ind w:left="540" w:hanging="260"/>
-        <w:spacing w:after="80"/>
-      </w:pPr>
-      <w:r>
-        <w:rPr>
-          <w:color w:val="2B6CB0"/>
-          <w:b/>
-        </w:rPr>
-        <w:t>2. </w:t>
-      </w:r>
-      <w:r>
-        <w:rPr>
-          <w:b/>
-        </w:rPr>
-        <w:t xml:space="preserve">Rastreamento Comportamental por Fase:</w:t>
-      </w:r>
-      <w:r>
-        <w:rPr/>
-        <w:t xml:space="preserve"> monitoramento do tempo decorrido em segundos (precisão de milissegundos), quantidade precisa de tentativas e erros cometidos antes do êxito e verificação booleana da leitura do cartão de síntese;</w:t>
-      </w:r>
-    </w:p>
-    <w:p>
-      <w:pPr>
-        <w:ind w:left="540" w:hanging="260"/>
-        <w:spacing w:after="80"/>
-      </w:pPr>
-      <w:r>
-        <w:rPr>
-          <w:color w:val="2B6CB0"/>
-          <w:b/>
-        </w:rPr>
-        <w:t>3. </w:t>
-      </w:r>
-      <w:r>
-        <w:rPr>
-          <w:b/>
-        </w:rPr>
-        <w:t xml:space="preserve">Questionário Pós-Teste e Transmissão em Nuvem:</w:t>
-      </w:r>
-      <w:r>
-        <w:rPr/>
-        <w:t xml:space="preserve"> ao alcançar a tela de vitória, o jogo registra as respostas avaliativas em escala Likert e dispara um payload JSON assíncrono via requisição HTTP POST para um endpoint do </w:t>
-      </w:r>
-      <w:r>
-        <w:rPr>
-          <w:b/>
-        </w:rPr>
-        <w:t xml:space="preserve">Google Apps Script</w:t>
-      </w:r>
-      <w:r>
-        <w:rPr/>
-        <w:t xml:space="preserve">, alimentando instantaneamente uma planilha de consolidação de dados na nuvem, com gravação de redundância local em arquivo tabular </w:t>
+        <w:t>Sistema de Telemetria Formativa e Coleta em Nuvem</w:t>
+      </w:r>
+    </w:p>
+    <w:p>
+      <w:pPr>
+        <w:jc w:val="both"/>
+        <w:spacing w:after="140" w:line="276" w:lineRule="auto"/>
+      </w:pPr>
+      <w:r>
+        <w:rPr/>
+        <w:t xml:space="preserve">O artefato incorpora um sistema de telemetria não intrusivo com fluxo automatizado: registro de consentimento e pré-sondagem diagnóstica; monitoramento de tempo decorrido em segundos por fase (precisão decimal), contagem de tentativas e erros cometidos; e disparo assíncrono via Webhook HTTP POST (Google Apps Script) para consolidação instantânea em planilha do Google Sheets, com redundância local em arquivo tabular </w:t>
       </w:r>
       <w:r>
         <w:rPr>
@@ -2879,17 +2506,17 @@
         <w:pStyle w:val="Heading1"/>
       </w:pPr>
       <w:r>
-        <w:t>5. Resultados</w:t>
-      </w:r>
-    </w:p>
-    <w:p>
-      <w:pPr>
-        <w:jc w:val="both"/>
-        <w:spacing w:after="140" w:line="276" w:lineRule="auto"/>
-      </w:pPr>
-      <w:r>
-        <w:rPr/>
-        <w:t xml:space="preserve">A intervenção pedagógica foi realizada com turmas do 8º e 9º anos do Ensino Fundamental de uma escola pública estadual do Paraná, totalizando 42 estudantes participantes. As atividades foram mediadas no laboratório de informática escolar, organizadas em uma sequência didática de três momentos: </w:t>
+        <w:t>Resultados (quando aplicável)</w:t>
+      </w:r>
+    </w:p>
+    <w:p>
+      <w:pPr>
+        <w:jc w:val="both"/>
+        <w:spacing w:after="140" w:line="276" w:lineRule="auto"/>
+      </w:pPr>
+      <w:r>
+        <w:rPr/>
+        <w:t xml:space="preserve">A intervenção pedagógica foi realizada com 42 estudantes do 8º e 9º anos do Ensino Fundamental no laboratório de informática escolar, mediada em três etapas: </w:t>
       </w:r>
       <w:r>
         <w:rPr>
@@ -2899,7 +2526,7 @@
       </w:r>
       <w:r>
         <w:rPr/>
-        <w:t xml:space="preserve"> (jogabilidade individual ou em duplas), </w:t>
+        <w:t xml:space="preserve">, </w:t>
       </w:r>
       <w:r>
         <w:rPr>
@@ -2909,17 +2536,17 @@
       </w:r>
       <w:r>
         <w:rPr/>
-        <w:t xml:space="preserve"> (discussão dos conceitos à luz das sínteses) e </w:t>
-      </w:r>
-      <w:r>
-        <w:rPr>
-          <w:i/>
-        </w:rPr>
-        <w:t xml:space="preserve">Roda de Conversa Final</w:t>
-      </w:r>
-      <w:r>
-        <w:rPr/>
-        <w:t xml:space="preserve"> (avaliação de gênero e debate da ODS 5).</w:t>
+        <w:t xml:space="preserve"> e </w:t>
+      </w:r>
+      <w:r>
+        <w:rPr>
+          <w:i/>
+        </w:rPr>
+        <w:t xml:space="preserve">Roda de Conversa Avaliativa</w:t>
+      </w:r>
+      <w:r>
+        <w:rPr/>
+        <w:t xml:space="preserve">.</w:t>
       </w:r>
     </w:p>
     <w:p>
@@ -2927,17 +2554,17 @@
         <w:pStyle w:val="Heading2"/>
       </w:pPr>
       <w:r>
-        <w:t>5.1 Dinâmica de Engajamento e Resolução de Problemas</w:t>
-      </w:r>
-    </w:p>
-    <w:p>
-      <w:pPr>
-        <w:jc w:val="both"/>
-        <w:spacing w:after="140" w:line="276" w:lineRule="auto"/>
-      </w:pPr>
-      <w:r>
-        <w:rPr/>
-        <w:t xml:space="preserve">A análise dos registros comportamentais e das observações em sala de aula revelou um nível notável de imersão e engajamento dos educandos:</w:t>
+        <w:t>Engajamento, Resolução de Problemas e Aprendizagem Colaborativa</w:t>
+      </w:r>
+    </w:p>
+    <w:p>
+      <w:pPr>
+        <w:jc w:val="both"/>
+        <w:spacing w:after="140" w:line="276" w:lineRule="auto"/>
+      </w:pPr>
+      <w:r>
+        <w:rPr/>
+        <w:t xml:space="preserve">A observação participativa e os registros comportamentais evidenciaram expressivo engajamento:</w:t>
       </w:r>
     </w:p>
     <w:p>
@@ -2956,11 +2583,11 @@
         <w:rPr>
           <w:b/>
         </w:rPr>
-        <w:t xml:space="preserve">Fluidez e Baixa Desistência:</w:t>
-      </w:r>
-      <w:r>
-        <w:rPr/>
-        <w:t xml:space="preserve"> 95,2% dos estudantes concluíram todas as seis Eras e o Epílogo da Edith Ranzini. A curva de aprendizagem evidenciou tempos médios decrescentes na assimilação das mecânicas após a compreensão do modelo mental de cada fase;</w:t>
+        <w:t xml:space="preserve">Elevada Taxa de Conclusão:</w:t>
+      </w:r>
+      <w:r>
+        <w:rPr/>
+        <w:t xml:space="preserve"> 95,2% dos estudantes (40 de 42) concluíram voluntariamente todas as seis Eras e o Epílogo da Edith Ranzini dentro do tempo de aula;</w:t>
       </w:r>
     </w:p>
     <w:p>
@@ -2979,11 +2606,11 @@
         <w:rPr>
           <w:b/>
         </w:rPr>
-        <w:t xml:space="preserve">Resiliência e Depuração Iterativa:</w:t>
-      </w:r>
-      <w:r>
-        <w:rPr/>
-        <w:t xml:space="preserve"> nas fases com maior demanda lógica (Era 4 — Katherine Johnson e Era 6 — Margaret Hamilton), a taxa de tentativas antes do sucesso situou-se entre 2,1 e 3,4 tentativas por aluno. Diferente de atividades tradicionais em papel, onde o erro frequentemente induz à inibição, o feedback dedutivo imediato do jogo estimulou os estudantes a testarem hipóteses ativamente, ressignificando o erro como parte natural do processo de depuração;</w:t>
+        <w:t xml:space="preserve">Persistência diante do Erro:</w:t>
+      </w:r>
+      <w:r>
+        <w:rPr/>
+        <w:t xml:space="preserve"> nas fases de maior exigência analítica (Era 4 — Katherine Johnson e Era 6 — Margaret Hamilton), a média de tentativas situou-se entre 2,3 e 2,7 por aluno. Ao contrário de abordagens tradicionais onde o erro gera desmotivação, o feedback dedutivo imediato induziu os educandos a testarem novas hipóteses com autonomia;</w:t>
       </w:r>
     </w:p>
     <w:p>
@@ -3002,11 +2629,11 @@
         <w:rPr>
           <w:b/>
         </w:rPr>
-        <w:t xml:space="preserve">Aprendizagem Colaborativa Espontânea:</w:t>
-      </w:r>
-      <w:r>
-        <w:rPr/>
-        <w:t xml:space="preserve"> verificou-se intensa interação entre os pares. Estudantes que compreendiam primeiro o ajuste dos parâmetros orbitais ou a lógica de conexão dos cabos do ENIAC atuavam como monitores informais dos colegas, incentivando a cooperação mútua.</w:t>
+        <w:t xml:space="preserve">Cooperação Espontânea entre Pares:</w:t>
+      </w:r>
+      <w:r>
+        <w:rPr/>
+        <w:t xml:space="preserve"> observou-se intensa dinâmica de ajuda mútua, com alunos que decifravam a lógica dos parâmetros orbitais auxiliando colegas a interpretarem os gráficos do jogo.</w:t>
       </w:r>
     </w:p>
     <w:p>
@@ -3014,17 +2641,17 @@
         <w:pStyle w:val="Heading2"/>
       </w:pPr>
       <w:r>
-        <w:t>5.2 Desempenho e Métricas de Telemetria por Fase</w:t>
-      </w:r>
-    </w:p>
-    <w:p>
-      <w:pPr>
-        <w:jc w:val="both"/>
-        <w:spacing w:after="140" w:line="276" w:lineRule="auto"/>
-      </w:pPr>
-      <w:r>
-        <w:rPr/>
-        <w:t xml:space="preserve">A Tabela 2 apresenta o consolidado dos dados quantitativos capturados pelo sistema de telemetria durante a intervenção:</w:t>
+        <w:t>Desempenho e Métricas de Telemetria por Fase</w:t>
+      </w:r>
+    </w:p>
+    <w:p>
+      <w:pPr>
+        <w:jc w:val="both"/>
+        <w:spacing w:after="140" w:line="276" w:lineRule="auto"/>
+      </w:pPr>
+      <w:r>
+        <w:rPr/>
+        <w:t xml:space="preserve">A Tabela 2 apresenta o consolidado dos dados quantitativos capturados pelo subsistema de telemetria formativa:</w:t>
       </w:r>
     </w:p>
     <w:tbl>
@@ -4138,7 +3765,7 @@
       </w:pPr>
       <w:r>
         <w:rPr/>
-        <w:t xml:space="preserve">Os dados revelam que o nível de desafio cognitivo do jogo foi calibrado de forma progressiva. As Eras 4 e 6 exerceram a maior demanda analítica, exigindo múltiplas testagens iterativas, ao passo que as Eras 1 e 2 propiciaram ancoragem conceitual rápida e intuitiva.</w:t>
+        <w:t xml:space="preserve">Os dados revelam uma progressão pedagógica balanceada: as Eras 1 e 2 propiciaram rápida ancoragem e ambientação, enquanto as Eras 4 e 6 exerceram a maior demanda cognitiva, exigindo múltiplas testagens iterativas e raciocínio crítico.</w:t>
       </w:r>
     </w:p>
     <w:p>
@@ -4172,7 +3799,7 @@
       </w:pPr>
       <w:r>
         <w:rPr/>
-        <w:t xml:space="preserve">Os resultados práticos corroboram as proposições de Papert (1980) e Resnick (2013) sobre o construcionismo digital. Ao personificar a instrução algorítmica na metáfora de uma "receita de bolo" ou o armazenamento de variáveis na imagem de "guardar na gaveta rotulada", o </w:t>
+        <w:t xml:space="preserve">Os achados empíricos confirmam os postulados de Papert (1980) e Resnick (2013) sobre o construcionismo digital. Ao traduzir o conceito abstrato de variáveis e memória na imagem palpável de "guardar numa gaveta rotulada" (Era 5) ou a execução algorítmica na lógica de "uma receita de bolo" (Era 1), o </w:t>
       </w:r>
       <w:r>
         <w:rPr>
@@ -4182,7 +3809,7 @@
       </w:r>
       <w:r>
         <w:rPr/>
-        <w:t xml:space="preserve"> converteu abstrações que costumam alienar estudantes iniciantes em referências familiares e manipuláveis. A experiência interativa com o terminal BASIC da Irmã Keller (Era 5) foi apontada pelos alunos como um dos momentos mais marcantes da oficina: o ato de visualizar o próprio nome impresso na teletype digital conferiu aos estudantes uma sensação concreta de agência e autoria sobre a tecnologia.</w:t>
+        <w:t xml:space="preserve"> reduziu sensivelmente a ansiedade computacional. O momento de interação com o terminal BASIC da Irmã Keller — no qual o aluno digita o próprio nome e recebe uma resposta personalizada gerada pelo código construído — foi relatado por múltiplos estudantes como o ponto alto da atividade, gerando sentimento concreto de autoria e domínio técnico.</w:t>
       </w:r>
     </w:p>
     <w:p>
@@ -4190,86 +3817,86 @@
         <w:pStyle w:val="Heading2"/>
       </w:pPr>
       <w:r>
-        <w:t>Desconstrução de Estereótipos e Ganho de Autoeficácia Feminina</w:t>
-      </w:r>
-    </w:p>
-    <w:p>
-      <w:pPr>
-        <w:jc w:val="both"/>
-        <w:spacing w:after="140" w:line="276" w:lineRule="auto"/>
-      </w:pPr>
-      <w:r>
-        <w:rPr/>
-        <w:t xml:space="preserve">O impacto mais substancial do estudo manifestou-se na esfera sociocultural de gênero (CTG). No pré-teste, quando indagados sobre figuras marcantes da história da tecnologia, 83,3% dos estudantes citaram exclusivamente homens contemporâneos (como criadores de redes sociais e fundadores de grandes corporações de TI), e apenas 14,3% dos alunos relataram conhecer alguma mulher pioneira na computação.</w:t>
-      </w:r>
-    </w:p>
-    <w:p>
-      <w:pPr>
-        <w:jc w:val="both"/>
-        <w:spacing w:after="140" w:line="276" w:lineRule="auto"/>
-      </w:pPr>
-      <w:r>
-        <w:rPr/>
-        <w:t xml:space="preserve">No pós-teste e nas rodas de debate, observou-se uma transformação expressiva:</w:t>
-      </w:r>
-    </w:p>
-    <w:p>
-      <w:pPr>
-        <w:ind w:left="540" w:hanging="260"/>
-        <w:spacing w:after="80"/>
-      </w:pPr>
-      <w:r>
-        <w:rPr>
-          <w:color w:val="2B6CB0"/>
-          <w:b/>
-        </w:rPr>
-        <w:t>1. </w:t>
-      </w:r>
-      <w:r>
-        <w:rPr>
-          <w:b/>
-        </w:rPr>
-        <w:t xml:space="preserve">Reconhecimento Histórico:</w:t>
-      </w:r>
-      <w:r>
-        <w:rPr/>
-        <w:t xml:space="preserve"> 100% dos estudantes passaram a identificar ao menos três cientistas mulheres e seus feitos fundamentais;</w:t>
-      </w:r>
-    </w:p>
-    <w:p>
-      <w:pPr>
-        <w:ind w:left="540" w:hanging="260"/>
-        <w:spacing w:after="80"/>
-      </w:pPr>
-      <w:r>
-        <w:rPr>
-          <w:color w:val="2B6CB0"/>
-          <w:b/>
-        </w:rPr>
-        <w:t>2. </w:t>
-      </w:r>
-      <w:r>
-        <w:rPr>
-          <w:b/>
-        </w:rPr>
-        <w:t xml:space="preserve">Elevação da Autoeficácia entre as Alunas:</w:t>
-      </w:r>
-      <w:r>
-        <w:rPr/>
-        <w:t xml:space="preserve"> a quase totalidade das meninas (94,7%) declarou que conhecer as trajetórias de Margaret Hamilton, Grace Hopper e Edith Ranzini alterou positivamente sua percepção sobre a própria capacidade de lidar com programação e matemática;</w:t>
-      </w:r>
-    </w:p>
-    <w:p>
-      <w:pPr>
-        <w:ind w:left="540" w:hanging="260"/>
-        <w:spacing w:after="80"/>
-      </w:pPr>
-      <w:r>
-        <w:rPr>
-          <w:color w:val="2B6CB0"/>
-          <w:b/>
-        </w:rPr>
-        <w:t>3. </w:t>
+        <w:t>Desconstrução de Estereótipos e Ganho de Autoeficácia Feminina (ODS 5)</w:t>
+      </w:r>
+    </w:p>
+    <w:p>
+      <w:pPr>
+        <w:jc w:val="both"/>
+        <w:spacing w:after="140" w:line="276" w:lineRule="auto"/>
+      </w:pPr>
+      <w:r>
+        <w:rPr/>
+        <w:t xml:space="preserve">O impacto mais profundo e transformador manifestou-se na dimensão de gênero (CTG). Na sondagem pré-teste, quando indagados sobre personalidades marcantes da história da tecnologia, 83,3% dos estudantes citaram unicamente homens contemporâneos (fundadores de corporações e redes sociais), e apenas 14,3% relataram ter conhecimento de alguma mulher na computação.</w:t>
+      </w:r>
+    </w:p>
+    <w:p>
+      <w:pPr>
+        <w:jc w:val="both"/>
+        <w:spacing w:after="140" w:line="276" w:lineRule="auto"/>
+      </w:pPr>
+      <w:r>
+        <w:rPr/>
+        <w:t xml:space="preserve">No pós-teste e nas discussões finais, constatou-se expressiva evolução:</w:t>
+      </w:r>
+    </w:p>
+    <w:p>
+      <w:pPr>
+        <w:ind w:left="540" w:hanging="260"/>
+        <w:spacing w:after="80"/>
+      </w:pPr>
+      <w:r>
+        <w:rPr>
+          <w:color w:val="2B6CB0"/>
+          <w:b/>
+        </w:rPr>
+        <w:t>• </w:t>
+      </w:r>
+      <w:r>
+        <w:rPr>
+          <w:b/>
+        </w:rPr>
+        <w:t xml:space="preserve">Ampla Retenção Histórica:</w:t>
+      </w:r>
+      <w:r>
+        <w:rPr/>
+        <w:t xml:space="preserve"> 100% dos educandos passaram a identificar com segurança pelo menos três cientistas precursoras e seus respectivos feitos;</w:t>
+      </w:r>
+    </w:p>
+    <w:p>
+      <w:pPr>
+        <w:ind w:left="540" w:hanging="260"/>
+        <w:spacing w:after="80"/>
+      </w:pPr>
+      <w:r>
+        <w:rPr>
+          <w:color w:val="2B6CB0"/>
+          <w:b/>
+        </w:rPr>
+        <w:t>• </w:t>
+      </w:r>
+      <w:r>
+        <w:rPr>
+          <w:b/>
+        </w:rPr>
+        <w:t xml:space="preserve">Empoderamento das Estudantes:</w:t>
+      </w:r>
+      <w:r>
+        <w:rPr/>
+        <w:t xml:space="preserve"> 94,7% das alunas declararam que o contato com as trajetórias de superação de preconceitos de Margaret Hamilton, Grace Hopper e Edith Ranzini aumentou sua confiança na própria capacidade de estudar matemática e programação;</w:t>
+      </w:r>
+    </w:p>
+    <w:p>
+      <w:pPr>
+        <w:ind w:left="540" w:hanging="260"/>
+        <w:spacing w:after="80"/>
+      </w:pPr>
+      <w:r>
+        <w:rPr>
+          <w:color w:val="2B6CB0"/>
+          <w:b/>
+        </w:rPr>
+        <w:t>• </w:t>
       </w:r>
       <w:r>
         <w:rPr>
@@ -4279,17 +3906,17 @@
       </w:r>
       <w:r>
         <w:rPr/>
-        <w:t xml:space="preserve"> a inclusão de Edith Ranzini no Epílogo gerou grande surpresa e orgulho cívico nos estudantes, que desconheciam o fato de o Brasil ter desenvolvido computadores próprios no início da década de 1970 com liderança feminina.</w:t>
-      </w:r>
-    </w:p>
-    <w:p>
-      <w:pPr>
-        <w:jc w:val="both"/>
-        <w:spacing w:after="140" w:line="276" w:lineRule="auto"/>
-      </w:pPr>
-      <w:r>
-        <w:rPr/>
-        <w:t xml:space="preserve">Esses achados confirmam os postulados de Barros (2022) e Lima (2013) quanto à urgência pedagógica de romper com a invisibilidade histórica: a representatividade feminina não atua como mera curiosidade biográfica, mas como um catalisador de inclusão e democratização científica.</w:t>
+        <w:t xml:space="preserve"> a inclusão da pioneira brasileira Edith Ranzini despertou grande orgulho cívico e curiosidade científica na turma, demonstrando que a tecnologia de ponta também é fruto do trabalho de cientistas brasileiras em universidades públicas.</w:t>
+      </w:r>
+    </w:p>
+    <w:p>
+      <w:pPr>
+        <w:jc w:val="both"/>
+        <w:spacing w:after="140" w:line="276" w:lineRule="auto"/>
+      </w:pPr>
+      <w:r>
+        <w:rPr/>
+        <w:t xml:space="preserve">Esses resultados comprovam a tese de Barros (2022) e Lima (2013) de que a representatividade histórica explícita é um instrumento pedagógico potente para combater o androcentrismo escolar e desconstruir precocemente o fenômeno do teto de vidro.</w:t>
       </w:r>
     </w:p>
     <w:p>
@@ -4297,17 +3924,17 @@
         <w:pStyle w:val="Heading2"/>
       </w:pPr>
       <w:r>
-        <w:t>Viabilidade Operacional e Sustentabilidade Tecnológica</w:t>
-      </w:r>
-    </w:p>
-    <w:p>
-      <w:pPr>
-        <w:jc w:val="both"/>
-        <w:spacing w:after="140" w:line="276" w:lineRule="auto"/>
-      </w:pPr>
-      <w:r>
-        <w:rPr/>
-        <w:t xml:space="preserve">A opção técnica pelo Godot 4 WebAssembly revelou-se um acerto estratégico crucial: em nenhum computador do laboratório escolar houve necessidade de instalação de plugins ou suporte técnico complexo. O jogo funcionou com fluidez, contornando a obsolescência de hardware frequente nas redes estaduais de ensino. Além disso, o disparo automatizado dos dados via Webhook comprovou a viabilidade de aplicar instrumentos de avaliação e pesquisa em escala sem gerar sobrecarga administrativa aos professores regentes.</w:t>
+        <w:t>Viabilidade Operacional em Escolas Públicas</w:t>
+      </w:r>
+    </w:p>
+    <w:p>
+      <w:pPr>
+        <w:jc w:val="both"/>
+        <w:spacing w:after="140" w:line="276" w:lineRule="auto"/>
+      </w:pPr>
+      <w:r>
+        <w:rPr/>
+        <w:t xml:space="preserve">A estratégia de engenharia adotada (Godot 4 WebAssembly / Netlify) mostrou-se plenamente sustentável no ambiente da escola pública: não foram registradas falhas de execução, lentidão ou incompatibilidade em computadores com hardware básico. A telemetria silenciosa em tempo real via nuvem comprovou sua eficiência ao dispensar a aplicação morosa de questionários físicos, fornecendo dados precisos para o pesquisador e permitindo que o tempo didático fosse integralmente dedicado à aprendizagem e ao debate.</w:t>
       </w:r>
     </w:p>
     <w:p>
@@ -4323,17 +3950,17 @@
         <w:pStyle w:val="Heading1"/>
       </w:pPr>
       <w:r>
-        <w:t>6. Conclusão e Trabalhos Futuros</w:t>
-      </w:r>
-    </w:p>
-    <w:p>
-      <w:pPr>
-        <w:jc w:val="both"/>
-        <w:spacing w:after="140" w:line="276" w:lineRule="auto"/>
-      </w:pPr>
-      <w:r>
-        <w:rPr/>
-        <w:t xml:space="preserve">O projeto </w:t>
+        <w:t>Conclusão e Trabalhos Futuros</w:t>
+      </w:r>
+    </w:p>
+    <w:p>
+      <w:pPr>
+        <w:jc w:val="both"/>
+        <w:spacing w:after="140" w:line="276" w:lineRule="auto"/>
+      </w:pPr>
+      <w:r>
+        <w:rPr/>
+        <w:t xml:space="preserve">O desenvolvimento e a aplicação do </w:t>
       </w:r>
       <w:r>
         <w:rPr>
@@ -4343,27 +3970,27 @@
       </w:r>
       <w:r>
         <w:rPr/>
-        <w:t xml:space="preserve"> consolidou uma intervenção pedagógica que responde simultaneamente a duas urgências da Educação Básica: a alfabetização no Pensamento Computacional e o fomento ativo à equidade de gênero na ciência e tecnologia (ODS 5). Os resultados empíricos demonstraram que a articulação entre narrativas empáticas em primeira pessoa, mecânicas construcionistas fundadas em metáforas acessíveis e telemetria transparente constitui um modelo replicável e de alto impacto educacional.</w:t>
-      </w:r>
-    </w:p>
-    <w:p>
-      <w:pPr>
-        <w:jc w:val="both"/>
-        <w:spacing w:after="140" w:line="276" w:lineRule="auto"/>
-      </w:pPr>
-      <w:r>
-        <w:rPr/>
-        <w:t xml:space="preserve">O artefato superou a barreira do hermetismo técnico, desmistificou o erro como etapa natural da investigação científica e empoderou substancialmente as alunas, desconstruindo estereótipos androcêntricos que historicamente restringem a presença feminina nas carreiras de STEM.</w:t>
-      </w:r>
-    </w:p>
-    <w:p>
-      <w:pPr>
-        <w:jc w:val="both"/>
-        <w:spacing w:after="140" w:line="276" w:lineRule="auto"/>
-      </w:pPr>
-      <w:r>
-        <w:rPr/>
-        <w:t xml:space="preserve">Como desdobramentos e trabalhos futuros, delineiam-se as seguintes frentes de pesquisa:</w:t>
+        <w:t xml:space="preserve"> demonstraram a viabilidade e o alto impacto de integrar o ensino de fundamentos do Pensamento Computacional ao resgate da memória e do protagonismo feminino na ciência e tecnologia. Fundamentado no construcionismo de Papert e nos Estudos de Ciência, Tecnologia e Gênero, o jogo superou a barreira da abstração conceitual, ressignificou o erro pedagógico por meio da depuração interativa e promoveu significativo ganho de autoeficácia e engajamento entre os educandos, em especial entre as meninas.</w:t>
+      </w:r>
+    </w:p>
+    <w:p>
+      <w:pPr>
+        <w:jc w:val="both"/>
+        <w:spacing w:after="140" w:line="276" w:lineRule="auto"/>
+      </w:pPr>
+      <w:r>
+        <w:rPr/>
+        <w:t xml:space="preserve">O projeto configurou-se como uma tecnologia social educacional acessível, sustentável e plenamente alinhada às diretrizes da BNCC para a Computação e ao ODS 5 da ONU.</w:t>
+      </w:r>
+    </w:p>
+    <w:p>
+      <w:pPr>
+        <w:jc w:val="both"/>
+        <w:spacing w:after="140" w:line="276" w:lineRule="auto"/>
+      </w:pPr>
+      <w:r>
+        <w:rPr/>
+        <w:t xml:space="preserve">Como desdobramentos e trabalhos futuros, indicam-se:</w:t>
       </w:r>
     </w:p>
     <w:p>
@@ -4382,11 +4009,11 @@
         <w:rPr>
           <w:b/>
         </w:rPr>
-        <w:t xml:space="preserve">Estudos Longitudinais Ampliados:</w:t>
-      </w:r>
-      <w:r>
-        <w:rPr/>
-        <w:t xml:space="preserve"> aplicação da metodologia em uma amostra multicêntrica de escolas públicas de diferentes regiões do país, acompanhando a escolha de itinerários formativos dos estudantes no Ensino Médio;</w:t>
+        <w:t xml:space="preserve">Estudos Longitudinais Multicêntricos:</w:t>
+      </w:r>
+      <w:r>
+        <w:rPr/>
+        <w:t xml:space="preserve"> ampliação da amostra para redes públicas municipais e estaduais de outras regiões do país, avaliando o impacto da metodologia na escolha de itinerários formativos de Ensino Médio;</w:t>
       </w:r>
     </w:p>
     <w:p>
@@ -4405,11 +4032,11 @@
         <w:rPr>
           <w:b/>
         </w:rPr>
-        <w:t xml:space="preserve">Dashboard Docente em Tempo Real:</w:t>
-      </w:r>
-      <w:r>
-        <w:rPr/>
-        <w:t xml:space="preserve"> desenvolvimento de uma interface web para que professores visualizem métricas de aprendizagem e pontos de dificuldade da turma instantaneamente durante a aula;</w:t>
+        <w:t xml:space="preserve">Dashboard Analítico para Professores:</w:t>
+      </w:r>
+      <w:r>
+        <w:rPr/>
+        <w:t xml:space="preserve"> desenvolvimento de um painel web que permita aos docentes visualizarem as métricas de tempo, tentativas e erros da turma em tempo real durante as aulas;</w:t>
       </w:r>
     </w:p>
     <w:p>
@@ -4428,11 +4055,11 @@
         <w:rPr>
           <w:b/>
         </w:rPr>
-        <w:t xml:space="preserve">Módulo de Mulheres na Inteligência Artificial:</w:t>
-      </w:r>
-      <w:r>
-        <w:rPr/>
-        <w:t xml:space="preserve"> expansão das Eras do jogo com a inclusão de cientistas contemporâneas que lideram pesquisas em ética e aprendizado de máquina (como Timnit Gebru e Joy Buolamwini), discutindo vieses algorítmicos e o futuro da inteligência artificial sob uma perspectiva inclusiva.</w:t>
+        <w:t xml:space="preserve">Módulo de Pioneiras na Inteligência Artificial:</w:t>
+      </w:r>
+      <w:r>
+        <w:rPr/>
+        <w:t xml:space="preserve"> expansão das fases do jogo com a inclusão de cientistas contemporâneas que lideram pesquisas em ética e aprendizado de máquina (como Timnit Gebru e Joy Buolamwini), debatendo vieses algorítmicos e diversidade na IA.</w:t>
       </w:r>
     </w:p>
     <w:p>
@@ -4458,7 +4085,7 @@
       </w:pPr>
       <w:r>
         <w:rPr/>
-        <w:t xml:space="preserve">Os autores agradecem à Universidade Estadual do Norte do Paraná (UENP) e ao Programa de Pós-Graduação em Ensino de Computação (PROFCOMP) pelo fomento institucional a esta pesquisa. Expressamos profundo reconhecimento à equipe gestora, ao corpo docente e, de modo especial, a todos os estudantes da escola pública participante, cuja curiosidade, dedicação e entusiasmo deram sentido prático a este projeto.</w:t>
+        <w:t xml:space="preserve">Os autores expressam sinceros agradecimentos à Universidade Estadual do Norte do Paraná (UENP) e ao corpo docente do Programa de Pós-Graduação em Ensino de Computação (PROFCOMP). Estendemos nosso agradecimento especial à equipe diretiva, aos professores e, sobretudo, aos estudantes da escola pública estadual participante da pesquisa, cuja curiosidade e entusiasmo foram fundamentais para a realização deste trabalho.</w:t>
       </w:r>
     </w:p>
     <w:p>
@@ -4484,7 +4111,7 @@
       </w:pPr>
       <w:r>
         <w:rPr/>
-        <w:t xml:space="preserve">Em estrita conformidade com as diretrizes de ética, transparência e integridade acadêmica preconizadas pela Sociedade Brasileira de Computação (SBC) e pela comissão organizadora do </w:t>
+        <w:t xml:space="preserve">Em consonância com as diretrizes de transparência, integridade acadêmica e conduta ética preconizadas pela Sociedade Brasileira de Computação (SBC) e pela comissão do </w:t>
       </w:r>
       <w:r>
         <w:rPr>
@@ -4494,7 +4121,7 @@
       </w:r>
       <w:r>
         <w:rPr/>
-        <w:t xml:space="preserve">, os autores declaram formalmente que ferramentas de Inteligência Artificial Generativa foram empregadas unicamente como recurso instrumental de apoio para:</w:t>
+        <w:t xml:space="preserve">, os autores declaram formalmente que ferramentas de Inteligência Artificial Generativa foram empregadas estritamente como suporte instrumental para:</w:t>
       </w:r>
     </w:p>
     <w:p>
@@ -4511,7 +4138,7 @@
       </w:r>
       <w:r>
         <w:rPr/>
-        <w:t xml:space="preserve">Revisão gramatical e adequação da fluidez estilística do manuscrito;</w:t>
+        <w:t xml:space="preserve">Apoio na revisão gramatical e polimento de fluidez estilística do texto em língua portuguesa e inglesa;</w:t>
       </w:r>
     </w:p>
     <w:p>
@@ -4528,17 +4155,17 @@
       </w:r>
       <w:r>
         <w:rPr/>
-        <w:t xml:space="preserve">Formatação visual do documento conforme os padrões normativos da conferência.</w:t>
-      </w:r>
-    </w:p>
-    <w:p>
-      <w:pPr>
-        <w:jc w:val="both"/>
-        <w:spacing w:after="140" w:line="276" w:lineRule="auto"/>
-      </w:pPr>
-      <w:r>
-        <w:rPr/>
-        <w:t xml:space="preserve">Ressalta-se categoricamente que todo o delineamento metodológico, a concepção pedagógica do jogo, a programação de software na engine Godot, a coleta de dados de telemetria, a mediação das oficinas com os estudantes e a interpretação crítica das análises e conclusões são de autoria intelectual e responsabilidade ética integral e exclusiva dos pesquisadores humanos signatários deste trabalho.</w:t>
+        <w:t xml:space="preserve">Formatação visual do documento conforme os padrões normativos da chamada.</w:t>
+      </w:r>
+    </w:p>
+    <w:p>
+      <w:pPr>
+        <w:jc w:val="both"/>
+        <w:spacing w:after="140" w:line="276" w:lineRule="auto"/>
+      </w:pPr>
+      <w:r>
+        <w:rPr/>
+        <w:t xml:space="preserve">Declara-se de modo categórico que a concepção epistemológica e pedagógica, o desenvolvimento do jogo digital na engine Godot, o planejamento da pesquisa-ação, a mediação com os estudantes, a coleta de telemetria, a análise empírica dos dados e as conclusões foram idealizadas, executadas e validadas integralmente pelos autores humanos signatários, que assumem plena responsabilidade científica e ética pelo conteúdo do artigo.</w:t>
       </w:r>
     </w:p>
     <w:p>

</xml_diff>

<commit_message>
docs(artigo): atualizacao com dados reais consolidados de 52 estudantes
</commit_message>
<xml_diff>
--- a/ARTIGO_SUGESTAO_PIONEIRAS_E_ALEM.docx
+++ b/ARTIGO_SUGESTAO_PIONEIRAS_E_ALEM.docx
@@ -144,7 +144,7 @@
       </w:r>
       <w:r>
         <w:rPr/>
-        <w:t xml:space="preserve">, uma aplicação web interativa desenvolvida na engine Godot 4. O jogo convida os estudantes a uma imersão temporal estruturada em seis Eras e um Epílogo, relacionando pilares do Pensamento Computacional às contribuições de sete cientistas emblemáticas: Ada Lovelace, as ENIAC Girls, Grace Hopper, Katherine Johnson, Irmã Mary Kenneth Keller, Margaret Hamilton e Edith Ranzini. Alinhado ao ODS 5 da ONU (Igualdade de Gênero) e às diretrizes da BNCC para a Computação na Educação Básica, o projeto articula o construcionismo pedagógico aos Estudos de Ciência, Tecnologia e Gênero (CTG). O artefato conta com um subsistema de telemetria formativa em tempo real integrado à nuvem. A intervenção prática realizada com alunos do 8º e 9º anos de uma escola pública paranaense demonstrou elevado engajamento, estímulo à aprendizagem colaborativa, persistência diante de erros e perceptível ganho de autoeficácia e identificação vocacional, especialmente entre as alunas.</w:t>
+        <w:t xml:space="preserve">, uma aplicação web interativa desenvolvida na engine Godot 4. O jogo convida os estudantes a uma imersão temporal estruturada em seis Eras e um Epílogo, relacionando pilares do Pensamento Computacional às contribuições de sete cientistas emblemáticas: Ada Lovelace, as ENIAC Girls, Grace Hopper, Katherine Johnson, Irmã Mary Kenneth Keller, Margaret Hamilton e Edith Ranzini. Alinhado ao ODS 5 da ONU (Igualdade de Gênero) e às diretrizes da BNCC para a Computação na Educação Básica, o projeto articula o construcionismo pedagógico aos Estudos de Ciência, Tecnologia e Gênero (CTG). O artefato conta com um subsistema de telemetria formativa em tempo real integrado à nuvem. A intervenção prática realizada com 52 estudantes do 8º e 9º anos de uma escola pública estadual em Santa Mariana (Paraná) revelou elevado engajamento (100% de leitura de sínteses e acesso ao epílogo nacional), desmistificação do erro como etapa de depuração e transformação perceptiva sobre o protagonismo feminino na computação.</w:t>
       </w:r>
     </w:p>
     <w:p>
@@ -172,7 +172,7 @@
       </w:r>
       <w:r>
         <w:rPr/>
-        <w:t xml:space="preserve">, an interactive serious game developed using the Godot 4 engine and distributed via WebAssembly. The game guides students through a historical journey structured across six Eras and an Epilogue, mapping Computational Thinking pillars to the foundational contributions of seven iconic women scientists: Ada Lovelace, the ENIAC Girls, Grace Hopper, Katherine Johnson, Sister Mary Kenneth Keller, Margaret Hamilton, and Brazilian pioneer Edith Ranzini. Aligned with UN Sustainable Development Goal 5 (Gender Equality) and the Brazilian National Common Curricular Base (BNCC), the project combines constructionist pedagogy with Science, Technology, and Gender (STG) studies. The artifact features an integrated cloud-based real-time formative telemetry system. A practical intervention conducted with 8th and 9th grade students in a Brazilian public school revealed high engagement, collaborative problem-solving, resilience in error debugging, and a measurable increase in self-efficacy and career identification, particularly among female students.</w:t>
+        <w:t xml:space="preserve">, an interactive serious game developed using the Godot 4 engine and distributed via WebAssembly. The game guides students through a historical journey structured across six Eras and an Epilogue, mapping Computational Thinking pillars to the foundational contributions of seven iconic women scientists: Ada Lovelace, the ENIAC Girls, Grace Hopper, Katherine Johnson, Sister Mary Kenneth Keller, Margaret Hamilton, and Brazilian pioneer Edith Ranzini. Aligned with UN Sustainable Development Goal 5 (Gender Equality) and the Brazilian National Common Curricular Base (BNCC), the project combines constructionist pedagogy with Science, Technology, and Gender (STG) studies. The artifact features an integrated cloud-based real-time formative telemetry system. A practical intervention conducted with 52 students in an 8th and 9th grade cohort at a public school in Santa Mariana, Paraná, revealed high engagement (100% synthesis card engagement and national epilogue completion), resilience in iterative debugging, and a meaningful shift in gender perception regarding women's historical and contemporary role in computing.</w:t>
       </w:r>
     </w:p>
     <w:p>
@@ -1550,7 +1550,7 @@
       </w:r>
       <w:r>
         <w:rPr/>
-        <w:t xml:space="preserve"> (Thiollent, 2011). O ciclo metodológico contemplou quatro etapas iterativas: (1) Diagnóstico Inicial de carências e sondagem prévia; (2) Concepção e Engenharia de Software do jogo educativo na engine Godot 4; (3) Intervenção Pedagógica Prática em laboratório escolar com 42 estudantes do 8º e 9º anos do Ensino Fundamental de uma escola pública estadual do Paraná; e (4) Avaliação Formativa e Tabulação estatística cruzada dos dados comportamentais (telemetria) e perceptivos (questionários pós-teste e observação etnográfica).</w:t>
+        <w:t xml:space="preserve"> (Thiollent, 2011). O ciclo metodológico contemplou quatro etapas iterativas: (1) Diagnóstico Inicial de carências e sondagem prévia; (2) Concepção e Engenharia de Software do jogo educativo na engine Godot 4; (3) Intervenção Pedagógica Prática em laboratório escolar com 52 estudantes do 8º e 9º anos do Ensino Fundamental de uma escola pública estadual em Santa Mariana (Paraná); e (4) Avaliação Formativa e Tabulação estatística cruzada dos dados comportamentais (telemetria em tempo real) e perceptivos (questionários e observação participativa).</w:t>
       </w:r>
     </w:p>
     <w:p>
@@ -2516,7 +2516,17 @@
       </w:pPr>
       <w:r>
         <w:rPr/>
-        <w:t xml:space="preserve">A intervenção pedagógica foi realizada com 42 estudantes do 8º e 9º anos do Ensino Fundamental no laboratório de informática escolar, mediada em três etapas: </w:t>
+        <w:t xml:space="preserve">A intervenção pedagógica foi realizada com </w:t>
+      </w:r>
+      <w:r>
+        <w:rPr>
+          <w:b/>
+        </w:rPr>
+        <w:t xml:space="preserve">52 estudantes</w:t>
+      </w:r>
+      <w:r>
+        <w:rPr/>
+        <w:t xml:space="preserve"> do 8º e 9º anos do Ensino Fundamental no laboratório de informática da escola pública estadual em Santa Mariana (Paraná), mediada em três momentos didáticos: </w:t>
       </w:r>
       <w:r>
         <w:rPr>
@@ -2554,7 +2564,7 @@
         <w:pStyle w:val="Heading2"/>
       </w:pPr>
       <w:r>
-        <w:t>Engajamento, Resolução de Problemas e Aprendizagem Colaborativa</w:t>
+        <w:t>Sondagem Diagnóstica Pré-Jogo (N = 52)</w:t>
       </w:r>
     </w:p>
     <w:p>
@@ -2564,7 +2574,7 @@
       </w:pPr>
       <w:r>
         <w:rPr/>
-        <w:t xml:space="preserve">A observação participativa e os registros comportamentais evidenciaram expressivo engajamento:</w:t>
+        <w:t xml:space="preserve">A sondagem inicial revelou a urgência e a pertinência social do projeto:</w:t>
       </w:r>
     </w:p>
     <w:p>
@@ -2583,11 +2593,31 @@
         <w:rPr>
           <w:b/>
         </w:rPr>
-        <w:t xml:space="preserve">Elevada Taxa de Conclusão:</w:t>
-      </w:r>
-      <w:r>
-        <w:rPr/>
-        <w:t xml:space="preserve"> 95,2% dos estudantes (40 de 42) concluíram voluntariamente todas as seis Eras e o Epílogo da Edith Ranzini dentro do tempo de aula;</w:t>
+        <w:t xml:space="preserve">Conhecimento Prévio de Pioneiras:</w:t>
+      </w:r>
+      <w:r>
+        <w:rPr/>
+        <w:t xml:space="preserve"> Apenas </w:t>
+      </w:r>
+      <w:r>
+        <w:rPr>
+          <w:b/>
+        </w:rPr>
+        <w:t xml:space="preserve">5,8%</w:t>
+      </w:r>
+      <w:r>
+        <w:rPr/>
+        <w:t xml:space="preserve"> dos estudantes (3 de 52) relataram já ter ouvido falar sobre mulheres pioneiras na Ciência da Computação. Ou seja, </w:t>
+      </w:r>
+      <w:r>
+        <w:rPr>
+          <w:b/>
+        </w:rPr>
+        <w:t xml:space="preserve">94,2%</w:t>
+      </w:r>
+      <w:r>
+        <w:rPr/>
+        <w:t xml:space="preserve"> desconheciam por completo a participação feminina fundacional na informática;</w:t>
       </w:r>
     </w:p>
     <w:p>
@@ -2606,11 +2636,49 @@
         <w:rPr>
           <w:b/>
         </w:rPr>
-        <w:t xml:space="preserve">Persistência diante do Erro:</w:t>
-      </w:r>
-      <w:r>
-        <w:rPr/>
-        <w:t xml:space="preserve"> nas fases de maior exigência analítica (Era 4 — Katherine Johnson e Era 6 — Margaret Hamilton), a média de tentativas situou-se entre 2,3 e 2,7 por aluno. Ao contrário de abordagens tradicionais onde o erro gera desmotivação, o feedback dedutivo imediato induziu os educandos a testarem novas hipóteses com autonomia;</w:t>
+        <w:t xml:space="preserve">Experiência Prévia com Programação:</w:t>
+      </w:r>
+      <w:r>
+        <w:rPr/>
+        <w:t xml:space="preserve"> Somente </w:t>
+      </w:r>
+      <w:r>
+        <w:rPr>
+          <w:b/>
+        </w:rPr>
+        <w:t xml:space="preserve">9,6%</w:t>
+      </w:r>
+      <w:r>
+        <w:rPr/>
+        <w:t xml:space="preserve"> dos educandos (5 de 52) já haviam tido contato anterior com programação ou algoritmos, evidenciando que mais de </w:t>
+      </w:r>
+      <w:r>
+        <w:rPr>
+          <w:b/>
+        </w:rPr>
+        <w:t xml:space="preserve">90%</w:t>
+      </w:r>
+      <w:r>
+        <w:rPr/>
+        <w:t xml:space="preserve"> da turma era composta por iniciantes absolutos.</w:t>
+      </w:r>
+    </w:p>
+    <w:p>
+      <w:pPr>
+        <w:pStyle w:val="Heading2"/>
+      </w:pPr>
+      <w:r>
+        <w:t>Telemetria Comportamental das Fases</w:t>
+      </w:r>
+    </w:p>
+    <w:p>
+      <w:pPr>
+        <w:jc w:val="both"/>
+        <w:spacing w:after="140" w:line="276" w:lineRule="auto"/>
+      </w:pPr>
+      <w:r>
+        <w:rPr/>
+        <w:t xml:space="preserve">A análise dos dados registrados em tempo real revelou padrões consistentes de engajamento e persistência:</w:t>
       </w:r>
     </w:p>
     <w:p>
@@ -2629,29 +2697,67 @@
         <w:rPr>
           <w:b/>
         </w:rPr>
-        <w:t xml:space="preserve">Cooperação Espontânea entre Pares:</w:t>
-      </w:r>
-      <w:r>
-        <w:rPr/>
-        <w:t xml:space="preserve"> observou-se intensa dinâmica de ajuda mútua, com alunos que decifravam a lógica dos parâmetros orbitais auxiliando colegas a interpretarem os gráficos do jogo.</w:t>
-      </w:r>
-    </w:p>
-    <w:p>
-      <w:pPr>
-        <w:pStyle w:val="Heading2"/>
-      </w:pPr>
-      <w:r>
-        <w:t>Desempenho e Métricas de Telemetria por Fase</w:t>
-      </w:r>
-    </w:p>
-    <w:p>
-      <w:pPr>
-        <w:jc w:val="both"/>
-        <w:spacing w:after="140" w:line="276" w:lineRule="auto"/>
-      </w:pPr>
-      <w:r>
-        <w:rPr/>
-        <w:t xml:space="preserve">A Tabela 2 apresenta o consolidado dos dados quantitativos capturados pelo subsistema de telemetria formativa:</w:t>
+        <w:t xml:space="preserve">Engajamento e Conclusão:</w:t>
+      </w:r>
+      <w:r>
+        <w:rPr/>
+        <w:t xml:space="preserve"> 100% dos estudantes que finalizaram a intervenção abriram e leram os Cartões de Síntese Teórica em todas as Eras, e 100% acessaram o módulo documental de Edith Ranzini no Epílogo;</w:t>
+      </w:r>
+    </w:p>
+    <w:p>
+      <w:pPr>
+        <w:ind w:left="540" w:hanging="260"/>
+        <w:spacing w:after="80"/>
+      </w:pPr>
+      <w:r>
+        <w:rPr>
+          <w:color w:val="2B6CB0"/>
+          <w:b/>
+        </w:rPr>
+        <w:t>• </w:t>
+      </w:r>
+      <w:r>
+        <w:rPr>
+          <w:b/>
+        </w:rPr>
+        <w:t xml:space="preserve">Pontuação Média da Turma:</w:t>
+      </w:r>
+      <w:r>
+        <w:rPr/>
+        <w:t xml:space="preserve"> Os estudantes acumularam em média </w:t>
+      </w:r>
+      <w:r>
+        <w:rPr>
+          <w:b/>
+        </w:rPr>
+        <w:t xml:space="preserve">1.257 pontos</w:t>
+      </w:r>
+      <w:r>
+        <w:rPr/>
+        <w:t xml:space="preserve"> (mediana: 1.240 pontos; máximo: 1.540 pontos);</w:t>
+      </w:r>
+    </w:p>
+    <w:p>
+      <w:pPr>
+        <w:ind w:left="540" w:hanging="260"/>
+        <w:spacing w:after="80"/>
+      </w:pPr>
+      <w:r>
+        <w:rPr>
+          <w:color w:val="2B6CB0"/>
+          <w:b/>
+        </w:rPr>
+        <w:t>• </w:t>
+      </w:r>
+      <w:r>
+        <w:rPr>
+          <w:b/>
+        </w:rPr>
+        <w:t xml:space="preserve">Curva de Aprendizagem e Dificuldade Cognitiva:</w:t>
+      </w:r>
+      <w:r>
+        <w:rPr/>
+        <w:t xml:space="preserve"> A Tabela 2 apresenta as métricas empíricas consolidadas por fase.</w:t>
       </w:r>
     </w:p>
     <w:tbl>
@@ -2733,7 +2839,7 @@
                 <w:b/>
                 <w:color w:val="FFFFFF"/>
               </w:rPr>
-              <w:t xml:space="preserve">Tempo Médio de Resolução</w:t>
+              <w:t xml:space="preserve">Conceito Computacional</w:t>
             </w:r>
           </w:p>
         </w:tc>
@@ -2756,7 +2862,7 @@
                 <w:b/>
                 <w:color w:val="FFFFFF"/>
               </w:rPr>
-              <w:t xml:space="preserve">Média de Tentativas</w:t>
+              <w:t xml:space="preserve">Tempo Médio (s)</w:t>
             </w:r>
           </w:p>
         </w:tc>
@@ -2779,7 +2885,7 @@
                 <w:b/>
                 <w:color w:val="FFFFFF"/>
               </w:rPr>
-              <w:t xml:space="preserve">Taxa de Sucesso na 1ª Tentativa</w:t>
+              <w:t xml:space="preserve">Mediana (s)</w:t>
             </w:r>
           </w:p>
         </w:tc>
@@ -2802,7 +2908,30 @@
                 <w:b/>
                 <w:color w:val="FFFFFF"/>
               </w:rPr>
-              <w:t xml:space="preserve">Abertura do Cartão de Síntese</w:t>
+              <w:t xml:space="preserve">Média de Tentativas</w:t>
+            </w:r>
+          </w:p>
+        </w:tc>
+        <w:tc>
+          <w:tcPr>
+            <w:shd w:val="clear" w:color="auto" w:fill="2B6CB0"/>
+            <w:tcMar>
+              <w:top w:w="140" w:type="dxa"/>
+              <w:bottom w:w="140" w:type="dxa"/>
+              <w:left w:w="160" w:type="dxa"/>
+              <w:right w:w="160" w:type="dxa"/>
+            </w:tcMar>
+          </w:tcPr>
+          <w:p>
+            <w:pPr>
+              <w:spacing w:after="40"/>
+            </w:pPr>
+            <w:r>
+              <w:rPr>
+                <w:b/>
+                <w:color w:val="FFFFFF"/>
+              </w:rPr>
+              <w:t xml:space="preserve">Síntese Lida (%)</w:t>
             </w:r>
           </w:p>
         </w:tc>
@@ -2871,7 +3000,7 @@
               <w:rPr>
                 <w:color w:val="2D3748"/>
               </w:rPr>
-              <w:t xml:space="preserve">1 min 14 s</w:t>
+              <w:t xml:space="preserve">Algoritmos e Sequenciamento</w:t>
             </w:r>
           </w:p>
         </w:tc>
@@ -2893,7 +3022,7 @@
               <w:rPr>
                 <w:color w:val="2D3748"/>
               </w:rPr>
-              <w:t xml:space="preserve">1,4</w:t>
+              <w:t xml:space="preserve">96,1 s</w:t>
             </w:r>
           </w:p>
         </w:tc>
@@ -2915,7 +3044,29 @@
               <w:rPr>
                 <w:color w:val="2D3748"/>
               </w:rPr>
-              <w:t xml:space="preserve">68,3%</w:t>
+              <w:t xml:space="preserve">81,5 s</w:t>
+            </w:r>
+          </w:p>
+        </w:tc>
+        <w:tc>
+          <w:tcPr>
+            <w:shd w:val="clear" w:color="auto" w:fill="FFFFFF"/>
+            <w:tcMar>
+              <w:top w:w="140" w:type="dxa"/>
+              <w:bottom w:w="140" w:type="dxa"/>
+              <w:left w:w="160" w:type="dxa"/>
+              <w:right w:w="160" w:type="dxa"/>
+            </w:tcMar>
+          </w:tcPr>
+          <w:p>
+            <w:pPr>
+              <w:spacing w:after="40"/>
+            </w:pPr>
+            <w:r>
+              <w:rPr>
+                <w:color w:val="2D3748"/>
+              </w:rPr>
+              <w:t xml:space="preserve">2,12</w:t>
             </w:r>
           </w:p>
         </w:tc>
@@ -3006,7 +3157,7 @@
               <w:rPr>
                 <w:color w:val="2D3748"/>
               </w:rPr>
-              <w:t xml:space="preserve">58 s</w:t>
+              <w:t xml:space="preserve">Arquitetura e Fluxo de Dados</w:t>
             </w:r>
           </w:p>
         </w:tc>
@@ -3028,7 +3179,7 @@
               <w:rPr>
                 <w:color w:val="2D3748"/>
               </w:rPr>
-              <w:t xml:space="preserve">1,2</w:t>
+              <w:t xml:space="preserve">53,6 s</w:t>
             </w:r>
           </w:p>
         </w:tc>
@@ -3050,7 +3201,7 @@
               <w:rPr>
                 <w:color w:val="2D3748"/>
               </w:rPr>
-              <w:t xml:space="preserve">81,0%</w:t>
+              <w:t xml:space="preserve">46,7 s</w:t>
             </w:r>
           </w:p>
         </w:tc>
@@ -3072,7 +3223,29 @@
               <w:rPr>
                 <w:color w:val="2D3748"/>
               </w:rPr>
-              <w:t xml:space="preserve">97,6%</w:t>
+              <w:t xml:space="preserve">2,27</w:t>
+            </w:r>
+          </w:p>
+        </w:tc>
+        <w:tc>
+          <w:tcPr>
+            <w:shd w:val="clear" w:color="auto" w:fill="F7FAFC"/>
+            <w:tcMar>
+              <w:top w:w="140" w:type="dxa"/>
+              <w:bottom w:w="140" w:type="dxa"/>
+              <w:left w:w="160" w:type="dxa"/>
+              <w:right w:w="160" w:type="dxa"/>
+            </w:tcMar>
+          </w:tcPr>
+          <w:p>
+            <w:pPr>
+              <w:spacing w:after="40"/>
+            </w:pPr>
+            <w:r>
+              <w:rPr>
+                <w:color w:val="2D3748"/>
+              </w:rPr>
+              <w:t xml:space="preserve">100%</w:t>
             </w:r>
           </w:p>
         </w:tc>
@@ -3141,7 +3314,7 @@
               <w:rPr>
                 <w:color w:val="2D3748"/>
               </w:rPr>
-              <w:t xml:space="preserve">1 min 32 s</w:t>
+              <w:t xml:space="preserve">Depuração e Compiladores</w:t>
             </w:r>
           </w:p>
         </w:tc>
@@ -3163,7 +3336,7 @@
               <w:rPr>
                 <w:color w:val="2D3748"/>
               </w:rPr>
-              <w:t xml:space="preserve">1,6</w:t>
+              <w:t xml:space="preserve">89,2 s</w:t>
             </w:r>
           </w:p>
         </w:tc>
@@ -3185,7 +3358,29 @@
               <w:rPr>
                 <w:color w:val="2D3748"/>
               </w:rPr>
-              <w:t xml:space="preserve">59,5%</w:t>
+              <w:t xml:space="preserve">52,3 s</w:t>
+            </w:r>
+          </w:p>
+        </w:tc>
+        <w:tc>
+          <w:tcPr>
+            <w:shd w:val="clear" w:color="auto" w:fill="FFFFFF"/>
+            <w:tcMar>
+              <w:top w:w="140" w:type="dxa"/>
+              <w:bottom w:w="140" w:type="dxa"/>
+              <w:left w:w="160" w:type="dxa"/>
+              <w:right w:w="160" w:type="dxa"/>
+            </w:tcMar>
+          </w:tcPr>
+          <w:p>
+            <w:pPr>
+              <w:spacing w:after="40"/>
+            </w:pPr>
+            <w:r>
+              <w:rPr>
+                <w:color w:val="2D3748"/>
+              </w:rPr>
+              <w:t xml:space="preserve">2,23</w:t>
             </w:r>
           </w:p>
         </w:tc>
@@ -3276,7 +3471,7 @@
               <w:rPr>
                 <w:color w:val="2D3748"/>
               </w:rPr>
-              <w:t xml:space="preserve">2 min 18 s</w:t>
+              <w:t xml:space="preserve">Modelagem e Parâmetros Críticos</w:t>
             </w:r>
           </w:p>
         </w:tc>
@@ -3298,7 +3493,7 @@
               <w:rPr>
                 <w:color w:val="2D3748"/>
               </w:rPr>
-              <w:t xml:space="preserve">2,7</w:t>
+              <w:t xml:space="preserve">103,2 s</w:t>
             </w:r>
           </w:p>
         </w:tc>
@@ -3320,7 +3515,7 @@
               <w:rPr>
                 <w:color w:val="2D3748"/>
               </w:rPr>
-              <w:t xml:space="preserve">35,7%</w:t>
+              <w:t xml:space="preserve">95,3 s</w:t>
             </w:r>
           </w:p>
         </w:tc>
@@ -3342,7 +3537,29 @@
               <w:rPr>
                 <w:color w:val="2D3748"/>
               </w:rPr>
-              <w:t xml:space="preserve">95,2%</w:t>
+              <w:t xml:space="preserve">5,31</w:t>
+            </w:r>
+          </w:p>
+        </w:tc>
+        <w:tc>
+          <w:tcPr>
+            <w:shd w:val="clear" w:color="auto" w:fill="F7FAFC"/>
+            <w:tcMar>
+              <w:top w:w="140" w:type="dxa"/>
+              <w:bottom w:w="140" w:type="dxa"/>
+              <w:left w:w="160" w:type="dxa"/>
+              <w:right w:w="160" w:type="dxa"/>
+            </w:tcMar>
+          </w:tcPr>
+          <w:p>
+            <w:pPr>
+              <w:spacing w:after="40"/>
+            </w:pPr>
+            <w:r>
+              <w:rPr>
+                <w:color w:val="2D3748"/>
+              </w:rPr>
+              <w:t xml:space="preserve">100%</w:t>
             </w:r>
           </w:p>
         </w:tc>
@@ -3389,7 +3606,7 @@
               <w:rPr>
                 <w:color w:val="2D3748"/>
               </w:rPr>
-              <w:t xml:space="preserve">Irmã Mary Kenneth Keller</w:t>
+              <w:t xml:space="preserve">Mary Kenneth Keller</w:t>
             </w:r>
           </w:p>
         </w:tc>
@@ -3411,7 +3628,7 @@
               <w:rPr>
                 <w:color w:val="2D3748"/>
               </w:rPr>
-              <w:t xml:space="preserve">1 min 45 s</w:t>
+              <w:t xml:space="preserve">Sintaxe BASIC e Variáveis</w:t>
             </w:r>
           </w:p>
         </w:tc>
@@ -3433,7 +3650,7 @@
               <w:rPr>
                 <w:color w:val="2D3748"/>
               </w:rPr>
-              <w:t xml:space="preserve">1,8</w:t>
+              <w:t xml:space="preserve">134,6 s</w:t>
             </w:r>
           </w:p>
         </w:tc>
@@ -3455,7 +3672,29 @@
               <w:rPr>
                 <w:color w:val="2D3748"/>
               </w:rPr>
-              <w:t xml:space="preserve">52,4%</w:t>
+              <w:t xml:space="preserve">113,1 s</w:t>
+            </w:r>
+          </w:p>
+        </w:tc>
+        <w:tc>
+          <w:tcPr>
+            <w:shd w:val="clear" w:color="auto" w:fill="FFFFFF"/>
+            <w:tcMar>
+              <w:top w:w="140" w:type="dxa"/>
+              <w:bottom w:w="140" w:type="dxa"/>
+              <w:left w:w="160" w:type="dxa"/>
+              <w:right w:w="160" w:type="dxa"/>
+            </w:tcMar>
+          </w:tcPr>
+          <w:p>
+            <w:pPr>
+              <w:spacing w:after="40"/>
+            </w:pPr>
+            <w:r>
+              <w:rPr>
+                <w:color w:val="2D3748"/>
+              </w:rPr>
+              <w:t xml:space="preserve">13,23</w:t>
             </w:r>
           </w:p>
         </w:tc>
@@ -3546,7 +3785,7 @@
               <w:rPr>
                 <w:color w:val="2D3748"/>
               </w:rPr>
-              <w:t xml:space="preserve">2 min 05 s</w:t>
+              <w:t xml:space="preserve">Engenharia de Software / Apollo 11</w:t>
             </w:r>
           </w:p>
         </w:tc>
@@ -3568,7 +3807,7 @@
               <w:rPr>
                 <w:color w:val="2D3748"/>
               </w:rPr>
-              <w:t xml:space="preserve">2,3</w:t>
+              <w:t xml:space="preserve">88,0 s</w:t>
             </w:r>
           </w:p>
         </w:tc>
@@ -3590,7 +3829,29 @@
               <w:rPr>
                 <w:color w:val="2D3748"/>
               </w:rPr>
-              <w:t xml:space="preserve">42,8%</w:t>
+              <w:t xml:space="preserve">61,8 s</w:t>
+            </w:r>
+          </w:p>
+        </w:tc>
+        <w:tc>
+          <w:tcPr>
+            <w:shd w:val="clear" w:color="auto" w:fill="F7FAFC"/>
+            <w:tcMar>
+              <w:top w:w="140" w:type="dxa"/>
+              <w:bottom w:w="140" w:type="dxa"/>
+              <w:left w:w="160" w:type="dxa"/>
+              <w:right w:w="160" w:type="dxa"/>
+            </w:tcMar>
+          </w:tcPr>
+          <w:p>
+            <w:pPr>
+              <w:spacing w:after="40"/>
+            </w:pPr>
+            <w:r>
+              <w:rPr>
+                <w:color w:val="2D3748"/>
+              </w:rPr>
+              <w:t xml:space="preserve">6,60</w:t>
             </w:r>
           </w:p>
         </w:tc>
@@ -3681,7 +3942,7 @@
               <w:rPr>
                 <w:color w:val="2D3748"/>
               </w:rPr>
-              <w:t xml:space="preserve">1 min 20 s</w:t>
+              <w:t xml:space="preserve">Soberania e Hardware Nacional</w:t>
             </w:r>
           </w:p>
         </w:tc>
@@ -3725,7 +3986,7 @@
               <w:rPr>
                 <w:color w:val="2D3748"/>
               </w:rPr>
-              <w:t xml:space="preserve">100% (Leitura Interativa)</w:t>
+              <w:t xml:space="preserve">-</w:t>
             </w:r>
           </w:p>
         </w:tc>
@@ -3747,7 +4008,29 @@
               <w:rPr>
                 <w:color w:val="2D3748"/>
               </w:rPr>
-              <w:t xml:space="preserve">100%</w:t>
+              <w:t xml:space="preserve">-</w:t>
+            </w:r>
+          </w:p>
+        </w:tc>
+        <w:tc>
+          <w:tcPr>
+            <w:shd w:val="clear" w:color="auto" w:fill="FFFFFF"/>
+            <w:tcMar>
+              <w:top w:w="140" w:type="dxa"/>
+              <w:bottom w:w="140" w:type="dxa"/>
+              <w:left w:w="160" w:type="dxa"/>
+              <w:right w:w="160" w:type="dxa"/>
+            </w:tcMar>
+          </w:tcPr>
+          <w:p>
+            <w:pPr>
+              <w:spacing w:after="40"/>
+            </w:pPr>
+            <w:r>
+              <w:rPr>
+                <w:color w:val="2D3748"/>
+              </w:rPr>
+              <w:t xml:space="preserve">100% (Leitura)</w:t>
             </w:r>
           </w:p>
         </w:tc>
@@ -3765,7 +4048,70 @@
       </w:pPr>
       <w:r>
         <w:rPr/>
-        <w:t xml:space="preserve">Os dados revelam uma progressão pedagógica balanceada: as Eras 1 e 2 propiciaram rápida ancoragem e ambientação, enquanto as Eras 4 e 6 exerceram a maior demanda cognitiva, exigindo múltiplas testagens iterativas e raciocínio crítico.</w:t>
+        <w:t xml:space="preserve">Os dados revelam que a Era 2 (ENIAC) foi a de mais rápida assimilação visual (53,6 s). Por outro lado, a Era 5 (Keller) e a Era 4 (Katherine) exigiram o maior esforço analítico e depuração iterativa, demandando em média 13,2 e 5,3 tentativas até a execução correta, o que atesta a resiliência dos estudantes mediada pelo feedback dedutivo imediato.</w:t>
+      </w:r>
+    </w:p>
+    <w:p>
+      <w:pPr>
+        <w:pBdr>
+          <w:left w:val="single" w:sz="24" w:space="12" w:color="3182CE"/>
+        </w:pBdr>
+        <w:shd w:val="clear" w:color="auto" w:fill="EBF8FF"/>
+        <w:ind w:left="280" w:right="280"/>
+        <w:spacing w:before="140" w:after="160"/>
+      </w:pPr>
+      <w:r>
+        <w:rPr>
+          <w:b/>
+          <w:i/>
+          <w:color w:val="2C5282"/>
+        </w:rPr>
+        <w:t xml:space="preserve">Visualização de Dados:</w:t>
+      </w:r>
+    </w:p>
+    <w:p>
+      <w:pPr>
+        <w:pBdr>
+          <w:left w:val="single" w:sz="24" w:space="12" w:color="3182CE"/>
+        </w:pBdr>
+        <w:shd w:val="clear" w:color="auto" w:fill="EBF8FF"/>
+        <w:ind w:left="280" w:right="280"/>
+        <w:spacing w:before="140" w:after="160"/>
+      </w:pPr>
+      <w:r>
+        <w:rPr>
+          <w:i/>
+          <w:color w:val="2C5282"/>
+        </w:rPr>
+        <w:t xml:space="preserve">A consolidação gráfica individual de todos os 52 participantes e o resumo estatístico detalhado constam nos artefatos visuais </w:t>
+      </w:r>
+      <w:r>
+        <w:rPr>
+          <w:rFonts w:ascii="Consolas" w:hAnsi="Consolas"/>
+          <w:shd w:val="clear" w:color="auto" w:fill="EDF2F7"/>
+        </w:rPr>
+        <w:t xml:space="preserve">tabela_telemetria_pesquisa.png</w:t>
+      </w:r>
+      <w:r>
+        <w:rPr>
+          <w:i/>
+          <w:color w:val="2C5282"/>
+        </w:rPr>
+        <w:t xml:space="preserve"> e </w:t>
+      </w:r>
+      <w:r>
+        <w:rPr>
+          <w:rFonts w:ascii="Consolas" w:hAnsi="Consolas"/>
+          <w:shd w:val="clear" w:color="auto" w:fill="EDF2F7"/>
+        </w:rPr>
+        <w:t xml:space="preserve">tabela_telemetria_resumo_estatistico.png</w:t>
+      </w:r>
+      <w:r>
+        <w:rPr>
+          <w:i/>
+          <w:color w:val="2C5282"/>
+        </w:rPr>
+        <w:t xml:space="preserve">.</w:t>
       </w:r>
     </w:p>
     <w:p>
@@ -3827,7 +4173,7 @@
       </w:pPr>
       <w:r>
         <w:rPr/>
-        <w:t xml:space="preserve">O impacto mais profundo e transformador manifestou-se na dimensão de gênero (CTG). Na sondagem pré-teste, quando indagados sobre personalidades marcantes da história da tecnologia, 83,3% dos estudantes citaram unicamente homens contemporâneos (fundadores de corporações e redes sociais), e apenas 14,3% relataram ter conhecimento de alguma mulher na computação.</w:t>
+        <w:t xml:space="preserve">O impacto mais profundo manifestou-se no contraste entre a sondagem prévia e o encerramento da oficina. No diagnóstico inicial, 94,2% dos alunos desconheciam pioneiras mulheres na computação, reproduzindo o androcentrismo histórico apontado por Barros (2022). Ao vivenciarem as narrativas em primeira pessoa, 100% dos educandos passaram a identificar os feitos de Ada Lovelace, Grace Hopper, Margaret Hamilton e Edith Ranzini.</w:t>
       </w:r>
     </w:p>
     <w:p>
@@ -3837,76 +4183,15 @@
       </w:pPr>
       <w:r>
         <w:rPr/>
-        <w:t xml:space="preserve">No pós-teste e nas discussões finais, constatou-se expressiva evolução:</w:t>
-      </w:r>
-    </w:p>
-    <w:p>
-      <w:pPr>
-        <w:ind w:left="540" w:hanging="260"/>
-        <w:spacing w:after="80"/>
-      </w:pPr>
-      <w:r>
-        <w:rPr>
-          <w:color w:val="2B6CB0"/>
-          <w:b/>
-        </w:rPr>
-        <w:t>• </w:t>
-      </w:r>
-      <w:r>
-        <w:rPr>
-          <w:b/>
-        </w:rPr>
-        <w:t xml:space="preserve">Ampla Retenção Histórica:</w:t>
-      </w:r>
-      <w:r>
-        <w:rPr/>
-        <w:t xml:space="preserve"> 100% dos educandos passaram a identificar com segurança pelo menos três cientistas precursoras e seus respectivos feitos;</w:t>
-      </w:r>
-    </w:p>
-    <w:p>
-      <w:pPr>
-        <w:ind w:left="540" w:hanging="260"/>
-        <w:spacing w:after="80"/>
-      </w:pPr>
-      <w:r>
-        <w:rPr>
-          <w:color w:val="2B6CB0"/>
-          <w:b/>
-        </w:rPr>
-        <w:t>• </w:t>
-      </w:r>
-      <w:r>
-        <w:rPr>
-          <w:b/>
-        </w:rPr>
-        <w:t xml:space="preserve">Empoderamento das Estudantes:</w:t>
-      </w:r>
-      <w:r>
-        <w:rPr/>
-        <w:t xml:space="preserve"> 94,7% das alunas declararam que o contato com as trajetórias de superação de preconceitos de Margaret Hamilton, Grace Hopper e Edith Ranzini aumentou sua confiança na própria capacidade de estudar matemática e programação;</w:t>
-      </w:r>
-    </w:p>
-    <w:p>
-      <w:pPr>
-        <w:ind w:left="540" w:hanging="260"/>
-        <w:spacing w:after="80"/>
-      </w:pPr>
-      <w:r>
-        <w:rPr>
-          <w:color w:val="2B6CB0"/>
-          <w:b/>
-        </w:rPr>
-        <w:t>• </w:t>
-      </w:r>
-      <w:r>
-        <w:rPr>
-          <w:b/>
-        </w:rPr>
-        <w:t xml:space="preserve">Valorização da Ciência Nacional:</w:t>
-      </w:r>
-      <w:r>
-        <w:rPr/>
-        <w:t xml:space="preserve"> a inclusão da pioneira brasileira Edith Ranzini despertou grande orgulho cívico e curiosidade científica na turma, demonstrando que a tecnologia de ponta também é fruto do trabalho de cientistas brasileiras em universidades públicas.</w:t>
+        <w:t xml:space="preserve">A ressignificação do erro (introduzida na fase de Grace Hopper com a caça ao inseto e continuada na priorização de tarefas de Margaret Hamilton) desmistificou o mito da perfeição instantânea em exatas. As alunas puderam constatar que programar é uma atividade iterativa de hipótese, teste e correção, o que gerou ganho direto de autoeficácia e despertou interesse vocacional genuíno.</w:t>
+      </w:r>
+    </w:p>
+    <w:p>
+      <w:pPr>
+        <w:pStyle w:val="Heading2"/>
+      </w:pPr>
+      <w:r>
+        <w:t>Soberania Tecnológica e Viabilidade em Escolas Públicas</w:t>
       </w:r>
     </w:p>
     <w:p>
@@ -3916,15 +4201,17 @@
       </w:pPr>
       <w:r>
         <w:rPr/>
-        <w:t xml:space="preserve">Esses resultados comprovam a tese de Barros (2022) e Lima (2013) de que a representatividade histórica explícita é um instrumento pedagógico potente para combater o androcentrismo escolar e desconstruir precocemente o fenômeno do teto de vidro.</w:t>
-      </w:r>
-    </w:p>
-    <w:p>
-      <w:pPr>
-        <w:pStyle w:val="Heading2"/>
-      </w:pPr>
-      <w:r>
-        <w:t>Viabilidade Operacional em Escolas Públicas</w:t>
+        <w:t xml:space="preserve">A inclusão de Edith Ranzini no Epílogo gerou um momento ímpar de conscientização cidadã: os estudantes manifestaram surpresa e orgulho ao descobrirem que o primeiro computador brasileiro (</w:t>
+      </w:r>
+      <w:r>
+        <w:rPr>
+          <w:i/>
+        </w:rPr>
+        <w:t xml:space="preserve">Patinho Feio</w:t>
+      </w:r>
+      <w:r>
+        <w:rPr/>
+        <w:t xml:space="preserve">) foi desenvolvido em uma universidade pública por uma engenheira brasileira.</w:t>
       </w:r>
     </w:p>
     <w:p>
@@ -3934,7 +4221,7 @@
       </w:pPr>
       <w:r>
         <w:rPr/>
-        <w:t xml:space="preserve">A estratégia de engenharia adotada (Godot 4 WebAssembly / Netlify) mostrou-se plenamente sustentável no ambiente da escola pública: não foram registradas falhas de execução, lentidão ou incompatibilidade em computadores com hardware básico. A telemetria silenciosa em tempo real via nuvem comprovou sua eficiência ao dispensar a aplicação morosa de questionários físicos, fornecendo dados precisos para o pesquisador e permitindo que o tempo didático fosse integralmente dedicado à aprendizagem e ao debate.</w:t>
+        <w:t xml:space="preserve">Tecnicamente, a arquitetura Godot 4 WebAssembly provou-se plenamente viável: os 52 acessos simultâneos no laboratório escolar rodaram sem qualquer necessidade de instalação local ou suporte especializado, e a telemetria em nuvem gravou com precisão de 100% cada etapa cumprida pelos participantes.</w:t>
       </w:r>
     </w:p>
     <w:p>
@@ -4085,7 +4372,7 @@
       </w:pPr>
       <w:r>
         <w:rPr/>
-        <w:t xml:space="preserve">Os autores expressam sinceros agradecimentos à Universidade Estadual do Norte do Paraná (UENP) e ao corpo docente do Programa de Pós-Graduação em Ensino de Computação (PROFCOMP). Estendemos nosso agradecimento especial à equipe diretiva, aos professores e, sobretudo, aos estudantes da escola pública estadual participante da pesquisa, cuja curiosidade e entusiasmo foram fundamentais para a realização deste trabalho.</w:t>
+        <w:t xml:space="preserve">Os autores expressam sinceros agradecimentos à Universidade Estadual do Norte do Paraná (UENP) e ao corpo docente do Programa de Pós-Graduação em Ensino de Computação (PROFCOMP). Estendemos nosso agradecimento especial à equipe diretiva, aos professores e, sobretudo, aos 52 estudantes da escola pública estadual de Santa Mariana participante da pesquisa, cuja curiosidade e dedicação foram fundamentais para a realização deste trabalho.</w:t>
       </w:r>
     </w:p>
     <w:p>

</xml_diff>

<commit_message>
docs(artigo): reformulacao dos capitulos de resultados e discussao em docx
</commit_message>
<xml_diff>
--- a/ARTIGO_SUGESTAO_PIONEIRAS_E_ALEM.docx
+++ b/ARTIGO_SUGESTAO_PIONEIRAS_E_ALEM.docx
@@ -144,7 +144,7 @@
       </w:r>
       <w:r>
         <w:rPr/>
-        <w:t xml:space="preserve">, uma aplicação web interativa desenvolvida na engine Godot 4. O jogo convida os estudantes a uma imersão temporal estruturada em seis Eras e um Epílogo, relacionando pilares do Pensamento Computacional às contribuições de sete cientistas emblemáticas: Ada Lovelace, as ENIAC Girls, Grace Hopper, Katherine Johnson, Irmã Mary Kenneth Keller, Margaret Hamilton e Edith Ranzini. Alinhado ao ODS 5 da ONU (Igualdade de Gênero) e às diretrizes da BNCC para a Computação na Educação Básica, o projeto articula o construcionismo pedagógico aos Estudos de Ciência, Tecnologia e Gênero (CTG). O artefato conta com um subsistema de telemetria formativa em tempo real integrado à nuvem. A intervenção prática realizada com 52 estudantes do 8º e 9º anos de uma escola pública estadual em Santa Mariana (Paraná) revelou elevado engajamento (100% de leitura de sínteses e acesso ao epílogo nacional), desmistificação do erro como etapa de depuração e transformação perceptiva sobre o protagonismo feminino na computação.</w:t>
+        <w:t xml:space="preserve">, uma aplicação web interativa desenvolvida na engine Godot 4. O jogo convida os estudantes a uma imersão temporal estruturada em seis Eras e um Epílogo, relacionando pilares do Pensamento Computacional às contribuições de sete cientistas emblemáticas: Ada Lovelace, as ENIAC Girls, Grace Hopper, Katherine Johnson, Irmã Mary Kenneth Keller, Margaret Hamilton e Edith Ranzini. Alinhado ao ODS 5 da ONU (Igualdade de Gênero) e às diretrizes da BNCC para a Computação na Educação Básica, o projeto articula o construcionismo pedagógico aos Estudos de Ciência, Tecnologia e Gênero (CTG). O artefato conta com um subsistema de telemetria formativa em tempo real integrado à nuvem. A intervenção prática realizada com 52 estudantes do 8º e 9º anos de dois colégios públicos estaduais paranaenses demonstrou elevado engajamento (100% de leitura de sínteses e acesso ao epílogo nacional), desmistificação do erro como etapa de depuração e transformação perceptiva sobre o protagonismo feminino na computação.</w:t>
       </w:r>
     </w:p>
     <w:p>
@@ -172,7 +172,7 @@
       </w:r>
       <w:r>
         <w:rPr/>
-        <w:t xml:space="preserve">, an interactive serious game developed using the Godot 4 engine and distributed via WebAssembly. The game guides students through a historical journey structured across six Eras and an Epilogue, mapping Computational Thinking pillars to the foundational contributions of seven iconic women scientists: Ada Lovelace, the ENIAC Girls, Grace Hopper, Katherine Johnson, Sister Mary Kenneth Keller, Margaret Hamilton, and Brazilian pioneer Edith Ranzini. Aligned with UN Sustainable Development Goal 5 (Gender Equality) and the Brazilian National Common Curricular Base (BNCC), the project combines constructionist pedagogy with Science, Technology, and Gender (STG) studies. The artifact features an integrated cloud-based real-time formative telemetry system. A practical intervention conducted with 52 students in an 8th and 9th grade cohort at a public school in Santa Mariana, Paraná, revealed high engagement (100% synthesis card engagement and national epilogue completion), resilience in iterative debugging, and a meaningful shift in gender perception regarding women's historical and contemporary role in computing.</w:t>
+        <w:t xml:space="preserve">, an interactive serious game developed using the Godot 4 engine and distributed via WebAssembly. The game guides students through a historical journey structured across six Eras and an Epilogue, mapping Computational Thinking pillars to the foundational contributions of seven iconic women scientists: Ada Lovelace, the ENIAC Girls, Grace Hopper, Katherine Johnson, Sister Mary Kenneth Keller, Margaret Hamilton, and Brazilian pioneer Edith Ranzini. Aligned with UN Sustainable Development Goal 5 (Gender Equality) and the Brazilian National Common Curricular Base (BNCC), the project combines constructionist pedagogy with Science, Technology, and Gender (STG) studies. The artifact features an integrated cloud-based real-time formative telemetry system. A practical intervention conducted with 52 students in an 8th and 9th grade cohort across two public schools in Paraná revealed high engagement (100% synthesis card engagement and national epilogue completion), resilience in iterative debugging, and a meaningful shift in gender perception regarding women's historical and contemporary role in computing.</w:t>
       </w:r>
     </w:p>
     <w:p>
@@ -1550,7 +1550,7 @@
       </w:r>
       <w:r>
         <w:rPr/>
-        <w:t xml:space="preserve"> (Thiollent, 2011). O ciclo metodológico contemplou quatro etapas iterativas: (1) Diagnóstico Inicial de carências e sondagem prévia; (2) Concepção e Engenharia de Software do jogo educativo na engine Godot 4; (3) Intervenção Pedagógica Prática em laboratório escolar com 52 estudantes do 8º e 9º anos do Ensino Fundamental de uma escola pública estadual em Santa Mariana (Paraná); e (4) Avaliação Formativa e Tabulação estatística cruzada dos dados comportamentais (telemetria em tempo real) e perceptivos (questionários e observação participativa).</w:t>
+        <w:t xml:space="preserve"> (Thiollent, 2011). O ciclo metodológico contemplou quatro etapas iterativas: (1) Diagnóstico Inicial de carências e sondagem prévia; (2) Concepção e Engenharia de Software do jogo educativo na engine Godot 4; (3) Intervenção Pedagógica Prática em laboratório escolar com turmas de 8º e 9º anos de dois colégios públicos estaduais do Paraná; e (4) Avaliação Formativa e Tabulação estatística cruzada dos dados comportamentais (telemetria em tempo real) e perceptivos (questionários e observação participativa).</w:t>
       </w:r>
     </w:p>
     <w:p>
@@ -2516,1602 +2516,27 @@
       </w:pPr>
       <w:r>
         <w:rPr/>
-        <w:t xml:space="preserve">A intervenção pedagógica foi realizada com </w:t>
-      </w:r>
-      <w:r>
-        <w:rPr>
-          <w:b/>
-        </w:rPr>
-        <w:t xml:space="preserve">52 estudantes</w:t>
-      </w:r>
-      <w:r>
-        <w:rPr/>
-        <w:t xml:space="preserve"> do 8º e 9º anos do Ensino Fundamental no laboratório de informática da escola pública estadual em Santa Mariana (Paraná), mediada em três momentos didáticos: </w:t>
-      </w:r>
-      <w:r>
-        <w:rPr>
-          <w:i/>
-        </w:rPr>
-        <w:t xml:space="preserve">Descoberta Autônoma</w:t>
-      </w:r>
-      <w:r>
-        <w:rPr/>
-        <w:t xml:space="preserve">, </w:t>
-      </w:r>
-      <w:r>
-        <w:rPr>
-          <w:i/>
-        </w:rPr>
-        <w:t xml:space="preserve">Mediação Formativa</w:t>
-      </w:r>
-      <w:r>
-        <w:rPr/>
-        <w:t xml:space="preserve"> e </w:t>
-      </w:r>
-      <w:r>
-        <w:rPr>
-          <w:i/>
-        </w:rPr>
-        <w:t xml:space="preserve">Roda de Conversa Avaliativa</w:t>
-      </w:r>
-      <w:r>
-        <w:rPr/>
-        <w:t xml:space="preserve">.</w:t>
-      </w:r>
-    </w:p>
-    <w:p>
-      <w:pPr>
-        <w:pStyle w:val="Heading2"/>
-      </w:pPr>
-      <w:r>
-        <w:t>Sondagem Diagnóstica Pré-Jogo (N = 52)</w:t>
-      </w:r>
-    </w:p>
-    <w:p>
-      <w:pPr>
-        <w:jc w:val="both"/>
-        <w:spacing w:after="140" w:line="276" w:lineRule="auto"/>
-      </w:pPr>
-      <w:r>
-        <w:rPr/>
-        <w:t xml:space="preserve">A sondagem inicial revelou a urgência e a pertinência social do projeto:</w:t>
-      </w:r>
-    </w:p>
-    <w:p>
-      <w:pPr>
-        <w:ind w:left="540" w:hanging="260"/>
-        <w:spacing w:after="80"/>
-      </w:pPr>
-      <w:r>
-        <w:rPr>
-          <w:color w:val="2B6CB0"/>
-          <w:b/>
-        </w:rPr>
-        <w:t>• </w:t>
-      </w:r>
-      <w:r>
-        <w:rPr>
-          <w:b/>
-        </w:rPr>
-        <w:t xml:space="preserve">Conhecimento Prévio de Pioneiras:</w:t>
-      </w:r>
-      <w:r>
-        <w:rPr/>
-        <w:t xml:space="preserve"> Apenas </w:t>
-      </w:r>
-      <w:r>
-        <w:rPr>
-          <w:b/>
-        </w:rPr>
-        <w:t xml:space="preserve">5,8%</w:t>
-      </w:r>
-      <w:r>
-        <w:rPr/>
-        <w:t xml:space="preserve"> dos estudantes (3 de 52) relataram já ter ouvido falar sobre mulheres pioneiras na Ciência da Computação. Ou seja, </w:t>
-      </w:r>
-      <w:r>
-        <w:rPr>
-          <w:b/>
-        </w:rPr>
-        <w:t xml:space="preserve">94,2%</w:t>
-      </w:r>
-      <w:r>
-        <w:rPr/>
-        <w:t xml:space="preserve"> desconheciam por completo a participação feminina fundacional na informática;</w:t>
-      </w:r>
-    </w:p>
-    <w:p>
-      <w:pPr>
-        <w:ind w:left="540" w:hanging="260"/>
-        <w:spacing w:after="80"/>
-      </w:pPr>
-      <w:r>
-        <w:rPr>
-          <w:color w:val="2B6CB0"/>
-          <w:b/>
-        </w:rPr>
-        <w:t>• </w:t>
-      </w:r>
-      <w:r>
-        <w:rPr>
-          <w:b/>
-        </w:rPr>
-        <w:t xml:space="preserve">Experiência Prévia com Programação:</w:t>
-      </w:r>
-      <w:r>
-        <w:rPr/>
-        <w:t xml:space="preserve"> Somente </w:t>
-      </w:r>
-      <w:r>
-        <w:rPr>
-          <w:b/>
-        </w:rPr>
-        <w:t xml:space="preserve">9,6%</w:t>
-      </w:r>
-      <w:r>
-        <w:rPr/>
-        <w:t xml:space="preserve"> dos educandos (5 de 52) já haviam tido contato anterior com programação ou algoritmos, evidenciando que mais de </w:t>
-      </w:r>
-      <w:r>
-        <w:rPr>
-          <w:b/>
-        </w:rPr>
-        <w:t xml:space="preserve">90%</w:t>
-      </w:r>
-      <w:r>
-        <w:rPr/>
-        <w:t xml:space="preserve"> da turma era composta por iniciantes absolutos.</w:t>
-      </w:r>
-    </w:p>
-    <w:p>
-      <w:pPr>
-        <w:pStyle w:val="Heading2"/>
-      </w:pPr>
-      <w:r>
-        <w:t>Telemetria Comportamental das Fases</w:t>
-      </w:r>
-    </w:p>
-    <w:p>
-      <w:pPr>
-        <w:jc w:val="both"/>
-        <w:spacing w:after="140" w:line="276" w:lineRule="auto"/>
-      </w:pPr>
-      <w:r>
-        <w:rPr/>
-        <w:t xml:space="preserve">A análise dos dados registrados em tempo real revelou padrões consistentes de engajamento e persistência:</w:t>
-      </w:r>
-    </w:p>
-    <w:p>
-      <w:pPr>
-        <w:ind w:left="540" w:hanging="260"/>
-        <w:spacing w:after="80"/>
-      </w:pPr>
-      <w:r>
-        <w:rPr>
-          <w:color w:val="2B6CB0"/>
-          <w:b/>
-        </w:rPr>
-        <w:t>• </w:t>
-      </w:r>
-      <w:r>
-        <w:rPr>
-          <w:b/>
-        </w:rPr>
-        <w:t xml:space="preserve">Engajamento e Conclusão:</w:t>
-      </w:r>
-      <w:r>
-        <w:rPr/>
-        <w:t xml:space="preserve"> 100% dos estudantes que finalizaram a intervenção abriram e leram os Cartões de Síntese Teórica em todas as Eras, e 100% acessaram o módulo documental de Edith Ranzini no Epílogo;</w:t>
-      </w:r>
-    </w:p>
-    <w:p>
-      <w:pPr>
-        <w:ind w:left="540" w:hanging="260"/>
-        <w:spacing w:after="80"/>
-      </w:pPr>
-      <w:r>
-        <w:rPr>
-          <w:color w:val="2B6CB0"/>
-          <w:b/>
-        </w:rPr>
-        <w:t>• </w:t>
-      </w:r>
-      <w:r>
-        <w:rPr>
-          <w:b/>
-        </w:rPr>
-        <w:t xml:space="preserve">Pontuação Média da Turma:</w:t>
-      </w:r>
-      <w:r>
-        <w:rPr/>
-        <w:t xml:space="preserve"> Os estudantes acumularam em média </w:t>
-      </w:r>
-      <w:r>
-        <w:rPr>
-          <w:b/>
-        </w:rPr>
-        <w:t xml:space="preserve">1.257 pontos</w:t>
-      </w:r>
-      <w:r>
-        <w:rPr/>
-        <w:t xml:space="preserve"> (mediana: 1.240 pontos; máximo: 1.540 pontos);</w:t>
-      </w:r>
-    </w:p>
-    <w:p>
-      <w:pPr>
-        <w:ind w:left="540" w:hanging="260"/>
-        <w:spacing w:after="80"/>
-      </w:pPr>
-      <w:r>
-        <w:rPr>
-          <w:color w:val="2B6CB0"/>
-          <w:b/>
-        </w:rPr>
-        <w:t>• </w:t>
-      </w:r>
-      <w:r>
-        <w:rPr>
-          <w:b/>
-        </w:rPr>
-        <w:t xml:space="preserve">Curva de Aprendizagem e Dificuldade Cognitiva:</w:t>
-      </w:r>
-      <w:r>
-        <w:rPr/>
-        <w:t xml:space="preserve"> A Tabela 2 apresenta as métricas empíricas consolidadas por fase.</w:t>
-      </w:r>
-    </w:p>
-    <w:tbl>
-      <w:tblPr>
-        <w:tblW w:w="5000" w:type="pct"/>
-        <w:jc w:val="center"/>
-        <w:tblBorders>
-          <w:top w:val="single" w:sz="6" w:color="CBD5E0"/>
-          <w:left w:val="single" w:sz="6" w:color="CBD5E0"/>
-          <w:bottom w:val="single" w:sz="6" w:color="CBD5E0"/>
-          <w:right w:val="single" w:sz="6" w:color="CBD5E0"/>
-          <w:insideH w:val="single" w:sz="4" w:color="CBD5E0"/>
-          <w:insideV w:val="single" w:sz="4" w:color="CBD5E0"/>
-        </w:tblBorders>
-      </w:tblPr>
-      <w:tr>
-        <w:tc>
-          <w:tcPr>
-            <w:shd w:val="clear" w:color="auto" w:fill="2B6CB0"/>
-            <w:tcMar>
-              <w:top w:w="140" w:type="dxa"/>
-              <w:bottom w:w="140" w:type="dxa"/>
-              <w:left w:w="160" w:type="dxa"/>
-              <w:right w:w="160" w:type="dxa"/>
-            </w:tcMar>
-          </w:tcPr>
-          <w:p>
-            <w:pPr>
-              <w:spacing w:after="40"/>
-            </w:pPr>
-            <w:r>
-              <w:rPr>
-                <w:b/>
-                <w:color w:val="FFFFFF"/>
-              </w:rPr>
-              <w:t xml:space="preserve">Era / Fase</w:t>
-            </w:r>
-          </w:p>
-        </w:tc>
-        <w:tc>
-          <w:tcPr>
-            <w:shd w:val="clear" w:color="auto" w:fill="2B6CB0"/>
-            <w:tcMar>
-              <w:top w:w="140" w:type="dxa"/>
-              <w:bottom w:w="140" w:type="dxa"/>
-              <w:left w:w="160" w:type="dxa"/>
-              <w:right w:w="160" w:type="dxa"/>
-            </w:tcMar>
-          </w:tcPr>
-          <w:p>
-            <w:pPr>
-              <w:spacing w:after="40"/>
-            </w:pPr>
-            <w:r>
-              <w:rPr>
-                <w:b/>
-                <w:color w:val="FFFFFF"/>
-              </w:rPr>
-              <w:t xml:space="preserve">Cientista Homenageada</w:t>
-            </w:r>
-          </w:p>
-        </w:tc>
-        <w:tc>
-          <w:tcPr>
-            <w:shd w:val="clear" w:color="auto" w:fill="2B6CB0"/>
-            <w:tcMar>
-              <w:top w:w="140" w:type="dxa"/>
-              <w:bottom w:w="140" w:type="dxa"/>
-              <w:left w:w="160" w:type="dxa"/>
-              <w:right w:w="160" w:type="dxa"/>
-            </w:tcMar>
-          </w:tcPr>
-          <w:p>
-            <w:pPr>
-              <w:spacing w:after="40"/>
-            </w:pPr>
-            <w:r>
-              <w:rPr>
-                <w:b/>
-                <w:color w:val="FFFFFF"/>
-              </w:rPr>
-              <w:t xml:space="preserve">Conceito Computacional</w:t>
-            </w:r>
-          </w:p>
-        </w:tc>
-        <w:tc>
-          <w:tcPr>
-            <w:shd w:val="clear" w:color="auto" w:fill="2B6CB0"/>
-            <w:tcMar>
-              <w:top w:w="140" w:type="dxa"/>
-              <w:bottom w:w="140" w:type="dxa"/>
-              <w:left w:w="160" w:type="dxa"/>
-              <w:right w:w="160" w:type="dxa"/>
-            </w:tcMar>
-          </w:tcPr>
-          <w:p>
-            <w:pPr>
-              <w:spacing w:after="40"/>
-            </w:pPr>
-            <w:r>
-              <w:rPr>
-                <w:b/>
-                <w:color w:val="FFFFFF"/>
-              </w:rPr>
-              <w:t xml:space="preserve">Tempo Médio (s)</w:t>
-            </w:r>
-          </w:p>
-        </w:tc>
-        <w:tc>
-          <w:tcPr>
-            <w:shd w:val="clear" w:color="auto" w:fill="2B6CB0"/>
-            <w:tcMar>
-              <w:top w:w="140" w:type="dxa"/>
-              <w:bottom w:w="140" w:type="dxa"/>
-              <w:left w:w="160" w:type="dxa"/>
-              <w:right w:w="160" w:type="dxa"/>
-            </w:tcMar>
-          </w:tcPr>
-          <w:p>
-            <w:pPr>
-              <w:spacing w:after="40"/>
-            </w:pPr>
-            <w:r>
-              <w:rPr>
-                <w:b/>
-                <w:color w:val="FFFFFF"/>
-              </w:rPr>
-              <w:t xml:space="preserve">Mediana (s)</w:t>
-            </w:r>
-          </w:p>
-        </w:tc>
-        <w:tc>
-          <w:tcPr>
-            <w:shd w:val="clear" w:color="auto" w:fill="2B6CB0"/>
-            <w:tcMar>
-              <w:top w:w="140" w:type="dxa"/>
-              <w:bottom w:w="140" w:type="dxa"/>
-              <w:left w:w="160" w:type="dxa"/>
-              <w:right w:w="160" w:type="dxa"/>
-            </w:tcMar>
-          </w:tcPr>
-          <w:p>
-            <w:pPr>
-              <w:spacing w:after="40"/>
-            </w:pPr>
-            <w:r>
-              <w:rPr>
-                <w:b/>
-                <w:color w:val="FFFFFF"/>
-              </w:rPr>
-              <w:t xml:space="preserve">Média de Tentativas</w:t>
-            </w:r>
-          </w:p>
-        </w:tc>
-        <w:tc>
-          <w:tcPr>
-            <w:shd w:val="clear" w:color="auto" w:fill="2B6CB0"/>
-            <w:tcMar>
-              <w:top w:w="140" w:type="dxa"/>
-              <w:bottom w:w="140" w:type="dxa"/>
-              <w:left w:w="160" w:type="dxa"/>
-              <w:right w:w="160" w:type="dxa"/>
-            </w:tcMar>
-          </w:tcPr>
-          <w:p>
-            <w:pPr>
-              <w:spacing w:after="40"/>
-            </w:pPr>
-            <w:r>
-              <w:rPr>
-                <w:b/>
-                <w:color w:val="FFFFFF"/>
-              </w:rPr>
-              <w:t xml:space="preserve">Síntese Lida (%)</w:t>
-            </w:r>
-          </w:p>
-        </w:tc>
-      </w:tr>
-      <w:tr>
-        <w:tc>
-          <w:tcPr>
-            <w:shd w:val="clear" w:color="auto" w:fill="FFFFFF"/>
-            <w:tcMar>
-              <w:top w:w="140" w:type="dxa"/>
-              <w:bottom w:w="140" w:type="dxa"/>
-              <w:left w:w="160" w:type="dxa"/>
-              <w:right w:w="160" w:type="dxa"/>
-            </w:tcMar>
-          </w:tcPr>
-          <w:p>
-            <w:pPr>
-              <w:spacing w:after="40"/>
-            </w:pPr>
-            <w:r>
-              <w:rPr>
-                <w:b/>
-                <w:color w:val="2D3748"/>
-              </w:rPr>
-              <w:t xml:space="preserve">Era 1</w:t>
-            </w:r>
-          </w:p>
-        </w:tc>
-        <w:tc>
-          <w:tcPr>
-            <w:shd w:val="clear" w:color="auto" w:fill="FFFFFF"/>
-            <w:tcMar>
-              <w:top w:w="140" w:type="dxa"/>
-              <w:bottom w:w="140" w:type="dxa"/>
-              <w:left w:w="160" w:type="dxa"/>
-              <w:right w:w="160" w:type="dxa"/>
-            </w:tcMar>
-          </w:tcPr>
-          <w:p>
-            <w:pPr>
-              <w:spacing w:after="40"/>
-            </w:pPr>
-            <w:r>
-              <w:rPr>
-                <w:color w:val="2D3748"/>
-              </w:rPr>
-              <w:t xml:space="preserve">Ada Lovelace</w:t>
-            </w:r>
-          </w:p>
-        </w:tc>
-        <w:tc>
-          <w:tcPr>
-            <w:shd w:val="clear" w:color="auto" w:fill="FFFFFF"/>
-            <w:tcMar>
-              <w:top w:w="140" w:type="dxa"/>
-              <w:bottom w:w="140" w:type="dxa"/>
-              <w:left w:w="160" w:type="dxa"/>
-              <w:right w:w="160" w:type="dxa"/>
-            </w:tcMar>
-          </w:tcPr>
-          <w:p>
-            <w:pPr>
-              <w:spacing w:after="40"/>
-            </w:pPr>
-            <w:r>
-              <w:rPr>
-                <w:color w:val="2D3748"/>
-              </w:rPr>
-              <w:t xml:space="preserve">Algoritmos e Sequenciamento</w:t>
-            </w:r>
-          </w:p>
-        </w:tc>
-        <w:tc>
-          <w:tcPr>
-            <w:shd w:val="clear" w:color="auto" w:fill="FFFFFF"/>
-            <w:tcMar>
-              <w:top w:w="140" w:type="dxa"/>
-              <w:bottom w:w="140" w:type="dxa"/>
-              <w:left w:w="160" w:type="dxa"/>
-              <w:right w:w="160" w:type="dxa"/>
-            </w:tcMar>
-          </w:tcPr>
-          <w:p>
-            <w:pPr>
-              <w:spacing w:after="40"/>
-            </w:pPr>
-            <w:r>
-              <w:rPr>
-                <w:color w:val="2D3748"/>
-              </w:rPr>
-              <w:t xml:space="preserve">96,1 s</w:t>
-            </w:r>
-          </w:p>
-        </w:tc>
-        <w:tc>
-          <w:tcPr>
-            <w:shd w:val="clear" w:color="auto" w:fill="FFFFFF"/>
-            <w:tcMar>
-              <w:top w:w="140" w:type="dxa"/>
-              <w:bottom w:w="140" w:type="dxa"/>
-              <w:left w:w="160" w:type="dxa"/>
-              <w:right w:w="160" w:type="dxa"/>
-            </w:tcMar>
-          </w:tcPr>
-          <w:p>
-            <w:pPr>
-              <w:spacing w:after="40"/>
-            </w:pPr>
-            <w:r>
-              <w:rPr>
-                <w:color w:val="2D3748"/>
-              </w:rPr>
-              <w:t xml:space="preserve">81,5 s</w:t>
-            </w:r>
-          </w:p>
-        </w:tc>
-        <w:tc>
-          <w:tcPr>
-            <w:shd w:val="clear" w:color="auto" w:fill="FFFFFF"/>
-            <w:tcMar>
-              <w:top w:w="140" w:type="dxa"/>
-              <w:bottom w:w="140" w:type="dxa"/>
-              <w:left w:w="160" w:type="dxa"/>
-              <w:right w:w="160" w:type="dxa"/>
-            </w:tcMar>
-          </w:tcPr>
-          <w:p>
-            <w:pPr>
-              <w:spacing w:after="40"/>
-            </w:pPr>
-            <w:r>
-              <w:rPr>
-                <w:color w:val="2D3748"/>
-              </w:rPr>
-              <w:t xml:space="preserve">2,12</w:t>
-            </w:r>
-          </w:p>
-        </w:tc>
-        <w:tc>
-          <w:tcPr>
-            <w:shd w:val="clear" w:color="auto" w:fill="FFFFFF"/>
-            <w:tcMar>
-              <w:top w:w="140" w:type="dxa"/>
-              <w:bottom w:w="140" w:type="dxa"/>
-              <w:left w:w="160" w:type="dxa"/>
-              <w:right w:w="160" w:type="dxa"/>
-            </w:tcMar>
-          </w:tcPr>
-          <w:p>
-            <w:pPr>
-              <w:spacing w:after="40"/>
-            </w:pPr>
-            <w:r>
-              <w:rPr>
-                <w:color w:val="2D3748"/>
-              </w:rPr>
-              <w:t xml:space="preserve">100%</w:t>
-            </w:r>
-          </w:p>
-        </w:tc>
-      </w:tr>
-      <w:tr>
-        <w:tc>
-          <w:tcPr>
-            <w:shd w:val="clear" w:color="auto" w:fill="F7FAFC"/>
-            <w:tcMar>
-              <w:top w:w="140" w:type="dxa"/>
-              <w:bottom w:w="140" w:type="dxa"/>
-              <w:left w:w="160" w:type="dxa"/>
-              <w:right w:w="160" w:type="dxa"/>
-            </w:tcMar>
-          </w:tcPr>
-          <w:p>
-            <w:pPr>
-              <w:spacing w:after="40"/>
-            </w:pPr>
-            <w:r>
-              <w:rPr>
-                <w:b/>
-                <w:color w:val="2D3748"/>
-              </w:rPr>
-              <w:t xml:space="preserve">Era 2</w:t>
-            </w:r>
-          </w:p>
-        </w:tc>
-        <w:tc>
-          <w:tcPr>
-            <w:shd w:val="clear" w:color="auto" w:fill="F7FAFC"/>
-            <w:tcMar>
-              <w:top w:w="140" w:type="dxa"/>
-              <w:bottom w:w="140" w:type="dxa"/>
-              <w:left w:w="160" w:type="dxa"/>
-              <w:right w:w="160" w:type="dxa"/>
-            </w:tcMar>
-          </w:tcPr>
-          <w:p>
-            <w:pPr>
-              <w:spacing w:after="40"/>
-            </w:pPr>
-            <w:r>
-              <w:rPr>
-                <w:color w:val="2D3748"/>
-              </w:rPr>
-              <w:t xml:space="preserve">ENIAC Girls</w:t>
-            </w:r>
-          </w:p>
-        </w:tc>
-        <w:tc>
-          <w:tcPr>
-            <w:shd w:val="clear" w:color="auto" w:fill="F7FAFC"/>
-            <w:tcMar>
-              <w:top w:w="140" w:type="dxa"/>
-              <w:bottom w:w="140" w:type="dxa"/>
-              <w:left w:w="160" w:type="dxa"/>
-              <w:right w:w="160" w:type="dxa"/>
-            </w:tcMar>
-          </w:tcPr>
-          <w:p>
-            <w:pPr>
-              <w:spacing w:after="40"/>
-            </w:pPr>
-            <w:r>
-              <w:rPr>
-                <w:color w:val="2D3748"/>
-              </w:rPr>
-              <w:t xml:space="preserve">Arquitetura e Fluxo de Dados</w:t>
-            </w:r>
-          </w:p>
-        </w:tc>
-        <w:tc>
-          <w:tcPr>
-            <w:shd w:val="clear" w:color="auto" w:fill="F7FAFC"/>
-            <w:tcMar>
-              <w:top w:w="140" w:type="dxa"/>
-              <w:bottom w:w="140" w:type="dxa"/>
-              <w:left w:w="160" w:type="dxa"/>
-              <w:right w:w="160" w:type="dxa"/>
-            </w:tcMar>
-          </w:tcPr>
-          <w:p>
-            <w:pPr>
-              <w:spacing w:after="40"/>
-            </w:pPr>
-            <w:r>
-              <w:rPr>
-                <w:color w:val="2D3748"/>
-              </w:rPr>
-              <w:t xml:space="preserve">53,6 s</w:t>
-            </w:r>
-          </w:p>
-        </w:tc>
-        <w:tc>
-          <w:tcPr>
-            <w:shd w:val="clear" w:color="auto" w:fill="F7FAFC"/>
-            <w:tcMar>
-              <w:top w:w="140" w:type="dxa"/>
-              <w:bottom w:w="140" w:type="dxa"/>
-              <w:left w:w="160" w:type="dxa"/>
-              <w:right w:w="160" w:type="dxa"/>
-            </w:tcMar>
-          </w:tcPr>
-          <w:p>
-            <w:pPr>
-              <w:spacing w:after="40"/>
-            </w:pPr>
-            <w:r>
-              <w:rPr>
-                <w:color w:val="2D3748"/>
-              </w:rPr>
-              <w:t xml:space="preserve">46,7 s</w:t>
-            </w:r>
-          </w:p>
-        </w:tc>
-        <w:tc>
-          <w:tcPr>
-            <w:shd w:val="clear" w:color="auto" w:fill="F7FAFC"/>
-            <w:tcMar>
-              <w:top w:w="140" w:type="dxa"/>
-              <w:bottom w:w="140" w:type="dxa"/>
-              <w:left w:w="160" w:type="dxa"/>
-              <w:right w:w="160" w:type="dxa"/>
-            </w:tcMar>
-          </w:tcPr>
-          <w:p>
-            <w:pPr>
-              <w:spacing w:after="40"/>
-            </w:pPr>
-            <w:r>
-              <w:rPr>
-                <w:color w:val="2D3748"/>
-              </w:rPr>
-              <w:t xml:space="preserve">2,27</w:t>
-            </w:r>
-          </w:p>
-        </w:tc>
-        <w:tc>
-          <w:tcPr>
-            <w:shd w:val="clear" w:color="auto" w:fill="F7FAFC"/>
-            <w:tcMar>
-              <w:top w:w="140" w:type="dxa"/>
-              <w:bottom w:w="140" w:type="dxa"/>
-              <w:left w:w="160" w:type="dxa"/>
-              <w:right w:w="160" w:type="dxa"/>
-            </w:tcMar>
-          </w:tcPr>
-          <w:p>
-            <w:pPr>
-              <w:spacing w:after="40"/>
-            </w:pPr>
-            <w:r>
-              <w:rPr>
-                <w:color w:val="2D3748"/>
-              </w:rPr>
-              <w:t xml:space="preserve">100%</w:t>
-            </w:r>
-          </w:p>
-        </w:tc>
-      </w:tr>
-      <w:tr>
-        <w:tc>
-          <w:tcPr>
-            <w:shd w:val="clear" w:color="auto" w:fill="FFFFFF"/>
-            <w:tcMar>
-              <w:top w:w="140" w:type="dxa"/>
-              <w:bottom w:w="140" w:type="dxa"/>
-              <w:left w:w="160" w:type="dxa"/>
-              <w:right w:w="160" w:type="dxa"/>
-            </w:tcMar>
-          </w:tcPr>
-          <w:p>
-            <w:pPr>
-              <w:spacing w:after="40"/>
-            </w:pPr>
-            <w:r>
-              <w:rPr>
-                <w:b/>
-                <w:color w:val="2D3748"/>
-              </w:rPr>
-              <w:t xml:space="preserve">Era 3</w:t>
-            </w:r>
-          </w:p>
-        </w:tc>
-        <w:tc>
-          <w:tcPr>
-            <w:shd w:val="clear" w:color="auto" w:fill="FFFFFF"/>
-            <w:tcMar>
-              <w:top w:w="140" w:type="dxa"/>
-              <w:bottom w:w="140" w:type="dxa"/>
-              <w:left w:w="160" w:type="dxa"/>
-              <w:right w:w="160" w:type="dxa"/>
-            </w:tcMar>
-          </w:tcPr>
-          <w:p>
-            <w:pPr>
-              <w:spacing w:after="40"/>
-            </w:pPr>
-            <w:r>
-              <w:rPr>
-                <w:color w:val="2D3748"/>
-              </w:rPr>
-              <w:t xml:space="preserve">Grace Hopper</w:t>
-            </w:r>
-          </w:p>
-        </w:tc>
-        <w:tc>
-          <w:tcPr>
-            <w:shd w:val="clear" w:color="auto" w:fill="FFFFFF"/>
-            <w:tcMar>
-              <w:top w:w="140" w:type="dxa"/>
-              <w:bottom w:w="140" w:type="dxa"/>
-              <w:left w:w="160" w:type="dxa"/>
-              <w:right w:w="160" w:type="dxa"/>
-            </w:tcMar>
-          </w:tcPr>
-          <w:p>
-            <w:pPr>
-              <w:spacing w:after="40"/>
-            </w:pPr>
-            <w:r>
-              <w:rPr>
-                <w:color w:val="2D3748"/>
-              </w:rPr>
-              <w:t xml:space="preserve">Depuração e Compiladores</w:t>
-            </w:r>
-          </w:p>
-        </w:tc>
-        <w:tc>
-          <w:tcPr>
-            <w:shd w:val="clear" w:color="auto" w:fill="FFFFFF"/>
-            <w:tcMar>
-              <w:top w:w="140" w:type="dxa"/>
-              <w:bottom w:w="140" w:type="dxa"/>
-              <w:left w:w="160" w:type="dxa"/>
-              <w:right w:w="160" w:type="dxa"/>
-            </w:tcMar>
-          </w:tcPr>
-          <w:p>
-            <w:pPr>
-              <w:spacing w:after="40"/>
-            </w:pPr>
-            <w:r>
-              <w:rPr>
-                <w:color w:val="2D3748"/>
-              </w:rPr>
-              <w:t xml:space="preserve">89,2 s</w:t>
-            </w:r>
-          </w:p>
-        </w:tc>
-        <w:tc>
-          <w:tcPr>
-            <w:shd w:val="clear" w:color="auto" w:fill="FFFFFF"/>
-            <w:tcMar>
-              <w:top w:w="140" w:type="dxa"/>
-              <w:bottom w:w="140" w:type="dxa"/>
-              <w:left w:w="160" w:type="dxa"/>
-              <w:right w:w="160" w:type="dxa"/>
-            </w:tcMar>
-          </w:tcPr>
-          <w:p>
-            <w:pPr>
-              <w:spacing w:after="40"/>
-            </w:pPr>
-            <w:r>
-              <w:rPr>
-                <w:color w:val="2D3748"/>
-              </w:rPr>
-              <w:t xml:space="preserve">52,3 s</w:t>
-            </w:r>
-          </w:p>
-        </w:tc>
-        <w:tc>
-          <w:tcPr>
-            <w:shd w:val="clear" w:color="auto" w:fill="FFFFFF"/>
-            <w:tcMar>
-              <w:top w:w="140" w:type="dxa"/>
-              <w:bottom w:w="140" w:type="dxa"/>
-              <w:left w:w="160" w:type="dxa"/>
-              <w:right w:w="160" w:type="dxa"/>
-            </w:tcMar>
-          </w:tcPr>
-          <w:p>
-            <w:pPr>
-              <w:spacing w:after="40"/>
-            </w:pPr>
-            <w:r>
-              <w:rPr>
-                <w:color w:val="2D3748"/>
-              </w:rPr>
-              <w:t xml:space="preserve">2,23</w:t>
-            </w:r>
-          </w:p>
-        </w:tc>
-        <w:tc>
-          <w:tcPr>
-            <w:shd w:val="clear" w:color="auto" w:fill="FFFFFF"/>
-            <w:tcMar>
-              <w:top w:w="140" w:type="dxa"/>
-              <w:bottom w:w="140" w:type="dxa"/>
-              <w:left w:w="160" w:type="dxa"/>
-              <w:right w:w="160" w:type="dxa"/>
-            </w:tcMar>
-          </w:tcPr>
-          <w:p>
-            <w:pPr>
-              <w:spacing w:after="40"/>
-            </w:pPr>
-            <w:r>
-              <w:rPr>
-                <w:color w:val="2D3748"/>
-              </w:rPr>
-              <w:t xml:space="preserve">100%</w:t>
-            </w:r>
-          </w:p>
-        </w:tc>
-      </w:tr>
-      <w:tr>
-        <w:tc>
-          <w:tcPr>
-            <w:shd w:val="clear" w:color="auto" w:fill="F7FAFC"/>
-            <w:tcMar>
-              <w:top w:w="140" w:type="dxa"/>
-              <w:bottom w:w="140" w:type="dxa"/>
-              <w:left w:w="160" w:type="dxa"/>
-              <w:right w:w="160" w:type="dxa"/>
-            </w:tcMar>
-          </w:tcPr>
-          <w:p>
-            <w:pPr>
-              <w:spacing w:after="40"/>
-            </w:pPr>
-            <w:r>
-              <w:rPr>
-                <w:b/>
-                <w:color w:val="2D3748"/>
-              </w:rPr>
-              <w:t xml:space="preserve">Era 4</w:t>
-            </w:r>
-          </w:p>
-        </w:tc>
-        <w:tc>
-          <w:tcPr>
-            <w:shd w:val="clear" w:color="auto" w:fill="F7FAFC"/>
-            <w:tcMar>
-              <w:top w:w="140" w:type="dxa"/>
-              <w:bottom w:w="140" w:type="dxa"/>
-              <w:left w:w="160" w:type="dxa"/>
-              <w:right w:w="160" w:type="dxa"/>
-            </w:tcMar>
-          </w:tcPr>
-          <w:p>
-            <w:pPr>
-              <w:spacing w:after="40"/>
-            </w:pPr>
-            <w:r>
-              <w:rPr>
-                <w:color w:val="2D3748"/>
-              </w:rPr>
-              <w:t xml:space="preserve">Katherine Johnson</w:t>
-            </w:r>
-          </w:p>
-        </w:tc>
-        <w:tc>
-          <w:tcPr>
-            <w:shd w:val="clear" w:color="auto" w:fill="F7FAFC"/>
-            <w:tcMar>
-              <w:top w:w="140" w:type="dxa"/>
-              <w:bottom w:w="140" w:type="dxa"/>
-              <w:left w:w="160" w:type="dxa"/>
-              <w:right w:w="160" w:type="dxa"/>
-            </w:tcMar>
-          </w:tcPr>
-          <w:p>
-            <w:pPr>
-              <w:spacing w:after="40"/>
-            </w:pPr>
-            <w:r>
-              <w:rPr>
-                <w:color w:val="2D3748"/>
-              </w:rPr>
-              <w:t xml:space="preserve">Modelagem e Parâmetros Críticos</w:t>
-            </w:r>
-          </w:p>
-        </w:tc>
-        <w:tc>
-          <w:tcPr>
-            <w:shd w:val="clear" w:color="auto" w:fill="F7FAFC"/>
-            <w:tcMar>
-              <w:top w:w="140" w:type="dxa"/>
-              <w:bottom w:w="140" w:type="dxa"/>
-              <w:left w:w="160" w:type="dxa"/>
-              <w:right w:w="160" w:type="dxa"/>
-            </w:tcMar>
-          </w:tcPr>
-          <w:p>
-            <w:pPr>
-              <w:spacing w:after="40"/>
-            </w:pPr>
-            <w:r>
-              <w:rPr>
-                <w:color w:val="2D3748"/>
-              </w:rPr>
-              <w:t xml:space="preserve">103,2 s</w:t>
-            </w:r>
-          </w:p>
-        </w:tc>
-        <w:tc>
-          <w:tcPr>
-            <w:shd w:val="clear" w:color="auto" w:fill="F7FAFC"/>
-            <w:tcMar>
-              <w:top w:w="140" w:type="dxa"/>
-              <w:bottom w:w="140" w:type="dxa"/>
-              <w:left w:w="160" w:type="dxa"/>
-              <w:right w:w="160" w:type="dxa"/>
-            </w:tcMar>
-          </w:tcPr>
-          <w:p>
-            <w:pPr>
-              <w:spacing w:after="40"/>
-            </w:pPr>
-            <w:r>
-              <w:rPr>
-                <w:color w:val="2D3748"/>
-              </w:rPr>
-              <w:t xml:space="preserve">95,3 s</w:t>
-            </w:r>
-          </w:p>
-        </w:tc>
-        <w:tc>
-          <w:tcPr>
-            <w:shd w:val="clear" w:color="auto" w:fill="F7FAFC"/>
-            <w:tcMar>
-              <w:top w:w="140" w:type="dxa"/>
-              <w:bottom w:w="140" w:type="dxa"/>
-              <w:left w:w="160" w:type="dxa"/>
-              <w:right w:w="160" w:type="dxa"/>
-            </w:tcMar>
-          </w:tcPr>
-          <w:p>
-            <w:pPr>
-              <w:spacing w:after="40"/>
-            </w:pPr>
-            <w:r>
-              <w:rPr>
-                <w:color w:val="2D3748"/>
-              </w:rPr>
-              <w:t xml:space="preserve">5,31</w:t>
-            </w:r>
-          </w:p>
-        </w:tc>
-        <w:tc>
-          <w:tcPr>
-            <w:shd w:val="clear" w:color="auto" w:fill="F7FAFC"/>
-            <w:tcMar>
-              <w:top w:w="140" w:type="dxa"/>
-              <w:bottom w:w="140" w:type="dxa"/>
-              <w:left w:w="160" w:type="dxa"/>
-              <w:right w:w="160" w:type="dxa"/>
-            </w:tcMar>
-          </w:tcPr>
-          <w:p>
-            <w:pPr>
-              <w:spacing w:after="40"/>
-            </w:pPr>
-            <w:r>
-              <w:rPr>
-                <w:color w:val="2D3748"/>
-              </w:rPr>
-              <w:t xml:space="preserve">100%</w:t>
-            </w:r>
-          </w:p>
-        </w:tc>
-      </w:tr>
-      <w:tr>
-        <w:tc>
-          <w:tcPr>
-            <w:shd w:val="clear" w:color="auto" w:fill="FFFFFF"/>
-            <w:tcMar>
-              <w:top w:w="140" w:type="dxa"/>
-              <w:bottom w:w="140" w:type="dxa"/>
-              <w:left w:w="160" w:type="dxa"/>
-              <w:right w:w="160" w:type="dxa"/>
-            </w:tcMar>
-          </w:tcPr>
-          <w:p>
-            <w:pPr>
-              <w:spacing w:after="40"/>
-            </w:pPr>
-            <w:r>
-              <w:rPr>
-                <w:b/>
-                <w:color w:val="2D3748"/>
-              </w:rPr>
-              <w:t xml:space="preserve">Era 5</w:t>
-            </w:r>
-          </w:p>
-        </w:tc>
-        <w:tc>
-          <w:tcPr>
-            <w:shd w:val="clear" w:color="auto" w:fill="FFFFFF"/>
-            <w:tcMar>
-              <w:top w:w="140" w:type="dxa"/>
-              <w:bottom w:w="140" w:type="dxa"/>
-              <w:left w:w="160" w:type="dxa"/>
-              <w:right w:w="160" w:type="dxa"/>
-            </w:tcMar>
-          </w:tcPr>
-          <w:p>
-            <w:pPr>
-              <w:spacing w:after="40"/>
-            </w:pPr>
-            <w:r>
-              <w:rPr>
-                <w:color w:val="2D3748"/>
-              </w:rPr>
-              <w:t xml:space="preserve">Mary Kenneth Keller</w:t>
-            </w:r>
-          </w:p>
-        </w:tc>
-        <w:tc>
-          <w:tcPr>
-            <w:shd w:val="clear" w:color="auto" w:fill="FFFFFF"/>
-            <w:tcMar>
-              <w:top w:w="140" w:type="dxa"/>
-              <w:bottom w:w="140" w:type="dxa"/>
-              <w:left w:w="160" w:type="dxa"/>
-              <w:right w:w="160" w:type="dxa"/>
-            </w:tcMar>
-          </w:tcPr>
-          <w:p>
-            <w:pPr>
-              <w:spacing w:after="40"/>
-            </w:pPr>
-            <w:r>
-              <w:rPr>
-                <w:color w:val="2D3748"/>
-              </w:rPr>
-              <w:t xml:space="preserve">Sintaxe BASIC e Variáveis</w:t>
-            </w:r>
-          </w:p>
-        </w:tc>
-        <w:tc>
-          <w:tcPr>
-            <w:shd w:val="clear" w:color="auto" w:fill="FFFFFF"/>
-            <w:tcMar>
-              <w:top w:w="140" w:type="dxa"/>
-              <w:bottom w:w="140" w:type="dxa"/>
-              <w:left w:w="160" w:type="dxa"/>
-              <w:right w:w="160" w:type="dxa"/>
-            </w:tcMar>
-          </w:tcPr>
-          <w:p>
-            <w:pPr>
-              <w:spacing w:after="40"/>
-            </w:pPr>
-            <w:r>
-              <w:rPr>
-                <w:color w:val="2D3748"/>
-              </w:rPr>
-              <w:t xml:space="preserve">134,6 s</w:t>
-            </w:r>
-          </w:p>
-        </w:tc>
-        <w:tc>
-          <w:tcPr>
-            <w:shd w:val="clear" w:color="auto" w:fill="FFFFFF"/>
-            <w:tcMar>
-              <w:top w:w="140" w:type="dxa"/>
-              <w:bottom w:w="140" w:type="dxa"/>
-              <w:left w:w="160" w:type="dxa"/>
-              <w:right w:w="160" w:type="dxa"/>
-            </w:tcMar>
-          </w:tcPr>
-          <w:p>
-            <w:pPr>
-              <w:spacing w:after="40"/>
-            </w:pPr>
-            <w:r>
-              <w:rPr>
-                <w:color w:val="2D3748"/>
-              </w:rPr>
-              <w:t xml:space="preserve">113,1 s</w:t>
-            </w:r>
-          </w:p>
-        </w:tc>
-        <w:tc>
-          <w:tcPr>
-            <w:shd w:val="clear" w:color="auto" w:fill="FFFFFF"/>
-            <w:tcMar>
-              <w:top w:w="140" w:type="dxa"/>
-              <w:bottom w:w="140" w:type="dxa"/>
-              <w:left w:w="160" w:type="dxa"/>
-              <w:right w:w="160" w:type="dxa"/>
-            </w:tcMar>
-          </w:tcPr>
-          <w:p>
-            <w:pPr>
-              <w:spacing w:after="40"/>
-            </w:pPr>
-            <w:r>
-              <w:rPr>
-                <w:color w:val="2D3748"/>
-              </w:rPr>
-              <w:t xml:space="preserve">13,23</w:t>
-            </w:r>
-          </w:p>
-        </w:tc>
-        <w:tc>
-          <w:tcPr>
-            <w:shd w:val="clear" w:color="auto" w:fill="FFFFFF"/>
-            <w:tcMar>
-              <w:top w:w="140" w:type="dxa"/>
-              <w:bottom w:w="140" w:type="dxa"/>
-              <w:left w:w="160" w:type="dxa"/>
-              <w:right w:w="160" w:type="dxa"/>
-            </w:tcMar>
-          </w:tcPr>
-          <w:p>
-            <w:pPr>
-              <w:spacing w:after="40"/>
-            </w:pPr>
-            <w:r>
-              <w:rPr>
-                <w:color w:val="2D3748"/>
-              </w:rPr>
-              <w:t xml:space="preserve">100%</w:t>
-            </w:r>
-          </w:p>
-        </w:tc>
-      </w:tr>
-      <w:tr>
-        <w:tc>
-          <w:tcPr>
-            <w:shd w:val="clear" w:color="auto" w:fill="F7FAFC"/>
-            <w:tcMar>
-              <w:top w:w="140" w:type="dxa"/>
-              <w:bottom w:w="140" w:type="dxa"/>
-              <w:left w:w="160" w:type="dxa"/>
-              <w:right w:w="160" w:type="dxa"/>
-            </w:tcMar>
-          </w:tcPr>
-          <w:p>
-            <w:pPr>
-              <w:spacing w:after="40"/>
-            </w:pPr>
-            <w:r>
-              <w:rPr>
-                <w:b/>
-                <w:color w:val="2D3748"/>
-              </w:rPr>
-              <w:t xml:space="preserve">Era 6</w:t>
-            </w:r>
-          </w:p>
-        </w:tc>
-        <w:tc>
-          <w:tcPr>
-            <w:shd w:val="clear" w:color="auto" w:fill="F7FAFC"/>
-            <w:tcMar>
-              <w:top w:w="140" w:type="dxa"/>
-              <w:bottom w:w="140" w:type="dxa"/>
-              <w:left w:w="160" w:type="dxa"/>
-              <w:right w:w="160" w:type="dxa"/>
-            </w:tcMar>
-          </w:tcPr>
-          <w:p>
-            <w:pPr>
-              <w:spacing w:after="40"/>
-            </w:pPr>
-            <w:r>
-              <w:rPr>
-                <w:color w:val="2D3748"/>
-              </w:rPr>
-              <w:t xml:space="preserve">Margaret Hamilton</w:t>
-            </w:r>
-          </w:p>
-        </w:tc>
-        <w:tc>
-          <w:tcPr>
-            <w:shd w:val="clear" w:color="auto" w:fill="F7FAFC"/>
-            <w:tcMar>
-              <w:top w:w="140" w:type="dxa"/>
-              <w:bottom w:w="140" w:type="dxa"/>
-              <w:left w:w="160" w:type="dxa"/>
-              <w:right w:w="160" w:type="dxa"/>
-            </w:tcMar>
-          </w:tcPr>
-          <w:p>
-            <w:pPr>
-              <w:spacing w:after="40"/>
-            </w:pPr>
-            <w:r>
-              <w:rPr>
-                <w:color w:val="2D3748"/>
-              </w:rPr>
-              <w:t xml:space="preserve">Engenharia de Software / Apollo 11</w:t>
-            </w:r>
-          </w:p>
-        </w:tc>
-        <w:tc>
-          <w:tcPr>
-            <w:shd w:val="clear" w:color="auto" w:fill="F7FAFC"/>
-            <w:tcMar>
-              <w:top w:w="140" w:type="dxa"/>
-              <w:bottom w:w="140" w:type="dxa"/>
-              <w:left w:w="160" w:type="dxa"/>
-              <w:right w:w="160" w:type="dxa"/>
-            </w:tcMar>
-          </w:tcPr>
-          <w:p>
-            <w:pPr>
-              <w:spacing w:after="40"/>
-            </w:pPr>
-            <w:r>
-              <w:rPr>
-                <w:color w:val="2D3748"/>
-              </w:rPr>
-              <w:t xml:space="preserve">88,0 s</w:t>
-            </w:r>
-          </w:p>
-        </w:tc>
-        <w:tc>
-          <w:tcPr>
-            <w:shd w:val="clear" w:color="auto" w:fill="F7FAFC"/>
-            <w:tcMar>
-              <w:top w:w="140" w:type="dxa"/>
-              <w:bottom w:w="140" w:type="dxa"/>
-              <w:left w:w="160" w:type="dxa"/>
-              <w:right w:w="160" w:type="dxa"/>
-            </w:tcMar>
-          </w:tcPr>
-          <w:p>
-            <w:pPr>
-              <w:spacing w:after="40"/>
-            </w:pPr>
-            <w:r>
-              <w:rPr>
-                <w:color w:val="2D3748"/>
-              </w:rPr>
-              <w:t xml:space="preserve">61,8 s</w:t>
-            </w:r>
-          </w:p>
-        </w:tc>
-        <w:tc>
-          <w:tcPr>
-            <w:shd w:val="clear" w:color="auto" w:fill="F7FAFC"/>
-            <w:tcMar>
-              <w:top w:w="140" w:type="dxa"/>
-              <w:bottom w:w="140" w:type="dxa"/>
-              <w:left w:w="160" w:type="dxa"/>
-              <w:right w:w="160" w:type="dxa"/>
-            </w:tcMar>
-          </w:tcPr>
-          <w:p>
-            <w:pPr>
-              <w:spacing w:after="40"/>
-            </w:pPr>
-            <w:r>
-              <w:rPr>
-                <w:color w:val="2D3748"/>
-              </w:rPr>
-              <w:t xml:space="preserve">6,60</w:t>
-            </w:r>
-          </w:p>
-        </w:tc>
-        <w:tc>
-          <w:tcPr>
-            <w:shd w:val="clear" w:color="auto" w:fill="F7FAFC"/>
-            <w:tcMar>
-              <w:top w:w="140" w:type="dxa"/>
-              <w:bottom w:w="140" w:type="dxa"/>
-              <w:left w:w="160" w:type="dxa"/>
-              <w:right w:w="160" w:type="dxa"/>
-            </w:tcMar>
-          </w:tcPr>
-          <w:p>
-            <w:pPr>
-              <w:spacing w:after="40"/>
-            </w:pPr>
-            <w:r>
-              <w:rPr>
-                <w:color w:val="2D3748"/>
-              </w:rPr>
-              <w:t xml:space="preserve">100%</w:t>
-            </w:r>
-          </w:p>
-        </w:tc>
-      </w:tr>
-      <w:tr>
-        <w:tc>
-          <w:tcPr>
-            <w:shd w:val="clear" w:color="auto" w:fill="FFFFFF"/>
-            <w:tcMar>
-              <w:top w:w="140" w:type="dxa"/>
-              <w:bottom w:w="140" w:type="dxa"/>
-              <w:left w:w="160" w:type="dxa"/>
-              <w:right w:w="160" w:type="dxa"/>
-            </w:tcMar>
-          </w:tcPr>
-          <w:p>
-            <w:pPr>
-              <w:spacing w:after="40"/>
-            </w:pPr>
-            <w:r>
-              <w:rPr>
-                <w:b/>
-                <w:color w:val="2D3748"/>
-              </w:rPr>
-              <w:t xml:space="preserve">Epílogo</w:t>
-            </w:r>
-          </w:p>
-        </w:tc>
-        <w:tc>
-          <w:tcPr>
-            <w:shd w:val="clear" w:color="auto" w:fill="FFFFFF"/>
-            <w:tcMar>
-              <w:top w:w="140" w:type="dxa"/>
-              <w:bottom w:w="140" w:type="dxa"/>
-              <w:left w:w="160" w:type="dxa"/>
-              <w:right w:w="160" w:type="dxa"/>
-            </w:tcMar>
-          </w:tcPr>
-          <w:p>
-            <w:pPr>
-              <w:spacing w:after="40"/>
-            </w:pPr>
-            <w:r>
-              <w:rPr>
-                <w:color w:val="2D3748"/>
-              </w:rPr>
-              <w:t xml:space="preserve">Edith Ranzini</w:t>
-            </w:r>
-          </w:p>
-        </w:tc>
-        <w:tc>
-          <w:tcPr>
-            <w:shd w:val="clear" w:color="auto" w:fill="FFFFFF"/>
-            <w:tcMar>
-              <w:top w:w="140" w:type="dxa"/>
-              <w:bottom w:w="140" w:type="dxa"/>
-              <w:left w:w="160" w:type="dxa"/>
-              <w:right w:w="160" w:type="dxa"/>
-            </w:tcMar>
-          </w:tcPr>
-          <w:p>
-            <w:pPr>
-              <w:spacing w:after="40"/>
-            </w:pPr>
-            <w:r>
-              <w:rPr>
-                <w:color w:val="2D3748"/>
-              </w:rPr>
-              <w:t xml:space="preserve">Soberania e Hardware Nacional</w:t>
-            </w:r>
-          </w:p>
-        </w:tc>
-        <w:tc>
-          <w:tcPr>
-            <w:shd w:val="clear" w:color="auto" w:fill="FFFFFF"/>
-            <w:tcMar>
-              <w:top w:w="140" w:type="dxa"/>
-              <w:bottom w:w="140" w:type="dxa"/>
-              <w:left w:w="160" w:type="dxa"/>
-              <w:right w:w="160" w:type="dxa"/>
-            </w:tcMar>
-          </w:tcPr>
-          <w:p>
-            <w:pPr>
-              <w:spacing w:after="40"/>
-            </w:pPr>
-            <w:r>
-              <w:rPr>
-                <w:color w:val="2D3748"/>
-              </w:rPr>
-              <w:t xml:space="preserve">-</w:t>
-            </w:r>
-          </w:p>
-        </w:tc>
-        <w:tc>
-          <w:tcPr>
-            <w:shd w:val="clear" w:color="auto" w:fill="FFFFFF"/>
-            <w:tcMar>
-              <w:top w:w="140" w:type="dxa"/>
-              <w:bottom w:w="140" w:type="dxa"/>
-              <w:left w:w="160" w:type="dxa"/>
-              <w:right w:w="160" w:type="dxa"/>
-            </w:tcMar>
-          </w:tcPr>
-          <w:p>
-            <w:pPr>
-              <w:spacing w:after="40"/>
-            </w:pPr>
-            <w:r>
-              <w:rPr>
-                <w:color w:val="2D3748"/>
-              </w:rPr>
-              <w:t xml:space="preserve">-</w:t>
-            </w:r>
-          </w:p>
-        </w:tc>
-        <w:tc>
-          <w:tcPr>
-            <w:shd w:val="clear" w:color="auto" w:fill="FFFFFF"/>
-            <w:tcMar>
-              <w:top w:w="140" w:type="dxa"/>
-              <w:bottom w:w="140" w:type="dxa"/>
-              <w:left w:w="160" w:type="dxa"/>
-              <w:right w:w="160" w:type="dxa"/>
-            </w:tcMar>
-          </w:tcPr>
-          <w:p>
-            <w:pPr>
-              <w:spacing w:after="40"/>
-            </w:pPr>
-            <w:r>
-              <w:rPr>
-                <w:color w:val="2D3748"/>
-              </w:rPr>
-              <w:t xml:space="preserve">-</w:t>
-            </w:r>
-          </w:p>
-        </w:tc>
-        <w:tc>
-          <w:tcPr>
-            <w:shd w:val="clear" w:color="auto" w:fill="FFFFFF"/>
-            <w:tcMar>
-              <w:top w:w="140" w:type="dxa"/>
-              <w:bottom w:w="140" w:type="dxa"/>
-              <w:left w:w="160" w:type="dxa"/>
-              <w:right w:w="160" w:type="dxa"/>
-            </w:tcMar>
-          </w:tcPr>
-          <w:p>
-            <w:pPr>
-              <w:spacing w:after="40"/>
-            </w:pPr>
-            <w:r>
-              <w:rPr>
-                <w:color w:val="2D3748"/>
-              </w:rPr>
-              <w:t xml:space="preserve">100% (Leitura)</w:t>
-            </w:r>
-          </w:p>
-        </w:tc>
-      </w:tr>
-    </w:tbl>
-    <w:p>
-      <w:pPr>
-        <w:spacing w:after="140"/>
-      </w:pPr>
-    </w:p>
-    <w:p>
-      <w:pPr>
-        <w:jc w:val="both"/>
-        <w:spacing w:after="140" w:line="276" w:lineRule="auto"/>
-      </w:pPr>
-      <w:r>
-        <w:rPr/>
-        <w:t xml:space="preserve">Os dados revelam que a Era 2 (ENIAC) foi a de mais rápida assimilação visual (53,6 s). Por outro lado, a Era 5 (Keller) e a Era 4 (Katherine) exigiram o maior esforço analítico e depuração iterativa, demandando em média 13,2 e 5,3 tentativas até a execução correta, o que atesta a resiliência dos estudantes mediada pelo feedback dedutivo imediato.</w:t>
-      </w:r>
-    </w:p>
-    <w:p>
-      <w:pPr>
-        <w:pBdr>
-          <w:left w:val="single" w:sz="24" w:space="12" w:color="3182CE"/>
-        </w:pBdr>
-        <w:shd w:val="clear" w:color="auto" w:fill="EBF8FF"/>
-        <w:ind w:left="280" w:right="280"/>
-        <w:spacing w:before="140" w:after="160"/>
-      </w:pPr>
-      <w:r>
-        <w:rPr>
-          <w:b/>
-          <w:i/>
-          <w:color w:val="2C5282"/>
-        </w:rPr>
-        <w:t xml:space="preserve">Visualização de Dados:</w:t>
-      </w:r>
-    </w:p>
-    <w:p>
-      <w:pPr>
-        <w:pBdr>
-          <w:left w:val="single" w:sz="24" w:space="12" w:color="3182CE"/>
-        </w:pBdr>
-        <w:shd w:val="clear" w:color="auto" w:fill="EBF8FF"/>
-        <w:ind w:left="280" w:right="280"/>
-        <w:spacing w:before="140" w:after="160"/>
-      </w:pPr>
-      <w:r>
-        <w:rPr>
-          <w:i/>
-          <w:color w:val="2C5282"/>
-        </w:rPr>
-        <w:t xml:space="preserve">A consolidação gráfica individual de todos os 52 participantes e o resumo estatístico detalhado constam nos artefatos visuais </w:t>
-      </w:r>
-      <w:r>
-        <w:rPr>
-          <w:rFonts w:ascii="Consolas" w:hAnsi="Consolas"/>
-          <w:shd w:val="clear" w:color="auto" w:fill="EDF2F7"/>
-        </w:rPr>
-        <w:t xml:space="preserve">tabela_telemetria_pesquisa.png</w:t>
-      </w:r>
-      <w:r>
-        <w:rPr>
-          <w:i/>
-          <w:color w:val="2C5282"/>
-        </w:rPr>
-        <w:t xml:space="preserve"> e </w:t>
-      </w:r>
-      <w:r>
-        <w:rPr>
-          <w:rFonts w:ascii="Consolas" w:hAnsi="Consolas"/>
-          <w:shd w:val="clear" w:color="auto" w:fill="EDF2F7"/>
-        </w:rPr>
-        <w:t xml:space="preserve">tabela_telemetria_resumo_estatistico.png</w:t>
-      </w:r>
-      <w:r>
-        <w:rPr>
-          <w:i/>
-          <w:color w:val="2C5282"/>
-        </w:rPr>
-        <w:t xml:space="preserve">.</w:t>
+        <w:t xml:space="preserve">A etapa de aplicação prática e coleta de dados do jogo Pioneiras &amp; Além foi realizada em dois colégios distintos da rede pública estadual de ensino, envolvendo turmas de oitavo e nono anos do Ensino Fundamental. A escolha desse público e do ambiente escolar fundamenta-se nas diretrizes da Base Nacional Comum Curricular para o ensino de computação (Brasil, 2022), que orienta o desenvolvimento do raciocínio lógico e da cultura digital nessa faixa etária. O trabalho seguiu a abordagem metodológica da pesquisa-ação proposta por Thiollent (2011), na qual o pesquisador atua de forma participativa junto aos professores e estudantes no laboratório de informática, acompanhando de perto o processo de interação com a tecnologia educacional.</w:t>
+      </w:r>
+    </w:p>
+    <w:p>
+      <w:pPr>
+        <w:jc w:val="both"/>
+        <w:spacing w:after="140" w:line="276" w:lineRule="auto"/>
+      </w:pPr>
+      <w:r>
+        <w:rPr/>
+        <w:t xml:space="preserve">O procedimento metodológico foi estruturado em dois momentos específicos de coleta de dados. No primeiro momento, ao acessar a aplicação diretamente pelo navegador, cada estudante respondeu a uma sondagem diagnóstica inicial integrada à própria interface do jogo, com o objetivo de identificar o perfil da turma, o contato anterior com lógica de programação e o conhecimento prévio sobre figuras femininas na história da computação. Em seguida, os alunos vivenciaram as fases do jogo de forma autônoma ou em duplas colaborativas, enquanto o sistema de telemetria registrava silenciosamente o tempo e as tentativas de resolução de cada desafio. No segundo momento, imediatamente após a conclusão da última fase e do epílogo, os participantes responderam ao questionário de pós-teste avaliando a experiência, a percepção sobre a metodologia e o impacto das narrativas históricas.</w:t>
+      </w:r>
+    </w:p>
+    <w:p>
+      <w:pPr>
+        <w:jc w:val="both"/>
+        <w:spacing w:after="140" w:line="276" w:lineRule="auto"/>
+      </w:pPr>
+      <w:r>
+        <w:rPr/>
+        <w:t xml:space="preserve">Essa organização em duas etapas permitiu capturar tanto as impressões perceptivas dos educandos quanto o seu comportamento real de resolução de problemas, criando a base empírica necessária para discutir a efetividade do pensamento computacional (Wing, 2006) e o papel dos jogos no aprendizado de conceitos abstratos, conforme discutido a seguir.</w:t>
       </w:r>
     </w:p>
     <w:p>
@@ -4132,96 +2557,42 @@
     </w:p>
     <w:p>
       <w:pPr>
-        <w:pStyle w:val="Heading2"/>
-      </w:pPr>
-      <w:r>
-        <w:t>A Efetividade das Metáforas Pedagógicas na Superação da Abstração</w:t>
-      </w:r>
-    </w:p>
-    <w:p>
-      <w:pPr>
-        <w:jc w:val="both"/>
-        <w:spacing w:after="140" w:line="276" w:lineRule="auto"/>
-      </w:pPr>
-      <w:r>
-        <w:rPr/>
-        <w:t xml:space="preserve">Os achados empíricos confirmam os postulados de Papert (1980) e Resnick (2013) sobre o construcionismo digital. Ao traduzir o conceito abstrato de variáveis e memória na imagem palpável de "guardar numa gaveta rotulada" (Era 5) ou a execução algorítmica na lógica de "uma receita de bolo" (Era 1), o </w:t>
-      </w:r>
-      <w:r>
-        <w:rPr>
-          <w:i/>
-        </w:rPr>
-        <w:t xml:space="preserve">Pioneiras &amp; Além</w:t>
-      </w:r>
-      <w:r>
-        <w:rPr/>
-        <w:t xml:space="preserve"> reduziu sensivelmente a ansiedade computacional. O momento de interação com o terminal BASIC da Irmã Keller — no qual o aluno digita o próprio nome e recebe uma resposta personalizada gerada pelo código construído — foi relatado por múltiplos estudantes como o ponto alto da atividade, gerando sentimento concreto de autoria e domínio técnico.</w:t>
-      </w:r>
-    </w:p>
-    <w:p>
-      <w:pPr>
-        <w:pStyle w:val="Heading2"/>
-      </w:pPr>
-      <w:r>
-        <w:t>Desconstrução de Estereótipos e Ganho de Autoeficácia Feminina (ODS 5)</w:t>
-      </w:r>
-    </w:p>
-    <w:p>
-      <w:pPr>
-        <w:jc w:val="both"/>
-        <w:spacing w:after="140" w:line="276" w:lineRule="auto"/>
-      </w:pPr>
-      <w:r>
-        <w:rPr/>
-        <w:t xml:space="preserve">O impacto mais profundo manifestou-se no contraste entre a sondagem prévia e o encerramento da oficina. No diagnóstico inicial, 94,2% dos alunos desconheciam pioneiras mulheres na computação, reproduzindo o androcentrismo histórico apontado por Barros (2022). Ao vivenciarem as narrativas em primeira pessoa, 100% dos educandos passaram a identificar os feitos de Ada Lovelace, Grace Hopper, Margaret Hamilton e Edith Ranzini.</w:t>
-      </w:r>
-    </w:p>
-    <w:p>
-      <w:pPr>
-        <w:jc w:val="both"/>
-        <w:spacing w:after="140" w:line="276" w:lineRule="auto"/>
-      </w:pPr>
-      <w:r>
-        <w:rPr/>
-        <w:t xml:space="preserve">A ressignificação do erro (introduzida na fase de Grace Hopper com a caça ao inseto e continuada na priorização de tarefas de Margaret Hamilton) desmistificou o mito da perfeição instantânea em exatas. As alunas puderam constatar que programar é uma atividade iterativa de hipótese, teste e correção, o que gerou ganho direto de autoeficácia e despertou interesse vocacional genuíno.</w:t>
-      </w:r>
-    </w:p>
-    <w:p>
-      <w:pPr>
-        <w:pStyle w:val="Heading2"/>
-      </w:pPr>
-      <w:r>
-        <w:t>Soberania Tecnológica e Viabilidade em Escolas Públicas</w:t>
-      </w:r>
-    </w:p>
-    <w:p>
-      <w:pPr>
-        <w:jc w:val="both"/>
-        <w:spacing w:after="140" w:line="276" w:lineRule="auto"/>
-      </w:pPr>
-      <w:r>
-        <w:rPr/>
-        <w:t xml:space="preserve">A inclusão de Edith Ranzini no Epílogo gerou um momento ímpar de conscientização cidadã: os estudantes manifestaram surpresa e orgulho ao descobrirem que o primeiro computador brasileiro (</w:t>
-      </w:r>
-      <w:r>
-        <w:rPr>
-          <w:i/>
-        </w:rPr>
-        <w:t xml:space="preserve">Patinho Feio</w:t>
-      </w:r>
-      <w:r>
-        <w:rPr/>
-        <w:t xml:space="preserve">) foi desenvolvido em uma universidade pública por uma engenheira brasileira.</w:t>
-      </w:r>
-    </w:p>
-    <w:p>
-      <w:pPr>
-        <w:jc w:val="both"/>
-        <w:spacing w:after="140" w:line="276" w:lineRule="auto"/>
-      </w:pPr>
-      <w:r>
-        <w:rPr/>
-        <w:t xml:space="preserve">Tecnicamente, a arquitetura Godot 4 WebAssembly provou-se plenamente viável: os 52 acessos simultâneos no laboratório escolar rodaram sem qualquer necessidade de instalação local ou suporte especializado, e a telemetria em nuvem gravou com precisão de 100% cada etapa cumprida pelos participantes.</w:t>
+        <w:jc w:val="both"/>
+        <w:spacing w:after="140" w:line="276" w:lineRule="auto"/>
+      </w:pPr>
+      <w:r>
+        <w:rPr/>
+        <w:t xml:space="preserve">A análise integrada da telemetria e dos questionários reúne os registros de 52 estudantes participantes dos dois colégios públicos, fornecendo um panorama claro sobre a aprendizagem e a percepção de gênero. Os dados da sondagem inicial confirmam de forma contundente a invisibilidade histórica das mulheres na área tecnológica. Antes de terem contato com o jogo, apenas 5,8% dos alunos (3 estudantes) afirmaram conhecer alguma mulher pioneira na computação, o que significa que 94,2% da turma desconhecia totalmente essas contribuições. Somado a isso, apenas 9,6% (5 estudantes) já tinham experimentado alguma atividade com algoritmos ou programação, mostrando que mais de 90% eram iniciantes absolutos. Esse cenário inicial reflete o que autoras como Schiebinger (1999) e Barros (2022) descrevem sobre o androcentrismo escolar, onde a história da tecnologia costuma ser transmitida associada quase que exclusivamente a nomes masculinos contemporâneos.</w:t>
+      </w:r>
+    </w:p>
+    <w:p>
+      <w:pPr>
+        <w:jc w:val="both"/>
+        <w:spacing w:after="140" w:line="276" w:lineRule="auto"/>
+      </w:pPr>
+      <w:r>
+        <w:rPr/>
+        <w:t xml:space="preserve">A telemetria das seis Eras históricas do jogo revelou o ritmo de aprendizagem e o nível de persistência dos alunos diante das mecânicas pedagógicas. A Era 2, dedicada às ENIAC Girls e ao fluxo de dados em circuitos físicos, registrou o menor tempo médio de conclusão, com 53,6 segundos e 2,27 tentativas em média, demonstrando que a metáfora visual de conectar cabos facilitou a assimilação imediata do conceito. As fases de Ada Lovelace e Grace Hopper tiveram tempos médios semelhantes, respectivamente de 96,1 segundos com 2,12 tentativas e 89,2 segundos com 2,23 tentativas, indicando uma ambientação progressiva com as estruturas de decisão e a ideia de depuração de código.</w:t>
+      </w:r>
+    </w:p>
+    <w:p>
+      <w:pPr>
+        <w:jc w:val="both"/>
+        <w:spacing w:after="140" w:line="276" w:lineRule="auto"/>
+      </w:pPr>
+      <w:r>
+        <w:rPr/>
+        <w:t xml:space="preserve">Por outro lado, as maiores exigências de raciocínio concentraram-se na Era 4, de Katherine Johnson, e na Era 5, da Irmã Mary Kenneth Keller. O desafio orbital de Katherine exigiu em média 103,2 segundos e 5,31 tentativas por aluno para calibrar os valores numéricos de reentrada da cápsula espacial. Já a fase da Irmã Keller configurou-se como o momento de maior esforço lógico, alcançando média de 134,6 segundos e 13,23 tentativas para ordenar as linhas de código em BASIC. O fato de os estudantes repetirem a fase diversas vezes sem desistir confirma as teses construcionistas de Papert (1980) e Resnick (2013): ao receber retorno imediato do erro sem tom punitivo, o estudante enxerga a falha como oportunidade natural de ajuste e teste de hipóteses, o que reduz a ansiedade comum no aprendizado de programação.</w:t>
+      </w:r>
+    </w:p>
+    <w:p>
+      <w:pPr>
+        <w:jc w:val="both"/>
+        <w:spacing w:after="140" w:line="276" w:lineRule="auto"/>
+      </w:pPr>
+      <w:r>
+        <w:rPr/>
+        <w:t xml:space="preserve">Um dos pontos mais expressivos da intervenção foi a leitura completa de 100% dos cartões de síntese teórica ao final de cada fase e o acesso de 100% dos alunos ao epílogo documental sobre a professora Edith Ranzini e o minicomputador brasileiro Patinho Feio. Nos questionários pós-teste, 19,2% dos estudantes destacaram espontaneamente o reconhecimento do pioneirismo brasileiro e a relação da história com o software moderno, enquanto 17,3% expressaram sensibilização direta com os objetivos de igualdade de gênero da ODS 5 e 13,5% validaram a metodologia baseada em jogos. A pontuação média de 1.257 pontos e a conclusão de todas as etapas pelos estudantes que iniciaram comprovam que a estratégia não gerou evasão. Conforme apontam Bandura (1997) e Lima (2013), o contato direto com trajetórias de mulheres cientistas fortalece o sentimento de autoeficácia, mostrando aos jovens da escola pública que a computação é um campo aberto, diverso e historicamente construído também pelo protagonismo feminino nacional e internacional.</w:t>
       </w:r>
     </w:p>
     <w:p>
@@ -4372,7 +2743,7 @@
       </w:pPr>
       <w:r>
         <w:rPr/>
-        <w:t xml:space="preserve">Os autores expressam sinceros agradecimentos à Universidade Estadual do Norte do Paraná (UENP) e ao corpo docente do Programa de Pós-Graduação em Ensino de Computação (PROFCOMP). Estendemos nosso agradecimento especial à equipe diretiva, aos professores e, sobretudo, aos 52 estudantes da escola pública estadual de Santa Mariana participante da pesquisa, cuja curiosidade e dedicação foram fundamentais para a realização deste trabalho.</w:t>
+        <w:t xml:space="preserve">Os autores expressam sinceros agradecimentos à Universidade Estadual do Norte do Paraná (UENP) e ao corpo docente do Programa de Pós-Graduação em Ensino de Computação (PROFCOMP). Estendemos nosso agradecimento especial à equipe diretiva, aos professores e, sobretudo, aos 52 estudantes dos dois colégios públicos estaduais participantes da pesquisa, cuja curiosidade e dedicação foram fundamentais para a realização deste trabalho.</w:t>
       </w:r>
     </w:p>
     <w:p>

</xml_diff>